<commit_message>
database: chỉnh sửa dữ liệu chèn vào bảng Vehicle chỉ thêm xe ô tô, xóa xe máy. vì hệ thống chỉ quản lý rửa xe ô tô, không quản lý rửa xe máy.
</commit_message>
<xml_diff>
--- a/Document/AUTOMATED_CAR_WASH_MANAGEMENT_SYSTEM_WITH_AD.docx
+++ b/Document/AUTOMATED_CAR_WASH_MANAGEMENT_SYSTEM_WITH_AD.docx
@@ -919,30 +919,40 @@
       <w:r>
         <w:rPr>
           <w:rFonts w:ascii="Times New Roman" w:hAnsi="Times New Roman" w:eastAsia="Times New Roman" w:cs="Times New Roman"/>
+          <w:sz w:val="24"/>
+          <w:szCs w:val="24"/>
         </w:rPr>
         <w:t>Login/logout + linked to license plate + phone</w:t>
       </w:r>
       <w:r>
         <w:rPr>
           <w:rFonts w:ascii="Times New Roman" w:hAnsi="Times New Roman" w:eastAsia="Times New Roman" w:cs="Times New Roman"/>
-        </w:rPr>
-        <w:br w:type="textWrapping"/>
-      </w:r>
-      <w:r>
-        <w:rPr>
-          <w:rFonts w:ascii="Times New Roman" w:hAnsi="Times New Roman" w:eastAsia="Times New Roman" w:cs="Times New Roman"/>
+          <w:sz w:val="24"/>
+          <w:szCs w:val="24"/>
+        </w:rPr>
+        <w:br w:type="textWrapping"/>
+      </w:r>
+      <w:r>
+        <w:rPr>
+          <w:rFonts w:ascii="Times New Roman" w:hAnsi="Times New Roman" w:eastAsia="Times New Roman" w:cs="Times New Roman"/>
+          <w:sz w:val="24"/>
+          <w:szCs w:val="24"/>
         </w:rPr>
         <w:t>o</w:t>
       </w:r>
       <w:r>
         <w:rPr>
           <w:rFonts w:ascii="Times New Roman" w:hAnsi="Times New Roman" w:eastAsia="Times New Roman" w:cs="Times New Roman"/>
+          <w:sz w:val="24"/>
+          <w:szCs w:val="24"/>
         </w:rPr>
         <w:tab/>
       </w:r>
       <w:r>
         <w:rPr>
           <w:rFonts w:ascii="Times New Roman" w:hAnsi="Times New Roman" w:eastAsia="Times New Roman" w:cs="Times New Roman"/>
+          <w:sz w:val="24"/>
+          <w:szCs w:val="24"/>
         </w:rPr>
         <w:t xml:space="preserve">View: tier, points balance, next reward </w:t>
       </w:r>
@@ -1101,15 +1111,22 @@
         <w:rPr>
           <w:rFonts w:ascii="Times New Roman" w:hAnsi="Times New Roman" w:eastAsia="Times New Roman" w:cs="Times New Roman"/>
         </w:rPr>
-        <w:t>Priority queue: Higher tier = earlier access</w:t>
-      </w:r>
-      <w:r>
-        <w:rPr>
-          <w:rFonts w:ascii="Times New Roman" w:hAnsi="Times New Roman" w:eastAsia="Times New Roman" w:cs="Times New Roman"/>
-        </w:rPr>
-        <w:br w:type="textWrapping"/>
+        <w:t>Priority queue: Higher tie</w:t>
       </w:r>
       <w:bookmarkStart w:id="0" w:name="_GoBack"/>
+      <w:bookmarkEnd w:id="0"/>
+      <w:r>
+        <w:rPr>
+          <w:rFonts w:ascii="Times New Roman" w:hAnsi="Times New Roman" w:eastAsia="Times New Roman" w:cs="Times New Roman"/>
+        </w:rPr>
+        <w:t>r = earlier access</w:t>
+      </w:r>
+      <w:r>
+        <w:rPr>
+          <w:rFonts w:ascii="Times New Roman" w:hAnsi="Times New Roman" w:eastAsia="Times New Roman" w:cs="Times New Roman"/>
+        </w:rPr>
+        <w:br w:type="textWrapping"/>
+      </w:r>
       <w:r>
         <w:rPr>
           <w:rFonts w:ascii="Times New Roman" w:hAnsi="Times New Roman" w:eastAsia="Times New Roman" w:cs="Times New Roman"/>
@@ -1117,7 +1134,6 @@
         </w:rPr>
         <w:t>Admin Controls(asignment)</w:t>
       </w:r>
-      <w:bookmarkEnd w:id="0"/>
       <w:r>
         <w:rPr>
           <w:rFonts w:ascii="Times New Roman" w:hAnsi="Times New Roman" w:eastAsia="Times New Roman" w:cs="Times New Roman"/>
@@ -2920,7 +2936,7 @@
     <w:lsdException w:qFormat="1" w:unhideWhenUsed="0" w:uiPriority="10" w:semiHidden="0" w:name="Title"/>
     <w:lsdException w:uiPriority="99" w:name="Closing"/>
     <w:lsdException w:uiPriority="99" w:name="Signature"/>
-    <w:lsdException w:uiPriority="1" w:name="Default Paragraph Font"/>
+    <w:lsdException w:qFormat="1" w:uiPriority="1" w:name="Default Paragraph Font"/>
     <w:lsdException w:uiPriority="99" w:name="Body Text"/>
     <w:lsdException w:uiPriority="99" w:name="Body Text Indent"/>
     <w:lsdException w:uiPriority="99" w:name="List Continue"/>
@@ -2958,7 +2974,7 @@
     <w:lsdException w:uiPriority="99" w:name="HTML Sample"/>
     <w:lsdException w:uiPriority="99" w:name="HTML Typewriter"/>
     <w:lsdException w:uiPriority="99" w:name="HTML Variable"/>
-    <w:lsdException w:uiPriority="99" w:name="Normal Table"/>
+    <w:lsdException w:qFormat="1" w:uiPriority="99" w:name="Normal Table"/>
     <w:lsdException w:uiPriority="99" w:name="annotation subject"/>
     <w:lsdException w:uiPriority="99" w:name="Table Simple 1"/>
     <w:lsdException w:uiPriority="99" w:name="Table Simple 2"/>
@@ -3236,12 +3252,14 @@
     <w:name w:val="Default Paragraph Font"/>
     <w:semiHidden/>
     <w:unhideWhenUsed/>
+    <w:qFormat/>
     <w:uiPriority w:val="1"/>
   </w:style>
   <w:style w:type="table" w:default="1" w:styleId="9">
     <w:name w:val="Normal Table"/>
     <w:semiHidden/>
     <w:unhideWhenUsed/>
+    <w:qFormat/>
     <w:uiPriority w:val="99"/>
     <w:tblPr>
       <w:tblCellMar>
@@ -3305,6 +3323,7 @@
   <w:style w:type="table" w:customStyle="1" w:styleId="13">
     <w:name w:val="_Style 11"/>
     <w:basedOn w:val="9"/>
+    <w:qFormat/>
     <w:uiPriority w:val="0"/>
     <w:tblPr>
       <w:tblCellMar>
@@ -3332,6 +3351,7 @@
   <w:style w:type="table" w:customStyle="1" w:styleId="15">
     <w:name w:val="_Style 13"/>
     <w:basedOn w:val="9"/>
+    <w:qFormat/>
     <w:uiPriority w:val="0"/>
     <w:tblPr>
       <w:tblCellMar>

</xml_diff>

<commit_message>
feat: initialize database schema, sample data, and project documentation for car wash management system
</commit_message>
<xml_diff>
--- a/Document/AUTOMATED_CAR_WASH_MANAGEMENT_SYSTEM_WITH_AD.docx
+++ b/Document/AUTOMATED_CAR_WASH_MANAGEMENT_SYSTEM_WITH_AD.docx
@@ -1,23 +1,24 @@
 
 <file path=word/document.xml><?xml version="1.0" encoding="utf-8"?>
-<w:document xmlns:wpc="http://schemas.microsoft.com/office/word/2010/wordprocessingCanvas" xmlns:mc="http://schemas.openxmlformats.org/markup-compatibility/2006" xmlns:o="urn:schemas-microsoft-com:office:office" xmlns:r="http://schemas.openxmlformats.org/officeDocument/2006/relationships" xmlns:m="http://schemas.openxmlformats.org/officeDocument/2006/math" xmlns:v="urn:schemas-microsoft-com:vml" xmlns:wp14="http://schemas.microsoft.com/office/word/2010/wordprocessingDrawing" xmlns:wp="http://schemas.openxmlformats.org/drawingml/2006/wordprocessingDrawing" xmlns:w="http://schemas.openxmlformats.org/wordprocessingml/2006/main" xmlns:w14="http://schemas.microsoft.com/office/word/2010/wordml" xmlns:w10="urn:schemas-microsoft-com:office:word" xmlns:w15="http://schemas.microsoft.com/office/word/2012/wordml" xmlns:wpg="http://schemas.microsoft.com/office/word/2010/wordprocessingGroup" xmlns:wpi="http://schemas.microsoft.com/office/word/2010/wordprocessingInk" xmlns:wne="http://schemas.microsoft.com/office/word/2006/wordml" xmlns:wps="http://schemas.microsoft.com/office/word/2010/wordprocessingShape" xmlns:wpsCustomData="http://www.wps.cn/officeDocument/2013/wpsCustomData" mc:Ignorable="w14 w15 wp14">
+<w:document xmlns:wpc="http://schemas.microsoft.com/office/word/2010/wordprocessingCanvas" xmlns:cx="http://schemas.microsoft.com/office/drawing/2014/chartex" xmlns:cx1="http://schemas.microsoft.com/office/drawing/2015/9/8/chartex" xmlns:cx2="http://schemas.microsoft.com/office/drawing/2015/10/21/chartex" xmlns:cx3="http://schemas.microsoft.com/office/drawing/2016/5/9/chartex" xmlns:cx4="http://schemas.microsoft.com/office/drawing/2016/5/10/chartex" xmlns:cx5="http://schemas.microsoft.com/office/drawing/2016/5/11/chartex" xmlns:cx6="http://schemas.microsoft.com/office/drawing/2016/5/12/chartex" xmlns:cx7="http://schemas.microsoft.com/office/drawing/2016/5/13/chartex" xmlns:cx8="http://schemas.microsoft.com/office/drawing/2016/5/14/chartex" xmlns:mc="http://schemas.openxmlformats.org/markup-compatibility/2006" xmlns:aink="http://schemas.microsoft.com/office/drawing/2016/ink" xmlns:am3d="http://schemas.microsoft.com/office/drawing/2017/model3d" xmlns:o="urn:schemas-microsoft-com:office:office" xmlns:oel="http://schemas.microsoft.com/office/2019/extlst" xmlns:r="http://schemas.openxmlformats.org/officeDocument/2006/relationships" xmlns:m="http://schemas.openxmlformats.org/officeDocument/2006/math" xmlns:v="urn:schemas-microsoft-com:vml" xmlns:wp14="http://schemas.microsoft.com/office/word/2010/wordprocessingDrawing" xmlns:wp="http://schemas.openxmlformats.org/drawingml/2006/wordprocessingDrawing" xmlns:w10="urn:schemas-microsoft-com:office:word" xmlns:w="http://schemas.openxmlformats.org/wordprocessingml/2006/main" xmlns:w14="http://schemas.microsoft.com/office/word/2010/wordml" xmlns:w15="http://schemas.microsoft.com/office/word/2012/wordml" xmlns:w16cex="http://schemas.microsoft.com/office/word/2018/wordml/cex" xmlns:w16cid="http://schemas.microsoft.com/office/word/2016/wordml/cid" xmlns:w16="http://schemas.microsoft.com/office/word/2018/wordml" xmlns:w16du="http://schemas.microsoft.com/office/word/2023/wordml/word16du" xmlns:w16sdtdh="http://schemas.microsoft.com/office/word/2020/wordml/sdtdatahash" xmlns:w16sdtfl="http://schemas.microsoft.com/office/word/2024/wordml/sdtformatlock" xmlns:w16se="http://schemas.microsoft.com/office/word/2015/wordml/symex" xmlns:wpg="http://schemas.microsoft.com/office/word/2010/wordprocessingGroup" xmlns:wpi="http://schemas.microsoft.com/office/word/2010/wordprocessingInk" xmlns:wne="http://schemas.microsoft.com/office/word/2006/wordml" xmlns:wps="http://schemas.microsoft.com/office/word/2010/wordprocessingShape" mc:Ignorable="w14 w15 w16se w16cid w16 w16cex w16sdtdh w16sdtfl w16du wp14">
   <w:body>
     <w:p>
       <w:pPr>
         <w:shd w:val="clear" w:color="auto" w:fill="FFFFFF"/>
         <w:jc w:val="center"/>
         <w:rPr>
-          <w:rFonts w:ascii="Times New Roman" w:hAnsi="Times New Roman" w:eastAsia="Times New Roman" w:cs="Times New Roman"/>
-          <w:sz w:val="24"/>
-          <w:szCs w:val="24"/>
-        </w:rPr>
-      </w:pPr>
-      <w:r>
-        <w:rPr>
+          <w:rFonts w:ascii="Times New Roman" w:eastAsia="Times New Roman" w:hAnsi="Times New Roman" w:cs="Times New Roman"/>
+          <w:sz w:val="24"/>
+          <w:szCs w:val="24"/>
+        </w:rPr>
+      </w:pPr>
+      <w:r>
+        <w:rPr>
+          <w:noProof/>
           <w:lang w:val="en-US"/>
         </w:rPr>
         <w:drawing>
-          <wp:inline distT="114300" distB="114300" distL="114300" distR="114300">
+          <wp:inline distT="114300" distB="114300" distL="114300" distR="114300" wp14:anchorId="1808AC0A" wp14:editId="1FBCB781">
             <wp:extent cx="2524125" cy="704850"/>
             <wp:effectExtent l="0" t="0" r="0" b="0"/>
             <wp:docPr id="5" name="image1.png"/>
@@ -30,7 +31,7 @@
                     <pic:cNvPicPr preferRelativeResize="0"/>
                   </pic:nvPicPr>
                   <pic:blipFill>
-                    <a:blip r:embed="rId8"/>
+                    <a:blip r:embed="rId7"/>
                     <a:srcRect/>
                     <a:stretch>
                       <a:fillRect/>
@@ -53,7 +54,7 @@
       </w:r>
       <w:r>
         <w:rPr>
-          <w:rFonts w:ascii="Times New Roman" w:hAnsi="Times New Roman" w:eastAsia="Times New Roman" w:cs="Times New Roman"/>
+          <w:rFonts w:ascii="Times New Roman" w:eastAsia="Times New Roman" w:hAnsi="Times New Roman" w:cs="Times New Roman"/>
           <w:sz w:val="24"/>
           <w:szCs w:val="24"/>
         </w:rPr>
@@ -65,14 +66,14 @@
         <w:shd w:val="clear" w:color="auto" w:fill="FFFFFF"/>
         <w:jc w:val="center"/>
         <w:rPr>
-          <w:rFonts w:ascii="Times New Roman" w:hAnsi="Times New Roman" w:eastAsia="Times New Roman" w:cs="Times New Roman"/>
-          <w:sz w:val="24"/>
-          <w:szCs w:val="24"/>
-        </w:rPr>
-      </w:pPr>
-      <w:r>
-        <w:rPr>
-          <w:rFonts w:ascii="Times New Roman" w:hAnsi="Times New Roman" w:eastAsia="Times New Roman" w:cs="Times New Roman"/>
+          <w:rFonts w:ascii="Times New Roman" w:eastAsia="Times New Roman" w:hAnsi="Times New Roman" w:cs="Times New Roman"/>
+          <w:sz w:val="24"/>
+          <w:szCs w:val="24"/>
+        </w:rPr>
+      </w:pPr>
+      <w:r>
+        <w:rPr>
+          <w:rFonts w:ascii="Times New Roman" w:eastAsia="Times New Roman" w:hAnsi="Times New Roman" w:cs="Times New Roman"/>
           <w:sz w:val="24"/>
           <w:szCs w:val="24"/>
         </w:rPr>
@@ -84,14 +85,14 @@
         <w:shd w:val="clear" w:color="auto" w:fill="FFFFFF"/>
         <w:jc w:val="center"/>
         <w:rPr>
-          <w:rFonts w:ascii="Times New Roman" w:hAnsi="Times New Roman" w:eastAsia="Times New Roman" w:cs="Times New Roman"/>
-          <w:sz w:val="24"/>
-          <w:szCs w:val="24"/>
-        </w:rPr>
-      </w:pPr>
-      <w:r>
-        <w:rPr>
-          <w:rFonts w:ascii="Times New Roman" w:hAnsi="Times New Roman" w:eastAsia="Times New Roman" w:cs="Times New Roman"/>
+          <w:rFonts w:ascii="Times New Roman" w:eastAsia="Times New Roman" w:hAnsi="Times New Roman" w:cs="Times New Roman"/>
+          <w:sz w:val="24"/>
+          <w:szCs w:val="24"/>
+        </w:rPr>
+      </w:pPr>
+      <w:r>
+        <w:rPr>
+          <w:rFonts w:ascii="Times New Roman" w:eastAsia="Times New Roman" w:hAnsi="Times New Roman" w:cs="Times New Roman"/>
           <w:b/>
           <w:sz w:val="24"/>
           <w:szCs w:val="24"/>
@@ -100,7 +101,7 @@
       </w:r>
       <w:r>
         <w:rPr>
-          <w:rFonts w:ascii="Times New Roman" w:hAnsi="Times New Roman" w:eastAsia="Times New Roman" w:cs="Times New Roman"/>
+          <w:rFonts w:ascii="Times New Roman" w:eastAsia="Times New Roman" w:hAnsi="Times New Roman" w:cs="Times New Roman"/>
           <w:sz w:val="24"/>
           <w:szCs w:val="24"/>
         </w:rPr>
@@ -112,14 +113,14 @@
         <w:shd w:val="clear" w:color="auto" w:fill="FFFFFF"/>
         <w:jc w:val="center"/>
         <w:rPr>
-          <w:rFonts w:ascii="Times New Roman" w:hAnsi="Times New Roman" w:eastAsia="Times New Roman" w:cs="Times New Roman"/>
-          <w:sz w:val="24"/>
-          <w:szCs w:val="24"/>
-        </w:rPr>
-      </w:pPr>
-      <w:r>
-        <w:rPr>
-          <w:rFonts w:ascii="Times New Roman" w:hAnsi="Times New Roman" w:eastAsia="Times New Roman" w:cs="Times New Roman"/>
+          <w:rFonts w:ascii="Times New Roman" w:eastAsia="Times New Roman" w:hAnsi="Times New Roman" w:cs="Times New Roman"/>
+          <w:sz w:val="24"/>
+          <w:szCs w:val="24"/>
+        </w:rPr>
+      </w:pPr>
+      <w:r>
+        <w:rPr>
+          <w:rFonts w:ascii="Times New Roman" w:eastAsia="Times New Roman" w:hAnsi="Times New Roman" w:cs="Times New Roman"/>
           <w:sz w:val="24"/>
           <w:szCs w:val="24"/>
         </w:rPr>
@@ -134,12 +135,12 @@
         </w:numPr>
         <w:ind w:left="1440"/>
         <w:rPr>
-          <w:rFonts w:ascii="Times New Roman" w:hAnsi="Times New Roman" w:eastAsia="Times New Roman" w:cs="Times New Roman"/>
-        </w:rPr>
-      </w:pPr>
-      <w:r>
-        <w:rPr>
-          <w:rFonts w:ascii="Times New Roman" w:hAnsi="Times New Roman" w:eastAsia="Times New Roman" w:cs="Times New Roman"/>
+          <w:rFonts w:ascii="Times New Roman" w:eastAsia="Times New Roman" w:hAnsi="Times New Roman" w:cs="Times New Roman"/>
+        </w:rPr>
+      </w:pPr>
+      <w:r>
+        <w:rPr>
+          <w:rFonts w:ascii="Times New Roman" w:eastAsia="Times New Roman" w:hAnsi="Times New Roman" w:cs="Times New Roman"/>
           <w:sz w:val="24"/>
           <w:szCs w:val="24"/>
         </w:rPr>
@@ -154,30 +155,470 @@
         </w:numPr>
         <w:ind w:left="1440"/>
         <w:rPr>
-          <w:rFonts w:ascii="Times New Roman" w:hAnsi="Times New Roman" w:eastAsia="Times New Roman" w:cs="Times New Roman"/>
-          <w:lang w:val="en-US"/>
-        </w:rPr>
-      </w:pPr>
-      <w:r>
-        <w:rPr>
-          <w:rFonts w:ascii="Times New Roman" w:hAnsi="Times New Roman" w:eastAsia="Times New Roman" w:cs="Times New Roman"/>
-          <w:sz w:val="24"/>
-          <w:szCs w:val="24"/>
-          <w:lang w:val="en-US"/>
-        </w:rPr>
-        <w:t xml:space="preserve">Vietnamese: Hệ thống quản lý rửa xe ô tô tự động thông minh với đặt lịch trước và chương trình khách hàng thân thiết </w:t>
+          <w:rFonts w:ascii="Times New Roman" w:eastAsia="Times New Roman" w:hAnsi="Times New Roman" w:cs="Times New Roman"/>
+          <w:lang w:val="en-US"/>
+        </w:rPr>
+      </w:pPr>
+      <w:r>
+        <w:rPr>
+          <w:rFonts w:ascii="Times New Roman" w:eastAsia="Times New Roman" w:hAnsi="Times New Roman" w:cs="Times New Roman"/>
+          <w:sz w:val="24"/>
+          <w:szCs w:val="24"/>
+          <w:lang w:val="en-US"/>
+        </w:rPr>
+        <w:t xml:space="preserve">Vietnamese: </w:t>
+      </w:r>
+      <w:proofErr w:type="spellStart"/>
+      <w:r>
+        <w:rPr>
+          <w:rFonts w:ascii="Times New Roman" w:eastAsia="Times New Roman" w:hAnsi="Times New Roman" w:cs="Times New Roman"/>
+          <w:sz w:val="24"/>
+          <w:szCs w:val="24"/>
+          <w:lang w:val="en-US"/>
+        </w:rPr>
+        <w:t>Hệ</w:t>
+      </w:r>
+      <w:proofErr w:type="spellEnd"/>
+      <w:r>
+        <w:rPr>
+          <w:rFonts w:ascii="Times New Roman" w:eastAsia="Times New Roman" w:hAnsi="Times New Roman" w:cs="Times New Roman"/>
+          <w:sz w:val="24"/>
+          <w:szCs w:val="24"/>
+          <w:lang w:val="en-US"/>
+        </w:rPr>
+        <w:t xml:space="preserve"> </w:t>
+      </w:r>
+      <w:proofErr w:type="spellStart"/>
+      <w:r>
+        <w:rPr>
+          <w:rFonts w:ascii="Times New Roman" w:eastAsia="Times New Roman" w:hAnsi="Times New Roman" w:cs="Times New Roman"/>
+          <w:sz w:val="24"/>
+          <w:szCs w:val="24"/>
+          <w:lang w:val="en-US"/>
+        </w:rPr>
+        <w:t>thống</w:t>
+      </w:r>
+      <w:proofErr w:type="spellEnd"/>
+      <w:r>
+        <w:rPr>
+          <w:rFonts w:ascii="Times New Roman" w:eastAsia="Times New Roman" w:hAnsi="Times New Roman" w:cs="Times New Roman"/>
+          <w:sz w:val="24"/>
+          <w:szCs w:val="24"/>
+          <w:lang w:val="en-US"/>
+        </w:rPr>
+        <w:t xml:space="preserve"> </w:t>
+      </w:r>
+      <w:proofErr w:type="spellStart"/>
+      <w:r>
+        <w:rPr>
+          <w:rFonts w:ascii="Times New Roman" w:eastAsia="Times New Roman" w:hAnsi="Times New Roman" w:cs="Times New Roman"/>
+          <w:sz w:val="24"/>
+          <w:szCs w:val="24"/>
+          <w:lang w:val="en-US"/>
+        </w:rPr>
+        <w:t>quản</w:t>
+      </w:r>
+      <w:proofErr w:type="spellEnd"/>
+      <w:r>
+        <w:rPr>
+          <w:rFonts w:ascii="Times New Roman" w:eastAsia="Times New Roman" w:hAnsi="Times New Roman" w:cs="Times New Roman"/>
+          <w:sz w:val="24"/>
+          <w:szCs w:val="24"/>
+          <w:lang w:val="en-US"/>
+        </w:rPr>
+        <w:t xml:space="preserve"> </w:t>
+      </w:r>
+      <w:proofErr w:type="spellStart"/>
+      <w:r>
+        <w:rPr>
+          <w:rFonts w:ascii="Times New Roman" w:eastAsia="Times New Roman" w:hAnsi="Times New Roman" w:cs="Times New Roman"/>
+          <w:sz w:val="24"/>
+          <w:szCs w:val="24"/>
+          <w:lang w:val="en-US"/>
+        </w:rPr>
+        <w:t>lý</w:t>
+      </w:r>
+      <w:proofErr w:type="spellEnd"/>
+      <w:r>
+        <w:rPr>
+          <w:rFonts w:ascii="Times New Roman" w:eastAsia="Times New Roman" w:hAnsi="Times New Roman" w:cs="Times New Roman"/>
+          <w:sz w:val="24"/>
+          <w:szCs w:val="24"/>
+          <w:lang w:val="en-US"/>
+        </w:rPr>
+        <w:t xml:space="preserve"> </w:t>
+      </w:r>
+      <w:proofErr w:type="spellStart"/>
+      <w:r>
+        <w:rPr>
+          <w:rFonts w:ascii="Times New Roman" w:eastAsia="Times New Roman" w:hAnsi="Times New Roman" w:cs="Times New Roman"/>
+          <w:sz w:val="24"/>
+          <w:szCs w:val="24"/>
+          <w:lang w:val="en-US"/>
+        </w:rPr>
+        <w:t>rửa</w:t>
+      </w:r>
+      <w:proofErr w:type="spellEnd"/>
+      <w:r>
+        <w:rPr>
+          <w:rFonts w:ascii="Times New Roman" w:eastAsia="Times New Roman" w:hAnsi="Times New Roman" w:cs="Times New Roman"/>
+          <w:sz w:val="24"/>
+          <w:szCs w:val="24"/>
+          <w:lang w:val="en-US"/>
+        </w:rPr>
+        <w:t xml:space="preserve"> </w:t>
+      </w:r>
+      <w:proofErr w:type="spellStart"/>
+      <w:r>
+        <w:rPr>
+          <w:rFonts w:ascii="Times New Roman" w:eastAsia="Times New Roman" w:hAnsi="Times New Roman" w:cs="Times New Roman"/>
+          <w:sz w:val="24"/>
+          <w:szCs w:val="24"/>
+          <w:lang w:val="en-US"/>
+        </w:rPr>
+        <w:t>xe</w:t>
+      </w:r>
+      <w:proofErr w:type="spellEnd"/>
+      <w:r>
+        <w:rPr>
+          <w:rFonts w:ascii="Times New Roman" w:eastAsia="Times New Roman" w:hAnsi="Times New Roman" w:cs="Times New Roman"/>
+          <w:sz w:val="24"/>
+          <w:szCs w:val="24"/>
+          <w:lang w:val="en-US"/>
+        </w:rPr>
+        <w:t xml:space="preserve"> ô </w:t>
+      </w:r>
+      <w:proofErr w:type="spellStart"/>
+      <w:r>
+        <w:rPr>
+          <w:rFonts w:ascii="Times New Roman" w:eastAsia="Times New Roman" w:hAnsi="Times New Roman" w:cs="Times New Roman"/>
+          <w:sz w:val="24"/>
+          <w:szCs w:val="24"/>
+          <w:lang w:val="en-US"/>
+        </w:rPr>
+        <w:t>tô</w:t>
+      </w:r>
+      <w:proofErr w:type="spellEnd"/>
+      <w:r>
+        <w:rPr>
+          <w:rFonts w:ascii="Times New Roman" w:eastAsia="Times New Roman" w:hAnsi="Times New Roman" w:cs="Times New Roman"/>
+          <w:sz w:val="24"/>
+          <w:szCs w:val="24"/>
+          <w:lang w:val="en-US"/>
+        </w:rPr>
+        <w:t xml:space="preserve"> </w:t>
+      </w:r>
+      <w:proofErr w:type="spellStart"/>
+      <w:r>
+        <w:rPr>
+          <w:rFonts w:ascii="Times New Roman" w:eastAsia="Times New Roman" w:hAnsi="Times New Roman" w:cs="Times New Roman"/>
+          <w:sz w:val="24"/>
+          <w:szCs w:val="24"/>
+          <w:lang w:val="en-US"/>
+        </w:rPr>
+        <w:t>tự</w:t>
+      </w:r>
+      <w:proofErr w:type="spellEnd"/>
+      <w:r>
+        <w:rPr>
+          <w:rFonts w:ascii="Times New Roman" w:eastAsia="Times New Roman" w:hAnsi="Times New Roman" w:cs="Times New Roman"/>
+          <w:sz w:val="24"/>
+          <w:szCs w:val="24"/>
+          <w:lang w:val="en-US"/>
+        </w:rPr>
+        <w:t xml:space="preserve"> </w:t>
+      </w:r>
+      <w:proofErr w:type="spellStart"/>
+      <w:r>
+        <w:rPr>
+          <w:rFonts w:ascii="Times New Roman" w:eastAsia="Times New Roman" w:hAnsi="Times New Roman" w:cs="Times New Roman"/>
+          <w:sz w:val="24"/>
+          <w:szCs w:val="24"/>
+          <w:lang w:val="en-US"/>
+        </w:rPr>
+        <w:t>động</w:t>
+      </w:r>
+      <w:proofErr w:type="spellEnd"/>
+      <w:r>
+        <w:rPr>
+          <w:rFonts w:ascii="Times New Roman" w:eastAsia="Times New Roman" w:hAnsi="Times New Roman" w:cs="Times New Roman"/>
+          <w:sz w:val="24"/>
+          <w:szCs w:val="24"/>
+          <w:lang w:val="en-US"/>
+        </w:rPr>
+        <w:t xml:space="preserve"> </w:t>
+      </w:r>
+      <w:proofErr w:type="spellStart"/>
+      <w:r>
+        <w:rPr>
+          <w:rFonts w:ascii="Times New Roman" w:eastAsia="Times New Roman" w:hAnsi="Times New Roman" w:cs="Times New Roman"/>
+          <w:sz w:val="24"/>
+          <w:szCs w:val="24"/>
+          <w:lang w:val="en-US"/>
+        </w:rPr>
+        <w:t>thông</w:t>
+      </w:r>
+      <w:proofErr w:type="spellEnd"/>
+      <w:r>
+        <w:rPr>
+          <w:rFonts w:ascii="Times New Roman" w:eastAsia="Times New Roman" w:hAnsi="Times New Roman" w:cs="Times New Roman"/>
+          <w:sz w:val="24"/>
+          <w:szCs w:val="24"/>
+          <w:lang w:val="en-US"/>
+        </w:rPr>
+        <w:t xml:space="preserve"> </w:t>
+      </w:r>
+      <w:proofErr w:type="spellStart"/>
+      <w:r>
+        <w:rPr>
+          <w:rFonts w:ascii="Times New Roman" w:eastAsia="Times New Roman" w:hAnsi="Times New Roman" w:cs="Times New Roman"/>
+          <w:sz w:val="24"/>
+          <w:szCs w:val="24"/>
+          <w:lang w:val="en-US"/>
+        </w:rPr>
+        <w:t>minh</w:t>
+      </w:r>
+      <w:proofErr w:type="spellEnd"/>
+      <w:r>
+        <w:rPr>
+          <w:rFonts w:ascii="Times New Roman" w:eastAsia="Times New Roman" w:hAnsi="Times New Roman" w:cs="Times New Roman"/>
+          <w:sz w:val="24"/>
+          <w:szCs w:val="24"/>
+          <w:lang w:val="en-US"/>
+        </w:rPr>
+        <w:t xml:space="preserve"> </w:t>
+      </w:r>
+      <w:proofErr w:type="spellStart"/>
+      <w:r>
+        <w:rPr>
+          <w:rFonts w:ascii="Times New Roman" w:eastAsia="Times New Roman" w:hAnsi="Times New Roman" w:cs="Times New Roman"/>
+          <w:sz w:val="24"/>
+          <w:szCs w:val="24"/>
+          <w:lang w:val="en-US"/>
+        </w:rPr>
+        <w:t>với</w:t>
+      </w:r>
+      <w:proofErr w:type="spellEnd"/>
+      <w:r>
+        <w:rPr>
+          <w:rFonts w:ascii="Times New Roman" w:eastAsia="Times New Roman" w:hAnsi="Times New Roman" w:cs="Times New Roman"/>
+          <w:sz w:val="24"/>
+          <w:szCs w:val="24"/>
+          <w:lang w:val="en-US"/>
+        </w:rPr>
+        <w:t xml:space="preserve"> </w:t>
+      </w:r>
+      <w:proofErr w:type="spellStart"/>
+      <w:r>
+        <w:rPr>
+          <w:rFonts w:ascii="Times New Roman" w:eastAsia="Times New Roman" w:hAnsi="Times New Roman" w:cs="Times New Roman"/>
+          <w:sz w:val="24"/>
+          <w:szCs w:val="24"/>
+          <w:lang w:val="en-US"/>
+        </w:rPr>
+        <w:t>đặt</w:t>
+      </w:r>
+      <w:proofErr w:type="spellEnd"/>
+      <w:r>
+        <w:rPr>
+          <w:rFonts w:ascii="Times New Roman" w:eastAsia="Times New Roman" w:hAnsi="Times New Roman" w:cs="Times New Roman"/>
+          <w:sz w:val="24"/>
+          <w:szCs w:val="24"/>
+          <w:lang w:val="en-US"/>
+        </w:rPr>
+        <w:t xml:space="preserve"> </w:t>
+      </w:r>
+      <w:proofErr w:type="spellStart"/>
+      <w:r>
+        <w:rPr>
+          <w:rFonts w:ascii="Times New Roman" w:eastAsia="Times New Roman" w:hAnsi="Times New Roman" w:cs="Times New Roman"/>
+          <w:sz w:val="24"/>
+          <w:szCs w:val="24"/>
+          <w:lang w:val="en-US"/>
+        </w:rPr>
+        <w:t>lịch</w:t>
+      </w:r>
+      <w:proofErr w:type="spellEnd"/>
+      <w:r>
+        <w:rPr>
+          <w:rFonts w:ascii="Times New Roman" w:eastAsia="Times New Roman" w:hAnsi="Times New Roman" w:cs="Times New Roman"/>
+          <w:sz w:val="24"/>
+          <w:szCs w:val="24"/>
+          <w:lang w:val="en-US"/>
+        </w:rPr>
+        <w:t xml:space="preserve"> </w:t>
+      </w:r>
+      <w:proofErr w:type="spellStart"/>
+      <w:r>
+        <w:rPr>
+          <w:rFonts w:ascii="Times New Roman" w:eastAsia="Times New Roman" w:hAnsi="Times New Roman" w:cs="Times New Roman"/>
+          <w:sz w:val="24"/>
+          <w:szCs w:val="24"/>
+          <w:lang w:val="en-US"/>
+        </w:rPr>
+        <w:t>trước</w:t>
+      </w:r>
+      <w:proofErr w:type="spellEnd"/>
+      <w:r>
+        <w:rPr>
+          <w:rFonts w:ascii="Times New Roman" w:eastAsia="Times New Roman" w:hAnsi="Times New Roman" w:cs="Times New Roman"/>
+          <w:sz w:val="24"/>
+          <w:szCs w:val="24"/>
+          <w:lang w:val="en-US"/>
+        </w:rPr>
+        <w:t xml:space="preserve"> </w:t>
+      </w:r>
+      <w:proofErr w:type="spellStart"/>
+      <w:r>
+        <w:rPr>
+          <w:rFonts w:ascii="Times New Roman" w:eastAsia="Times New Roman" w:hAnsi="Times New Roman" w:cs="Times New Roman"/>
+          <w:sz w:val="24"/>
+          <w:szCs w:val="24"/>
+          <w:lang w:val="en-US"/>
+        </w:rPr>
+        <w:t>và</w:t>
+      </w:r>
+      <w:proofErr w:type="spellEnd"/>
+      <w:r>
+        <w:rPr>
+          <w:rFonts w:ascii="Times New Roman" w:eastAsia="Times New Roman" w:hAnsi="Times New Roman" w:cs="Times New Roman"/>
+          <w:sz w:val="24"/>
+          <w:szCs w:val="24"/>
+          <w:lang w:val="en-US"/>
+        </w:rPr>
+        <w:t xml:space="preserve"> </w:t>
+      </w:r>
+      <w:proofErr w:type="spellStart"/>
+      <w:r>
+        <w:rPr>
+          <w:rFonts w:ascii="Times New Roman" w:eastAsia="Times New Roman" w:hAnsi="Times New Roman" w:cs="Times New Roman"/>
+          <w:sz w:val="24"/>
+          <w:szCs w:val="24"/>
+          <w:lang w:val="en-US"/>
+        </w:rPr>
+        <w:t>chương</w:t>
+      </w:r>
+      <w:proofErr w:type="spellEnd"/>
+      <w:r>
+        <w:rPr>
+          <w:rFonts w:ascii="Times New Roman" w:eastAsia="Times New Roman" w:hAnsi="Times New Roman" w:cs="Times New Roman"/>
+          <w:sz w:val="24"/>
+          <w:szCs w:val="24"/>
+          <w:lang w:val="en-US"/>
+        </w:rPr>
+        <w:t xml:space="preserve"> </w:t>
+      </w:r>
+      <w:proofErr w:type="spellStart"/>
+      <w:r>
+        <w:rPr>
+          <w:rFonts w:ascii="Times New Roman" w:eastAsia="Times New Roman" w:hAnsi="Times New Roman" w:cs="Times New Roman"/>
+          <w:sz w:val="24"/>
+          <w:szCs w:val="24"/>
+          <w:lang w:val="en-US"/>
+        </w:rPr>
+        <w:t>trình</w:t>
+      </w:r>
+      <w:proofErr w:type="spellEnd"/>
+      <w:r>
+        <w:rPr>
+          <w:rFonts w:ascii="Times New Roman" w:eastAsia="Times New Roman" w:hAnsi="Times New Roman" w:cs="Times New Roman"/>
+          <w:sz w:val="24"/>
+          <w:szCs w:val="24"/>
+          <w:lang w:val="en-US"/>
+        </w:rPr>
+        <w:t xml:space="preserve"> </w:t>
+      </w:r>
+      <w:proofErr w:type="spellStart"/>
+      <w:r>
+        <w:rPr>
+          <w:rFonts w:ascii="Times New Roman" w:eastAsia="Times New Roman" w:hAnsi="Times New Roman" w:cs="Times New Roman"/>
+          <w:sz w:val="24"/>
+          <w:szCs w:val="24"/>
+          <w:lang w:val="en-US"/>
+        </w:rPr>
+        <w:t>khách</w:t>
+      </w:r>
+      <w:proofErr w:type="spellEnd"/>
+      <w:r>
+        <w:rPr>
+          <w:rFonts w:ascii="Times New Roman" w:eastAsia="Times New Roman" w:hAnsi="Times New Roman" w:cs="Times New Roman"/>
+          <w:sz w:val="24"/>
+          <w:szCs w:val="24"/>
+          <w:lang w:val="en-US"/>
+        </w:rPr>
+        <w:t xml:space="preserve"> </w:t>
+      </w:r>
+      <w:proofErr w:type="spellStart"/>
+      <w:r>
+        <w:rPr>
+          <w:rFonts w:ascii="Times New Roman" w:eastAsia="Times New Roman" w:hAnsi="Times New Roman" w:cs="Times New Roman"/>
+          <w:sz w:val="24"/>
+          <w:szCs w:val="24"/>
+          <w:lang w:val="en-US"/>
+        </w:rPr>
+        <w:t>hàng</w:t>
+      </w:r>
+      <w:proofErr w:type="spellEnd"/>
+      <w:r>
+        <w:rPr>
+          <w:rFonts w:ascii="Times New Roman" w:eastAsia="Times New Roman" w:hAnsi="Times New Roman" w:cs="Times New Roman"/>
+          <w:sz w:val="24"/>
+          <w:szCs w:val="24"/>
+          <w:lang w:val="en-US"/>
+        </w:rPr>
+        <w:t xml:space="preserve"> </w:t>
+      </w:r>
+      <w:proofErr w:type="spellStart"/>
+      <w:r>
+        <w:rPr>
+          <w:rFonts w:ascii="Times New Roman" w:eastAsia="Times New Roman" w:hAnsi="Times New Roman" w:cs="Times New Roman"/>
+          <w:sz w:val="24"/>
+          <w:szCs w:val="24"/>
+          <w:lang w:val="en-US"/>
+        </w:rPr>
+        <w:t>thân</w:t>
+      </w:r>
+      <w:proofErr w:type="spellEnd"/>
+      <w:r>
+        <w:rPr>
+          <w:rFonts w:ascii="Times New Roman" w:eastAsia="Times New Roman" w:hAnsi="Times New Roman" w:cs="Times New Roman"/>
+          <w:sz w:val="24"/>
+          <w:szCs w:val="24"/>
+          <w:lang w:val="en-US"/>
+        </w:rPr>
+        <w:t xml:space="preserve"> </w:t>
+      </w:r>
+      <w:proofErr w:type="spellStart"/>
+      <w:r>
+        <w:rPr>
+          <w:rFonts w:ascii="Times New Roman" w:eastAsia="Times New Roman" w:hAnsi="Times New Roman" w:cs="Times New Roman"/>
+          <w:sz w:val="24"/>
+          <w:szCs w:val="24"/>
+          <w:lang w:val="en-US"/>
+        </w:rPr>
+        <w:t>thiết</w:t>
+      </w:r>
+      <w:proofErr w:type="spellEnd"/>
+      <w:r>
+        <w:rPr>
+          <w:rFonts w:ascii="Times New Roman" w:eastAsia="Times New Roman" w:hAnsi="Times New Roman" w:cs="Times New Roman"/>
+          <w:sz w:val="24"/>
+          <w:szCs w:val="24"/>
+          <w:lang w:val="en-US"/>
+        </w:rPr>
+        <w:t xml:space="preserve"> </w:t>
       </w:r>
     </w:p>
     <w:p>
       <w:pPr>
         <w:ind w:left="1080"/>
         <w:rPr>
-          <w:rFonts w:ascii="Times New Roman" w:hAnsi="Times New Roman" w:eastAsia="Times New Roman" w:cs="Times New Roman"/>
-        </w:rPr>
-      </w:pPr>
-      <w:r>
-        <w:rPr>
-          <w:rFonts w:ascii="Times New Roman" w:hAnsi="Times New Roman" w:eastAsia="Times New Roman" w:cs="Times New Roman"/>
+          <w:rFonts w:ascii="Times New Roman" w:eastAsia="Times New Roman" w:hAnsi="Times New Roman" w:cs="Times New Roman"/>
+        </w:rPr>
+      </w:pPr>
+      <w:r>
+        <w:rPr>
+          <w:rFonts w:ascii="Times New Roman" w:eastAsia="Times New Roman" w:hAnsi="Times New Roman" w:cs="Times New Roman"/>
           <w:b/>
           <w:sz w:val="24"/>
           <w:szCs w:val="24"/>
@@ -186,7 +627,7 @@
       </w:r>
       <w:r>
         <w:rPr>
-          <w:rFonts w:ascii="Times New Roman" w:hAnsi="Times New Roman" w:eastAsia="Times New Roman" w:cs="Times New Roman"/>
+          <w:rFonts w:ascii="Times New Roman" w:eastAsia="Times New Roman" w:hAnsi="Times New Roman" w:cs="Times New Roman"/>
           <w:sz w:val="24"/>
           <w:szCs w:val="24"/>
         </w:rPr>
@@ -197,104 +638,82 @@
       <w:pPr>
         <w:ind w:left="1440"/>
         <w:rPr>
-          <w:rFonts w:ascii="Times New Roman" w:hAnsi="Times New Roman" w:eastAsia="Times New Roman" w:cs="Times New Roman"/>
-        </w:rPr>
-      </w:pPr>
-      <w:r>
-        <w:rPr>
-          <w:rFonts w:ascii="Times New Roman" w:hAnsi="Times New Roman" w:eastAsia="Times New Roman" w:cs="Times New Roman"/>
+          <w:rFonts w:ascii="Times New Roman" w:eastAsia="Times New Roman" w:hAnsi="Times New Roman" w:cs="Times New Roman"/>
+        </w:rPr>
+      </w:pPr>
+      <w:r>
+        <w:rPr>
+          <w:rFonts w:ascii="Times New Roman" w:eastAsia="Times New Roman" w:hAnsi="Times New Roman" w:cs="Times New Roman"/>
         </w:rPr>
         <w:t>With over 4.5 million vehicles in Vietnam and 25% YoY growth in car wash demand, customer retention is key. Studies show loyal customers spend 67% more and visit 3x more often. Current systems lack:</w:t>
       </w:r>
       <w:r>
         <w:rPr>
-          <w:rFonts w:ascii="Times New Roman" w:hAnsi="Times New Roman" w:eastAsia="Times New Roman" w:cs="Times New Roman"/>
-        </w:rPr>
-        <w:br w:type="textWrapping"/>
-      </w:r>
-      <w:r>
-        <w:rPr>
-          <w:rFonts w:ascii="Times New Roman" w:hAnsi="Times New Roman" w:eastAsia="Times New Roman" w:cs="Times New Roman"/>
-        </w:rPr>
+          <w:rFonts w:ascii="Times New Roman" w:eastAsia="Times New Roman" w:hAnsi="Times New Roman" w:cs="Times New Roman"/>
+        </w:rPr>
+        <w:br/>
         <w:t>•</w:t>
       </w:r>
       <w:r>
         <w:rPr>
-          <w:rFonts w:ascii="Times New Roman" w:hAnsi="Times New Roman" w:eastAsia="Times New Roman" w:cs="Times New Roman"/>
+          <w:rFonts w:ascii="Times New Roman" w:eastAsia="Times New Roman" w:hAnsi="Times New Roman" w:cs="Times New Roman"/>
         </w:rPr>
         <w:tab/>
-      </w:r>
-      <w:r>
-        <w:rPr>
-          <w:rFonts w:ascii="Times New Roman" w:hAnsi="Times New Roman" w:eastAsia="Times New Roman" w:cs="Times New Roman"/>
-        </w:rPr>
         <w:t>Personalized rewards beyond “wash 5 get 1 free”</w:t>
       </w:r>
       <w:r>
         <w:rPr>
-          <w:rFonts w:ascii="Times New Roman" w:hAnsi="Times New Roman" w:eastAsia="Times New Roman" w:cs="Times New Roman"/>
-        </w:rPr>
-        <w:br w:type="textWrapping"/>
-      </w:r>
-      <w:r>
-        <w:rPr>
-          <w:rFonts w:ascii="Times New Roman" w:hAnsi="Times New Roman" w:eastAsia="Times New Roman" w:cs="Times New Roman"/>
-        </w:rPr>
+          <w:rFonts w:ascii="Times New Roman" w:eastAsia="Times New Roman" w:hAnsi="Times New Roman" w:cs="Times New Roman"/>
+        </w:rPr>
+        <w:br/>
         <w:t>•</w:t>
       </w:r>
       <w:r>
         <w:rPr>
-          <w:rFonts w:ascii="Times New Roman" w:hAnsi="Times New Roman" w:eastAsia="Times New Roman" w:cs="Times New Roman"/>
+          <w:rFonts w:ascii="Times New Roman" w:eastAsia="Times New Roman" w:hAnsi="Times New Roman" w:cs="Times New Roman"/>
         </w:rPr>
         <w:tab/>
-      </w:r>
-      <w:r>
-        <w:rPr>
-          <w:rFonts w:ascii="Times New Roman" w:hAnsi="Times New Roman" w:eastAsia="Times New Roman" w:cs="Times New Roman"/>
-        </w:rPr>
         <w:t>Tiered benefits (Silver/Gold/Platinum)</w:t>
       </w:r>
       <w:r>
         <w:rPr>
-          <w:rFonts w:ascii="Times New Roman" w:hAnsi="Times New Roman" w:eastAsia="Times New Roman" w:cs="Times New Roman"/>
-        </w:rPr>
-        <w:br w:type="textWrapping"/>
-      </w:r>
-      <w:r>
-        <w:rPr>
-          <w:rFonts w:ascii="Times New Roman" w:hAnsi="Times New Roman" w:eastAsia="Times New Roman" w:cs="Times New Roman"/>
-        </w:rPr>
+          <w:rFonts w:ascii="Times New Roman" w:eastAsia="Times New Roman" w:hAnsi="Times New Roman" w:cs="Times New Roman"/>
+        </w:rPr>
+        <w:br/>
         <w:t>•</w:t>
       </w:r>
       <w:r>
         <w:rPr>
-          <w:rFonts w:ascii="Times New Roman" w:hAnsi="Times New Roman" w:eastAsia="Times New Roman" w:cs="Times New Roman"/>
+          <w:rFonts w:ascii="Times New Roman" w:eastAsia="Times New Roman" w:hAnsi="Times New Roman" w:cs="Times New Roman"/>
         </w:rPr>
         <w:tab/>
-      </w:r>
-      <w:r>
-        <w:rPr>
-          <w:rFonts w:ascii="Times New Roman" w:hAnsi="Times New Roman" w:eastAsia="Times New Roman" w:cs="Times New Roman"/>
-        </w:rPr>
         <w:t>Digital tracking of points, history, and perks</w:t>
       </w:r>
       <w:r>
         <w:rPr>
-          <w:rFonts w:ascii="Times New Roman" w:hAnsi="Times New Roman" w:eastAsia="Times New Roman" w:cs="Times New Roman"/>
-        </w:rPr>
-        <w:br w:type="textWrapping"/>
-      </w:r>
-      <w:r>
-        <w:rPr>
-          <w:rFonts w:ascii="Times New Roman" w:hAnsi="Times New Roman" w:eastAsia="Times New Roman" w:cs="Times New Roman"/>
-        </w:rPr>
-        <w:t>AutoWash Pro integrates a multi-tier loyalty program with advance booking, LPR automation, and AI personalization — boosting repeat rate by 45%, lifetime value by 60%, and enabling data-driven promotions.</w:t>
-      </w:r>
-      <w:r>
-        <w:rPr>
-          <w:rFonts w:ascii="Times New Roman" w:hAnsi="Times New Roman" w:eastAsia="Times New Roman" w:cs="Times New Roman"/>
-        </w:rPr>
-        <w:br w:type="textWrapping"/>
+          <w:rFonts w:ascii="Times New Roman" w:eastAsia="Times New Roman" w:hAnsi="Times New Roman" w:cs="Times New Roman"/>
+        </w:rPr>
+        <w:br/>
+      </w:r>
+      <w:proofErr w:type="spellStart"/>
+      <w:r>
+        <w:rPr>
+          <w:rFonts w:ascii="Times New Roman" w:eastAsia="Times New Roman" w:hAnsi="Times New Roman" w:cs="Times New Roman"/>
+        </w:rPr>
+        <w:t>AutoWash</w:t>
+      </w:r>
+      <w:proofErr w:type="spellEnd"/>
+      <w:r>
+        <w:rPr>
+          <w:rFonts w:ascii="Times New Roman" w:eastAsia="Times New Roman" w:hAnsi="Times New Roman" w:cs="Times New Roman"/>
+        </w:rPr>
+        <w:t xml:space="preserve"> Pro integrates a multi-tier loyalty program with advance booking, LPR automation, and AI personalization — boosting repeat rate by 45%, lifetime value by 60%, and enabling data-driven promotions.</w:t>
+      </w:r>
+      <w:r>
+        <w:rPr>
+          <w:rFonts w:ascii="Times New Roman" w:eastAsia="Times New Roman" w:hAnsi="Times New Roman" w:cs="Times New Roman"/>
+        </w:rPr>
+        <w:br/>
       </w:r>
     </w:p>
     <w:p>
@@ -305,12 +724,12 @@
         </w:numPr>
         <w:ind w:left="1080"/>
         <w:rPr>
-          <w:rFonts w:ascii="Times New Roman" w:hAnsi="Times New Roman" w:eastAsia="Times New Roman" w:cs="Times New Roman"/>
-        </w:rPr>
-      </w:pPr>
-      <w:r>
-        <w:rPr>
-          <w:rFonts w:ascii="Times New Roman" w:hAnsi="Times New Roman" w:eastAsia="Times New Roman" w:cs="Times New Roman"/>
+          <w:rFonts w:ascii="Times New Roman" w:eastAsia="Times New Roman" w:hAnsi="Times New Roman" w:cs="Times New Roman"/>
+        </w:rPr>
+      </w:pPr>
+      <w:r>
+        <w:rPr>
+          <w:rFonts w:ascii="Times New Roman" w:eastAsia="Times New Roman" w:hAnsi="Times New Roman" w:cs="Times New Roman"/>
           <w:b/>
           <w:sz w:val="24"/>
           <w:szCs w:val="24"/>
@@ -319,7 +738,7 @@
       </w:r>
       <w:r>
         <w:rPr>
-          <w:rFonts w:ascii="Times New Roman" w:hAnsi="Times New Roman" w:eastAsia="Times New Roman" w:cs="Times New Roman"/>
+          <w:rFonts w:ascii="Times New Roman" w:eastAsia="Times New Roman" w:hAnsi="Times New Roman" w:cs="Times New Roman"/>
           <w:sz w:val="24"/>
           <w:szCs w:val="24"/>
         </w:rPr>
@@ -330,397 +749,245 @@
       <w:pPr>
         <w:ind w:left="1440"/>
         <w:rPr>
-          <w:rFonts w:ascii="Times New Roman" w:hAnsi="Times New Roman" w:eastAsia="Times New Roman" w:cs="Times New Roman"/>
-        </w:rPr>
-      </w:pPr>
-      <w:r>
-        <w:rPr>
-          <w:rFonts w:ascii="Times New Roman" w:hAnsi="Times New Roman" w:eastAsia="Times New Roman" w:cs="Times New Roman"/>
-        </w:rPr>
-        <w:t>AutoWash Pro is a smart AI, and CRM technologies to enhance customer experience, optimize operations, and increase business revenue.</w:t>
-      </w:r>
-      <w:r>
-        <w:rPr>
-          <w:rFonts w:ascii="Times New Roman" w:hAnsi="Times New Roman" w:eastAsia="Times New Roman" w:cs="Times New Roman"/>
-        </w:rPr>
-        <w:br w:type="textWrapping"/>
-      </w:r>
-      <w:r>
-        <w:rPr>
-          <w:rFonts w:ascii="Times New Roman" w:hAnsi="Times New Roman" w:eastAsia="Times New Roman" w:cs="Times New Roman"/>
-        </w:rPr>
+          <w:rFonts w:ascii="Times New Roman" w:eastAsia="Times New Roman" w:hAnsi="Times New Roman" w:cs="Times New Roman"/>
+        </w:rPr>
+      </w:pPr>
+      <w:proofErr w:type="spellStart"/>
+      <w:r>
+        <w:rPr>
+          <w:rFonts w:ascii="Times New Roman" w:eastAsia="Times New Roman" w:hAnsi="Times New Roman" w:cs="Times New Roman"/>
+        </w:rPr>
+        <w:t>AutoWash</w:t>
+      </w:r>
+      <w:proofErr w:type="spellEnd"/>
+      <w:r>
+        <w:rPr>
+          <w:rFonts w:ascii="Times New Roman" w:eastAsia="Times New Roman" w:hAnsi="Times New Roman" w:cs="Times New Roman"/>
+        </w:rPr>
+        <w:t xml:space="preserve"> Pro is a smart AI, and CRM technologies to enhance customer experience, optimize operations, and increase business revenue.</w:t>
+      </w:r>
+      <w:r>
+        <w:rPr>
+          <w:rFonts w:ascii="Times New Roman" w:eastAsia="Times New Roman" w:hAnsi="Times New Roman" w:cs="Times New Roman"/>
+        </w:rPr>
+        <w:br/>
         <w:t>The system supports:</w:t>
       </w:r>
       <w:r>
         <w:rPr>
-          <w:rFonts w:ascii="Times New Roman" w:hAnsi="Times New Roman" w:eastAsia="Times New Roman" w:cs="Times New Roman"/>
-        </w:rPr>
-        <w:br w:type="textWrapping"/>
-      </w:r>
-      <w:r>
-        <w:rPr>
-          <w:rFonts w:ascii="Times New Roman" w:hAnsi="Times New Roman" w:eastAsia="Times New Roman" w:cs="Times New Roman"/>
-        </w:rPr>
+          <w:rFonts w:ascii="Times New Roman" w:eastAsia="Times New Roman" w:hAnsi="Times New Roman" w:cs="Times New Roman"/>
+        </w:rPr>
+        <w:br/>
         <w:t>Advanced booking with tier-based priority</w:t>
       </w:r>
       <w:r>
         <w:rPr>
-          <w:rFonts w:ascii="Times New Roman" w:hAnsi="Times New Roman" w:eastAsia="Times New Roman" w:cs="Times New Roman"/>
-        </w:rPr>
-        <w:br w:type="textWrapping"/>
-      </w:r>
-      <w:r>
-        <w:rPr>
-          <w:rFonts w:ascii="Times New Roman" w:hAnsi="Times New Roman" w:eastAsia="Times New Roman" w:cs="Times New Roman"/>
-        </w:rPr>
+          <w:rFonts w:ascii="Times New Roman" w:eastAsia="Times New Roman" w:hAnsi="Times New Roman" w:cs="Times New Roman"/>
+        </w:rPr>
+        <w:br/>
         <w:t>AI-powered customer engagement and personalization</w:t>
       </w:r>
       <w:r>
         <w:rPr>
-          <w:rFonts w:ascii="Times New Roman" w:hAnsi="Times New Roman" w:eastAsia="Times New Roman" w:cs="Times New Roman"/>
-        </w:rPr>
-        <w:br w:type="textWrapping"/>
-      </w:r>
-      <w:r>
-        <w:rPr>
-          <w:rFonts w:ascii="Times New Roman" w:hAnsi="Times New Roman" w:eastAsia="Times New Roman" w:cs="Times New Roman"/>
-        </w:rPr>
+          <w:rFonts w:ascii="Times New Roman" w:eastAsia="Times New Roman" w:hAnsi="Times New Roman" w:cs="Times New Roman"/>
+        </w:rPr>
+        <w:br/>
         <w:t>Automated vehicle recognition using License Plate Recognition (LPR)</w:t>
       </w:r>
       <w:r>
         <w:rPr>
-          <w:rFonts w:ascii="Times New Roman" w:hAnsi="Times New Roman" w:eastAsia="Times New Roman" w:cs="Times New Roman"/>
-        </w:rPr>
-        <w:br w:type="textWrapping"/>
-      </w:r>
-      <w:r>
-        <w:rPr>
-          <w:rFonts w:ascii="Times New Roman" w:hAnsi="Times New Roman" w:eastAsia="Times New Roman" w:cs="Times New Roman"/>
-        </w:rPr>
+          <w:rFonts w:ascii="Times New Roman" w:eastAsia="Times New Roman" w:hAnsi="Times New Roman" w:cs="Times New Roman"/>
+        </w:rPr>
+        <w:br/>
         <w:t>A multi-tier loyalty program to retain and reward customers</w:t>
       </w:r>
       <w:r>
         <w:rPr>
-          <w:rFonts w:ascii="Times New Roman" w:hAnsi="Times New Roman" w:eastAsia="Times New Roman" w:cs="Times New Roman"/>
-        </w:rPr>
-        <w:br w:type="textWrapping"/>
-      </w:r>
-      <w:r>
-        <w:rPr>
-          <w:rFonts w:ascii="Times New Roman" w:hAnsi="Times New Roman" w:eastAsia="Times New Roman" w:cs="Times New Roman"/>
-        </w:rPr>
+          <w:rFonts w:ascii="Times New Roman" w:eastAsia="Times New Roman" w:hAnsi="Times New Roman" w:cs="Times New Roman"/>
+        </w:rPr>
+        <w:br/>
         <w:t>Target Users:</w:t>
       </w:r>
       <w:r>
         <w:rPr>
-          <w:rFonts w:ascii="Times New Roman" w:hAnsi="Times New Roman" w:eastAsia="Times New Roman" w:cs="Times New Roman"/>
-        </w:rPr>
-        <w:br w:type="textWrapping"/>
-      </w:r>
-      <w:r>
-        <w:rPr>
-          <w:rFonts w:ascii="Times New Roman" w:hAnsi="Times New Roman" w:eastAsia="Times New Roman" w:cs="Times New Roman"/>
-        </w:rPr>
+          <w:rFonts w:ascii="Times New Roman" w:eastAsia="Times New Roman" w:hAnsi="Times New Roman" w:cs="Times New Roman"/>
+        </w:rPr>
+        <w:br/>
         <w:t>Customers: Car owners who want convenient booking and rewards</w:t>
       </w:r>
       <w:r>
         <w:rPr>
-          <w:rFonts w:ascii="Times New Roman" w:hAnsi="Times New Roman" w:eastAsia="Times New Roman" w:cs="Times New Roman"/>
-        </w:rPr>
-        <w:br w:type="textWrapping"/>
-      </w:r>
-      <w:r>
-        <w:rPr>
-          <w:rFonts w:ascii="Times New Roman" w:hAnsi="Times New Roman" w:eastAsia="Times New Roman" w:cs="Times New Roman"/>
-        </w:rPr>
+          <w:rFonts w:ascii="Times New Roman" w:eastAsia="Times New Roman" w:hAnsi="Times New Roman" w:cs="Times New Roman"/>
+        </w:rPr>
+        <w:br/>
         <w:t>Admin/Managers: Business owners analyzing performance and configuring promotions</w:t>
       </w:r>
       <w:r>
         <w:rPr>
-          <w:rFonts w:ascii="Times New Roman" w:hAnsi="Times New Roman" w:eastAsia="Times New Roman" w:cs="Times New Roman"/>
-        </w:rPr>
-        <w:br w:type="textWrapping"/>
-      </w:r>
-      <w:r>
-        <w:rPr>
-          <w:rFonts w:ascii="Times New Roman" w:hAnsi="Times New Roman" w:eastAsia="Times New Roman" w:cs="Times New Roman"/>
-        </w:rPr>
+          <w:rFonts w:ascii="Times New Roman" w:eastAsia="Times New Roman" w:hAnsi="Times New Roman" w:cs="Times New Roman"/>
+        </w:rPr>
+        <w:br/>
         <w:t>With advanced loyalty engine:</w:t>
       </w:r>
       <w:r>
         <w:rPr>
-          <w:rFonts w:ascii="Times New Roman" w:hAnsi="Times New Roman" w:eastAsia="Times New Roman" w:cs="Times New Roman"/>
-        </w:rPr>
-        <w:br w:type="textWrapping"/>
-      </w:r>
-      <w:r>
-        <w:rPr>
-          <w:rFonts w:ascii="Times New Roman" w:hAnsi="Times New Roman" w:eastAsia="Times New Roman" w:cs="Times New Roman"/>
-        </w:rPr>
+          <w:rFonts w:ascii="Times New Roman" w:eastAsia="Times New Roman" w:hAnsi="Times New Roman" w:cs="Times New Roman"/>
+        </w:rPr>
+        <w:br/>
         <w:t>•</w:t>
       </w:r>
       <w:r>
         <w:rPr>
-          <w:rFonts w:ascii="Times New Roman" w:hAnsi="Times New Roman" w:eastAsia="Times New Roman" w:cs="Times New Roman"/>
+          <w:rFonts w:ascii="Times New Roman" w:eastAsia="Times New Roman" w:hAnsi="Times New Roman" w:cs="Times New Roman"/>
         </w:rPr>
         <w:tab/>
-      </w:r>
-      <w:r>
-        <w:rPr>
-          <w:rFonts w:ascii="Times New Roman" w:hAnsi="Times New Roman" w:eastAsia="Times New Roman" w:cs="Times New Roman"/>
-        </w:rPr>
         <w:t>Role-based Access</w:t>
       </w:r>
       <w:r>
         <w:rPr>
-          <w:rFonts w:ascii="Times New Roman" w:hAnsi="Times New Roman" w:eastAsia="Times New Roman" w:cs="Times New Roman"/>
-        </w:rPr>
-        <w:br w:type="textWrapping"/>
-      </w:r>
-      <w:r>
-        <w:rPr>
-          <w:rFonts w:ascii="Times New Roman" w:hAnsi="Times New Roman" w:eastAsia="Times New Roman" w:cs="Times New Roman"/>
-        </w:rPr>
+          <w:rFonts w:ascii="Times New Roman" w:eastAsia="Times New Roman" w:hAnsi="Times New Roman" w:cs="Times New Roman"/>
+        </w:rPr>
+        <w:br/>
         <w:t>o</w:t>
       </w:r>
       <w:r>
         <w:rPr>
-          <w:rFonts w:ascii="Times New Roman" w:hAnsi="Times New Roman" w:eastAsia="Times New Roman" w:cs="Times New Roman"/>
+          <w:rFonts w:ascii="Times New Roman" w:eastAsia="Times New Roman" w:hAnsi="Times New Roman" w:cs="Times New Roman"/>
         </w:rPr>
         <w:tab/>
-      </w:r>
-      <w:r>
-        <w:rPr>
-          <w:rFonts w:ascii="Times New Roman" w:hAnsi="Times New Roman" w:eastAsia="Times New Roman" w:cs="Times New Roman"/>
-        </w:rPr>
         <w:t>Admin: Configure tiers, rewards, promotions</w:t>
       </w:r>
       <w:r>
         <w:rPr>
-          <w:rFonts w:ascii="Times New Roman" w:hAnsi="Times New Roman" w:eastAsia="Times New Roman" w:cs="Times New Roman"/>
-        </w:rPr>
-        <w:br w:type="textWrapping"/>
-      </w:r>
-      <w:r>
-        <w:rPr>
-          <w:rFonts w:ascii="Times New Roman" w:hAnsi="Times New Roman" w:eastAsia="Times New Roman" w:cs="Times New Roman"/>
-        </w:rPr>
+          <w:rFonts w:ascii="Times New Roman" w:eastAsia="Times New Roman" w:hAnsi="Times New Roman" w:cs="Times New Roman"/>
+        </w:rPr>
+        <w:br/>
         <w:t>o</w:t>
       </w:r>
       <w:r>
         <w:rPr>
-          <w:rFonts w:ascii="Times New Roman" w:hAnsi="Times New Roman" w:eastAsia="Times New Roman" w:cs="Times New Roman"/>
+          <w:rFonts w:ascii="Times New Roman" w:eastAsia="Times New Roman" w:hAnsi="Times New Roman" w:cs="Times New Roman"/>
         </w:rPr>
         <w:tab/>
-      </w:r>
-      <w:r>
-        <w:rPr>
-          <w:rFonts w:ascii="Times New Roman" w:hAnsi="Times New Roman" w:eastAsia="Times New Roman" w:cs="Times New Roman"/>
-        </w:rPr>
         <w:t>Customer: Track points, redeem, get VIP perks</w:t>
       </w:r>
       <w:r>
         <w:rPr>
-          <w:rFonts w:ascii="Times New Roman" w:hAnsi="Times New Roman" w:eastAsia="Times New Roman" w:cs="Times New Roman"/>
-        </w:rPr>
-        <w:br w:type="textWrapping"/>
-      </w:r>
-      <w:r>
-        <w:rPr>
-          <w:rFonts w:ascii="Times New Roman" w:hAnsi="Times New Roman" w:eastAsia="Times New Roman" w:cs="Times New Roman"/>
-        </w:rPr>
+          <w:rFonts w:ascii="Times New Roman" w:eastAsia="Times New Roman" w:hAnsi="Times New Roman" w:cs="Times New Roman"/>
+        </w:rPr>
+        <w:br/>
         <w:t>•</w:t>
       </w:r>
       <w:r>
         <w:rPr>
-          <w:rFonts w:ascii="Times New Roman" w:hAnsi="Times New Roman" w:eastAsia="Times New Roman" w:cs="Times New Roman"/>
+          <w:rFonts w:ascii="Times New Roman" w:eastAsia="Times New Roman" w:hAnsi="Times New Roman" w:cs="Times New Roman"/>
         </w:rPr>
         <w:tab/>
-      </w:r>
-      <w:r>
-        <w:rPr>
-          <w:rFonts w:ascii="Times New Roman" w:hAnsi="Times New Roman" w:eastAsia="Times New Roman" w:cs="Times New Roman"/>
-        </w:rPr>
         <w:t>Loyalty Program (Enhanced)</w:t>
       </w:r>
       <w:r>
         <w:rPr>
-          <w:rFonts w:ascii="Times New Roman" w:hAnsi="Times New Roman" w:eastAsia="Times New Roman" w:cs="Times New Roman"/>
-        </w:rPr>
-        <w:br w:type="textWrapping"/>
-      </w:r>
-      <w:r>
-        <w:rPr>
-          <w:rFonts w:ascii="Times New Roman" w:hAnsi="Times New Roman" w:eastAsia="Times New Roman" w:cs="Times New Roman"/>
-        </w:rPr>
+          <w:rFonts w:ascii="Times New Roman" w:eastAsia="Times New Roman" w:hAnsi="Times New Roman" w:cs="Times New Roman"/>
+        </w:rPr>
+        <w:br/>
         <w:t>Tier</w:t>
       </w:r>
       <w:r>
         <w:rPr>
-          <w:rFonts w:ascii="Times New Roman" w:hAnsi="Times New Roman" w:eastAsia="Times New Roman" w:cs="Times New Roman"/>
+          <w:rFonts w:ascii="Times New Roman" w:eastAsia="Times New Roman" w:hAnsi="Times New Roman" w:cs="Times New Roman"/>
         </w:rPr>
         <w:tab/>
-      </w:r>
-      <w:r>
-        <w:rPr>
-          <w:rFonts w:ascii="Times New Roman" w:hAnsi="Times New Roman" w:eastAsia="Times New Roman" w:cs="Times New Roman"/>
-        </w:rPr>
         <w:t xml:space="preserve">           Requirement</w:t>
       </w:r>
       <w:r>
         <w:rPr>
-          <w:rFonts w:ascii="Times New Roman" w:hAnsi="Times New Roman" w:eastAsia="Times New Roman" w:cs="Times New Roman"/>
+          <w:rFonts w:ascii="Times New Roman" w:eastAsia="Times New Roman" w:hAnsi="Times New Roman" w:cs="Times New Roman"/>
         </w:rPr>
         <w:tab/>
-      </w:r>
-      <w:r>
-        <w:rPr>
-          <w:rFonts w:ascii="Times New Roman" w:hAnsi="Times New Roman" w:eastAsia="Times New Roman" w:cs="Times New Roman"/>
-        </w:rPr>
         <w:t xml:space="preserve">                         Benefits</w:t>
       </w:r>
       <w:r>
         <w:rPr>
-          <w:rFonts w:ascii="Times New Roman" w:hAnsi="Times New Roman" w:eastAsia="Times New Roman" w:cs="Times New Roman"/>
-        </w:rPr>
-        <w:br w:type="textWrapping"/>
-      </w:r>
-      <w:r>
-        <w:rPr>
-          <w:rFonts w:ascii="Times New Roman" w:hAnsi="Times New Roman" w:eastAsia="Times New Roman" w:cs="Times New Roman"/>
-        </w:rPr>
+          <w:rFonts w:ascii="Times New Roman" w:eastAsia="Times New Roman" w:hAnsi="Times New Roman" w:cs="Times New Roman"/>
+        </w:rPr>
+        <w:br/>
         <w:t>Member</w:t>
       </w:r>
       <w:r>
         <w:rPr>
-          <w:rFonts w:ascii="Times New Roman" w:hAnsi="Times New Roman" w:eastAsia="Times New Roman" w:cs="Times New Roman"/>
+          <w:rFonts w:ascii="Times New Roman" w:eastAsia="Times New Roman" w:hAnsi="Times New Roman" w:cs="Times New Roman"/>
         </w:rPr>
         <w:tab/>
-      </w:r>
-      <w:r>
-        <w:rPr>
-          <w:rFonts w:ascii="Times New Roman" w:hAnsi="Times New Roman" w:eastAsia="Times New Roman" w:cs="Times New Roman"/>
-        </w:rPr>
         <w:t xml:space="preserve">   Register + 1 wash</w:t>
       </w:r>
       <w:r>
         <w:rPr>
-          <w:rFonts w:ascii="Times New Roman" w:hAnsi="Times New Roman" w:eastAsia="Times New Roman" w:cs="Times New Roman"/>
+          <w:rFonts w:ascii="Times New Roman" w:eastAsia="Times New Roman" w:hAnsi="Times New Roman" w:cs="Times New Roman"/>
         </w:rPr>
         <w:tab/>
-      </w:r>
-      <w:r>
-        <w:rPr>
-          <w:rFonts w:ascii="Times New Roman" w:hAnsi="Times New Roman" w:eastAsia="Times New Roman" w:cs="Times New Roman"/>
-        </w:rPr>
         <w:t xml:space="preserve">         1 point = 1,000 VND spent</w:t>
       </w:r>
       <w:r>
         <w:rPr>
-          <w:rFonts w:ascii="Times New Roman" w:hAnsi="Times New Roman" w:eastAsia="Times New Roman" w:cs="Times New Roman"/>
-        </w:rPr>
-        <w:br w:type="textWrapping"/>
-      </w:r>
-      <w:r>
-        <w:rPr>
-          <w:rFonts w:ascii="Times New Roman" w:hAnsi="Times New Roman" w:eastAsia="Times New Roman" w:cs="Times New Roman"/>
-        </w:rPr>
+          <w:rFonts w:ascii="Times New Roman" w:eastAsia="Times New Roman" w:hAnsi="Times New Roman" w:cs="Times New Roman"/>
+        </w:rPr>
+        <w:br/>
         <w:t>Silver</w:t>
       </w:r>
       <w:r>
         <w:rPr>
-          <w:rFonts w:ascii="Times New Roman" w:hAnsi="Times New Roman" w:eastAsia="Times New Roman" w:cs="Times New Roman"/>
+          <w:rFonts w:ascii="Times New Roman" w:eastAsia="Times New Roman" w:hAnsi="Times New Roman" w:cs="Times New Roman"/>
         </w:rPr>
         <w:tab/>
-      </w:r>
-      <w:r>
-        <w:rPr>
-          <w:rFonts w:ascii="Times New Roman" w:hAnsi="Times New Roman" w:eastAsia="Times New Roman" w:cs="Times New Roman"/>
-        </w:rPr>
         <w:t xml:space="preserve">   5 washes or 2M VND</w:t>
       </w:r>
       <w:r>
         <w:rPr>
-          <w:rFonts w:ascii="Times New Roman" w:hAnsi="Times New Roman" w:eastAsia="Times New Roman" w:cs="Times New Roman"/>
+          <w:rFonts w:ascii="Times New Roman" w:eastAsia="Times New Roman" w:hAnsi="Times New Roman" w:cs="Times New Roman"/>
         </w:rPr>
         <w:tab/>
-      </w:r>
-      <w:r>
-        <w:rPr>
-          <w:rFonts w:ascii="Times New Roman" w:hAnsi="Times New Roman" w:eastAsia="Times New Roman" w:cs="Times New Roman"/>
-        </w:rPr>
         <w:t xml:space="preserve">         +10% points, priority slot</w:t>
       </w:r>
       <w:r>
         <w:rPr>
-          <w:rFonts w:ascii="Times New Roman" w:hAnsi="Times New Roman" w:eastAsia="Times New Roman" w:cs="Times New Roman"/>
-        </w:rPr>
-        <w:br w:type="textWrapping"/>
-      </w:r>
-      <w:r>
-        <w:rPr>
-          <w:rFonts w:ascii="Times New Roman" w:hAnsi="Times New Roman" w:eastAsia="Times New Roman" w:cs="Times New Roman"/>
-        </w:rPr>
+          <w:rFonts w:ascii="Times New Roman" w:eastAsia="Times New Roman" w:hAnsi="Times New Roman" w:cs="Times New Roman"/>
+        </w:rPr>
+        <w:br/>
         <w:t>Gold</w:t>
       </w:r>
       <w:r>
         <w:rPr>
-          <w:rFonts w:ascii="Times New Roman" w:hAnsi="Times New Roman" w:eastAsia="Times New Roman" w:cs="Times New Roman"/>
+          <w:rFonts w:ascii="Times New Roman" w:eastAsia="Times New Roman" w:hAnsi="Times New Roman" w:cs="Times New Roman"/>
         </w:rPr>
         <w:tab/>
-      </w:r>
-      <w:r>
-        <w:rPr>
-          <w:rFonts w:ascii="Times New Roman" w:hAnsi="Times New Roman" w:eastAsia="Times New Roman" w:cs="Times New Roman"/>
-        </w:rPr>
         <w:t xml:space="preserve">   15 washes or 6M VND</w:t>
       </w:r>
       <w:r>
         <w:rPr>
-          <w:rFonts w:ascii="Times New Roman" w:hAnsi="Times New Roman" w:eastAsia="Times New Roman" w:cs="Times New Roman"/>
+          <w:rFonts w:ascii="Times New Roman" w:eastAsia="Times New Roman" w:hAnsi="Times New Roman" w:cs="Times New Roman"/>
         </w:rPr>
         <w:tab/>
-      </w:r>
-      <w:r>
-        <w:rPr>
-          <w:rFonts w:ascii="Times New Roman" w:hAnsi="Times New Roman" w:eastAsia="Times New Roman" w:cs="Times New Roman"/>
-        </w:rPr>
         <w:t xml:space="preserve">         +20% points, free upgrade monthly</w:t>
       </w:r>
       <w:r>
         <w:rPr>
-          <w:rFonts w:ascii="Times New Roman" w:hAnsi="Times New Roman" w:eastAsia="Times New Roman" w:cs="Times New Roman"/>
-        </w:rPr>
-        <w:br w:type="textWrapping"/>
-      </w:r>
-      <w:r>
-        <w:rPr>
-          <w:rFonts w:ascii="Times New Roman" w:hAnsi="Times New Roman" w:eastAsia="Times New Roman" w:cs="Times New Roman"/>
-        </w:rPr>
+          <w:rFonts w:ascii="Times New Roman" w:eastAsia="Times New Roman" w:hAnsi="Times New Roman" w:cs="Times New Roman"/>
+        </w:rPr>
+        <w:br/>
         <w:t>Platinum</w:t>
       </w:r>
       <w:r>
         <w:rPr>
-          <w:rFonts w:ascii="Times New Roman" w:hAnsi="Times New Roman" w:eastAsia="Times New Roman" w:cs="Times New Roman"/>
+          <w:rFonts w:ascii="Times New Roman" w:eastAsia="Times New Roman" w:hAnsi="Times New Roman" w:cs="Times New Roman"/>
         </w:rPr>
         <w:tab/>
-      </w:r>
-      <w:r>
-        <w:rPr>
-          <w:rFonts w:ascii="Times New Roman" w:hAnsi="Times New Roman" w:eastAsia="Times New Roman" w:cs="Times New Roman"/>
-        </w:rPr>
         <w:t xml:space="preserve">   30 washes or 15M VND</w:t>
       </w:r>
       <w:r>
         <w:rPr>
-          <w:rFonts w:ascii="Times New Roman" w:hAnsi="Times New Roman" w:eastAsia="Times New Roman" w:cs="Times New Roman"/>
+          <w:rFonts w:ascii="Times New Roman" w:eastAsia="Times New Roman" w:hAnsi="Times New Roman" w:cs="Times New Roman"/>
         </w:rPr>
         <w:tab/>
-      </w:r>
-      <w:r>
-        <w:rPr>
-          <w:rFonts w:ascii="Times New Roman" w:hAnsi="Times New Roman" w:eastAsia="Times New Roman" w:cs="Times New Roman"/>
-        </w:rPr>
         <w:t xml:space="preserve"> +30% points, free wash monthly,  </w:t>
       </w:r>
     </w:p>
@@ -732,21 +999,22 @@
         </w:numPr>
         <w:ind w:left="1080"/>
         <w:rPr>
-          <w:rFonts w:ascii="Times New Roman" w:hAnsi="Times New Roman" w:eastAsia="Times New Roman" w:cs="Times New Roman"/>
-        </w:rPr>
-      </w:pPr>
-      <w:r>
-        <w:rPr>
-          <w:rFonts w:ascii="Times New Roman" w:hAnsi="Times New Roman" w:eastAsia="Times New Roman" w:cs="Times New Roman"/>
+          <w:rFonts w:ascii="Times New Roman" w:eastAsia="Times New Roman" w:hAnsi="Times New Roman" w:cs="Times New Roman"/>
+        </w:rPr>
+      </w:pPr>
+      <w:r>
+        <w:rPr>
+          <w:rFonts w:ascii="Times New Roman" w:eastAsia="Times New Roman" w:hAnsi="Times New Roman" w:cs="Times New Roman"/>
           <w:b/>
           <w:sz w:val="24"/>
           <w:szCs w:val="24"/>
         </w:rPr>
+        <w:lastRenderedPageBreak/>
         <w:t>Functional requirement</w:t>
       </w:r>
       <w:r>
         <w:rPr>
-          <w:rFonts w:ascii="Times New Roman" w:hAnsi="Times New Roman" w:eastAsia="Times New Roman" w:cs="Times New Roman"/>
+          <w:rFonts w:ascii="Times New Roman" w:eastAsia="Times New Roman" w:hAnsi="Times New Roman" w:cs="Times New Roman"/>
           <w:sz w:val="24"/>
           <w:szCs w:val="24"/>
         </w:rPr>
@@ -757,168 +1025,146 @@
       <w:pPr>
         <w:ind w:left="1440"/>
         <w:rPr>
-          <w:rFonts w:ascii="Times New Roman" w:hAnsi="Times New Roman" w:eastAsia="Times New Roman" w:cs="Times New Roman"/>
-        </w:rPr>
-      </w:pPr>
-      <w:r>
-        <w:rPr>
-          <w:rFonts w:ascii="Times New Roman" w:hAnsi="Times New Roman" w:eastAsia="Times New Roman" w:cs="Times New Roman"/>
+          <w:rFonts w:ascii="Times New Roman" w:eastAsia="Times New Roman" w:hAnsi="Times New Roman" w:cs="Times New Roman"/>
+        </w:rPr>
+      </w:pPr>
+      <w:r>
+        <w:rPr>
+          <w:rFonts w:ascii="Times New Roman" w:eastAsia="Times New Roman" w:hAnsi="Times New Roman" w:cs="Times New Roman"/>
         </w:rPr>
         <w:t>The system includes core functions:</w:t>
       </w:r>
       <w:r>
         <w:rPr>
-          <w:rFonts w:ascii="Times New Roman" w:hAnsi="Times New Roman" w:eastAsia="Times New Roman" w:cs="Times New Roman"/>
-        </w:rPr>
-        <w:br w:type="textWrapping"/>
-      </w:r>
-      <w:r>
-        <w:rPr>
-          <w:rFonts w:ascii="Times New Roman" w:hAnsi="Times New Roman" w:eastAsia="Times New Roman" w:cs="Times New Roman"/>
+          <w:rFonts w:ascii="Times New Roman" w:eastAsia="Times New Roman" w:hAnsi="Times New Roman" w:cs="Times New Roman"/>
+        </w:rPr>
+        <w:br/>
+      </w:r>
+      <w:r>
+        <w:rPr>
+          <w:rFonts w:ascii="Times New Roman" w:eastAsia="Times New Roman" w:hAnsi="Times New Roman" w:cs="Times New Roman"/>
           <w:highlight w:val="yellow"/>
         </w:rPr>
         <w:t>Loyalty Engine (assignment)</w:t>
       </w:r>
       <w:r>
         <w:rPr>
-          <w:rFonts w:ascii="Times New Roman" w:hAnsi="Times New Roman" w:eastAsia="Times New Roman" w:cs="Times New Roman"/>
-        </w:rPr>
-        <w:br w:type="textWrapping"/>
-      </w:r>
-      <w:r>
-        <w:rPr>
-          <w:rFonts w:ascii="Times New Roman" w:hAnsi="Times New Roman" w:eastAsia="Times New Roman" w:cs="Times New Roman"/>
-        </w:rPr>
+          <w:rFonts w:ascii="Times New Roman" w:eastAsia="Times New Roman" w:hAnsi="Times New Roman" w:cs="Times New Roman"/>
+        </w:rPr>
+        <w:br/>
         <w:t>o</w:t>
       </w:r>
       <w:r>
         <w:rPr>
-          <w:rFonts w:ascii="Times New Roman" w:hAnsi="Times New Roman" w:eastAsia="Times New Roman" w:cs="Times New Roman"/>
+          <w:rFonts w:ascii="Times New Roman" w:eastAsia="Times New Roman" w:hAnsi="Times New Roman" w:cs="Times New Roman"/>
         </w:rPr>
         <w:tab/>
-      </w:r>
-      <w:r>
-        <w:rPr>
-          <w:rFonts w:ascii="Times New Roman" w:hAnsi="Times New Roman" w:eastAsia="Times New Roman" w:cs="Times New Roman"/>
-        </w:rPr>
         <w:t>Track points, tier, spend, visits</w:t>
       </w:r>
       <w:r>
         <w:rPr>
-          <w:rFonts w:ascii="Times New Roman" w:hAnsi="Times New Roman" w:eastAsia="Times New Roman" w:cs="Times New Roman"/>
-        </w:rPr>
-        <w:br w:type="textWrapping"/>
-      </w:r>
-      <w:r>
-        <w:rPr>
-          <w:rFonts w:ascii="Times New Roman" w:hAnsi="Times New Roman" w:eastAsia="Times New Roman" w:cs="Times New Roman"/>
-        </w:rPr>
+          <w:rFonts w:ascii="Times New Roman" w:eastAsia="Times New Roman" w:hAnsi="Times New Roman" w:cs="Times New Roman"/>
+        </w:rPr>
+        <w:br/>
         <w:t>o</w:t>
       </w:r>
       <w:r>
         <w:rPr>
-          <w:rFonts w:ascii="Times New Roman" w:hAnsi="Times New Roman" w:eastAsia="Times New Roman" w:cs="Times New Roman"/>
+          <w:rFonts w:ascii="Times New Roman" w:eastAsia="Times New Roman" w:hAnsi="Times New Roman" w:cs="Times New Roman"/>
         </w:rPr>
         <w:tab/>
-      </w:r>
-      <w:r>
-        <w:rPr>
-          <w:rFonts w:ascii="Times New Roman" w:hAnsi="Times New Roman" w:eastAsia="Times New Roman" w:cs="Times New Roman"/>
-        </w:rPr>
         <w:t>Auto-upgrade/downgrade (monthly review)</w:t>
       </w:r>
       <w:r>
         <w:rPr>
-          <w:rFonts w:ascii="Times New Roman" w:hAnsi="Times New Roman" w:eastAsia="Times New Roman" w:cs="Times New Roman"/>
-        </w:rPr>
-        <w:br w:type="textWrapping"/>
-      </w:r>
-      <w:r>
-        <w:rPr>
-          <w:rFonts w:ascii="Times New Roman" w:hAnsi="Times New Roman" w:eastAsia="Times New Roman" w:cs="Times New Roman"/>
-        </w:rPr>
+          <w:rFonts w:ascii="Times New Roman" w:eastAsia="Times New Roman" w:hAnsi="Times New Roman" w:cs="Times New Roman"/>
+        </w:rPr>
+        <w:br/>
         <w:t>o</w:t>
       </w:r>
       <w:r>
         <w:rPr>
-          <w:rFonts w:ascii="Times New Roman" w:hAnsi="Times New Roman" w:eastAsia="Times New Roman" w:cs="Times New Roman"/>
+          <w:rFonts w:ascii="Times New Roman" w:eastAsia="Times New Roman" w:hAnsi="Times New Roman" w:cs="Times New Roman"/>
         </w:rPr>
         <w:tab/>
-      </w:r>
-      <w:r>
-        <w:rPr>
-          <w:rFonts w:ascii="Times New Roman" w:hAnsi="Times New Roman" w:eastAsia="Times New Roman" w:cs="Times New Roman"/>
-        </w:rPr>
         <w:t xml:space="preserve">Redemption: Points → discount, free wash </w:t>
       </w:r>
       <w:r>
         <w:rPr>
-          <w:rFonts w:ascii="Times New Roman" w:hAnsi="Times New Roman" w:eastAsia="Times New Roman" w:cs="Times New Roman"/>
+          <w:rFonts w:ascii="Times New Roman" w:eastAsia="Times New Roman" w:hAnsi="Times New Roman" w:cs="Times New Roman"/>
           <w:sz w:val="18"/>
           <w:szCs w:val="18"/>
         </w:rPr>
-        <w:t>(eg. Redeems 300 pts → gets free wax)</w:t>
-      </w:r>
-      <w:r>
-        <w:rPr>
-          <w:rFonts w:ascii="Times New Roman" w:hAnsi="Times New Roman" w:eastAsia="Times New Roman" w:cs="Times New Roman"/>
+        <w:t>(</w:t>
+      </w:r>
+      <w:proofErr w:type="spellStart"/>
+      <w:r>
+        <w:rPr>
+          <w:rFonts w:ascii="Times New Roman" w:eastAsia="Times New Roman" w:hAnsi="Times New Roman" w:cs="Times New Roman"/>
           <w:sz w:val="18"/>
           <w:szCs w:val="18"/>
         </w:rPr>
-        <w:br w:type="textWrapping"/>
-      </w:r>
-      <w:r>
-        <w:rPr>
-          <w:rFonts w:ascii="Times New Roman" w:hAnsi="Times New Roman" w:eastAsia="Times New Roman" w:cs="Times New Roman"/>
+        <w:t>eg.</w:t>
+      </w:r>
+      <w:proofErr w:type="spellEnd"/>
+      <w:r>
+        <w:rPr>
+          <w:rFonts w:ascii="Times New Roman" w:eastAsia="Times New Roman" w:hAnsi="Times New Roman" w:cs="Times New Roman"/>
+          <w:sz w:val="18"/>
+          <w:szCs w:val="18"/>
+        </w:rPr>
+        <w:t xml:space="preserve"> Redeems 300 pts → gets free wax)</w:t>
+      </w:r>
+      <w:r>
+        <w:rPr>
+          <w:rFonts w:ascii="Times New Roman" w:eastAsia="Times New Roman" w:hAnsi="Times New Roman" w:cs="Times New Roman"/>
+          <w:sz w:val="18"/>
+          <w:szCs w:val="18"/>
+        </w:rPr>
+        <w:br/>
+      </w:r>
+      <w:r>
+        <w:rPr>
+          <w:rFonts w:ascii="Times New Roman" w:eastAsia="Times New Roman" w:hAnsi="Times New Roman" w:cs="Times New Roman"/>
         </w:rPr>
         <w:t>o</w:t>
       </w:r>
       <w:r>
         <w:rPr>
-          <w:rFonts w:ascii="Times New Roman" w:hAnsi="Times New Roman" w:eastAsia="Times New Roman" w:cs="Times New Roman"/>
+          <w:rFonts w:ascii="Times New Roman" w:eastAsia="Times New Roman" w:hAnsi="Times New Roman" w:cs="Times New Roman"/>
         </w:rPr>
         <w:tab/>
-      </w:r>
-      <w:r>
-        <w:rPr>
-          <w:rFonts w:ascii="Times New Roman" w:hAnsi="Times New Roman" w:eastAsia="Times New Roman" w:cs="Times New Roman"/>
-        </w:rPr>
         <w:t>Expiry: Points expire after 12 months</w:t>
       </w:r>
       <w:r>
         <w:rPr>
-          <w:rFonts w:ascii="Times New Roman" w:hAnsi="Times New Roman" w:eastAsia="Times New Roman" w:cs="Times New Roman"/>
-        </w:rPr>
-        <w:br w:type="textWrapping"/>
-      </w:r>
-      <w:r>
-        <w:rPr>
-          <w:rFonts w:ascii="Times New Roman" w:hAnsi="Times New Roman" w:eastAsia="Times New Roman" w:cs="Times New Roman"/>
+          <w:rFonts w:ascii="Times New Roman" w:eastAsia="Times New Roman" w:hAnsi="Times New Roman" w:cs="Times New Roman"/>
+        </w:rPr>
+        <w:br/>
+      </w:r>
+      <w:r>
+        <w:rPr>
+          <w:rFonts w:ascii="Times New Roman" w:eastAsia="Times New Roman" w:hAnsi="Times New Roman" w:cs="Times New Roman"/>
           <w:highlight w:val="yellow"/>
         </w:rPr>
         <w:t>Customer Profile (workshop 1)</w:t>
       </w:r>
       <w:r>
         <w:rPr>
-          <w:rFonts w:ascii="Times New Roman" w:hAnsi="Times New Roman" w:eastAsia="Times New Roman" w:cs="Times New Roman"/>
-        </w:rPr>
-        <w:br w:type="textWrapping"/>
-      </w:r>
-      <w:r>
-        <w:rPr>
-          <w:rFonts w:ascii="Times New Roman" w:hAnsi="Times New Roman" w:eastAsia="Times New Roman" w:cs="Times New Roman"/>
-        </w:rPr>
+          <w:rFonts w:ascii="Times New Roman" w:eastAsia="Times New Roman" w:hAnsi="Times New Roman" w:cs="Times New Roman"/>
+        </w:rPr>
+        <w:br/>
         <w:t>o</w:t>
       </w:r>
       <w:r>
         <w:rPr>
-          <w:rFonts w:ascii="Times New Roman" w:hAnsi="Times New Roman" w:eastAsia="Times New Roman" w:cs="Times New Roman"/>
+          <w:rFonts w:ascii="Times New Roman" w:eastAsia="Times New Roman" w:hAnsi="Times New Roman" w:cs="Times New Roman"/>
         </w:rPr>
         <w:tab/>
       </w:r>
       <w:r>
         <w:rPr>
-          <w:rFonts w:ascii="Times New Roman" w:hAnsi="Times New Roman" w:eastAsia="Times New Roman" w:cs="Times New Roman"/>
+          <w:rFonts w:ascii="Times New Roman" w:eastAsia="Times New Roman" w:hAnsi="Times New Roman" w:cs="Times New Roman"/>
           <w:sz w:val="24"/>
           <w:szCs w:val="24"/>
         </w:rPr>
@@ -926,287 +1172,189 @@
       </w:r>
       <w:r>
         <w:rPr>
-          <w:rFonts w:ascii="Times New Roman" w:hAnsi="Times New Roman" w:eastAsia="Times New Roman" w:cs="Times New Roman"/>
-          <w:sz w:val="24"/>
-          <w:szCs w:val="24"/>
-        </w:rPr>
-        <w:br w:type="textWrapping"/>
-      </w:r>
-      <w:r>
-        <w:rPr>
-          <w:rFonts w:ascii="Times New Roman" w:hAnsi="Times New Roman" w:eastAsia="Times New Roman" w:cs="Times New Roman"/>
-          <w:sz w:val="24"/>
-          <w:szCs w:val="24"/>
-        </w:rPr>
+          <w:rFonts w:ascii="Times New Roman" w:eastAsia="Times New Roman" w:hAnsi="Times New Roman" w:cs="Times New Roman"/>
+          <w:sz w:val="24"/>
+          <w:szCs w:val="24"/>
+        </w:rPr>
+        <w:br/>
         <w:t>o</w:t>
       </w:r>
       <w:r>
         <w:rPr>
-          <w:rFonts w:ascii="Times New Roman" w:hAnsi="Times New Roman" w:eastAsia="Times New Roman" w:cs="Times New Roman"/>
+          <w:rFonts w:ascii="Times New Roman" w:eastAsia="Times New Roman" w:hAnsi="Times New Roman" w:cs="Times New Roman"/>
           <w:sz w:val="24"/>
           <w:szCs w:val="24"/>
         </w:rPr>
         <w:tab/>
-      </w:r>
-      <w:r>
-        <w:rPr>
-          <w:rFonts w:ascii="Times New Roman" w:hAnsi="Times New Roman" w:eastAsia="Times New Roman" w:cs="Times New Roman"/>
-          <w:sz w:val="24"/>
-          <w:szCs w:val="24"/>
-        </w:rPr>
         <w:t xml:space="preserve">View: tier, points balance, next reward </w:t>
       </w:r>
       <w:r>
         <w:rPr>
-          <w:rFonts w:ascii="Times New Roman" w:hAnsi="Times New Roman" w:eastAsia="Times New Roman" w:cs="Times New Roman"/>
-        </w:rPr>
-        <w:br w:type="textWrapping"/>
-      </w:r>
-      <w:r>
-        <w:rPr>
-          <w:rFonts w:ascii="Times New Roman" w:hAnsi="Times New Roman" w:eastAsia="Times New Roman" w:cs="Times New Roman"/>
+          <w:rFonts w:ascii="Times New Roman" w:eastAsia="Times New Roman" w:hAnsi="Times New Roman" w:cs="Times New Roman"/>
+        </w:rPr>
+        <w:br/>
+      </w:r>
+      <w:r>
+        <w:rPr>
+          <w:rFonts w:ascii="Times New Roman" w:eastAsia="Times New Roman" w:hAnsi="Times New Roman" w:cs="Times New Roman"/>
           <w:highlight w:val="yellow"/>
         </w:rPr>
-        <w:t>Customer Booking and  and Wash history (workshop 2)</w:t>
-      </w:r>
-      <w:r>
-        <w:rPr>
-          <w:rFonts w:ascii="Times New Roman" w:hAnsi="Times New Roman" w:eastAsia="Times New Roman" w:cs="Times New Roman"/>
-        </w:rPr>
-        <w:br w:type="textWrapping"/>
-      </w:r>
-      <w:r>
-        <w:rPr>
-          <w:rFonts w:ascii="Times New Roman" w:hAnsi="Times New Roman" w:eastAsia="Times New Roman" w:cs="Times New Roman"/>
-        </w:rPr>
+        <w:t xml:space="preserve">Customer Booking </w:t>
+      </w:r>
+      <w:proofErr w:type="gramStart"/>
+      <w:r>
+        <w:rPr>
+          <w:rFonts w:ascii="Times New Roman" w:eastAsia="Times New Roman" w:hAnsi="Times New Roman" w:cs="Times New Roman"/>
+          <w:highlight w:val="yellow"/>
+        </w:rPr>
+        <w:t xml:space="preserve">and  </w:t>
+      </w:r>
+      <w:proofErr w:type="spellStart"/>
+      <w:r>
+        <w:rPr>
+          <w:rFonts w:ascii="Times New Roman" w:eastAsia="Times New Roman" w:hAnsi="Times New Roman" w:cs="Times New Roman"/>
+          <w:highlight w:val="yellow"/>
+        </w:rPr>
+        <w:t>and</w:t>
+      </w:r>
+      <w:proofErr w:type="spellEnd"/>
+      <w:proofErr w:type="gramEnd"/>
+      <w:r>
+        <w:rPr>
+          <w:rFonts w:ascii="Times New Roman" w:eastAsia="Times New Roman" w:hAnsi="Times New Roman" w:cs="Times New Roman"/>
+          <w:highlight w:val="yellow"/>
+        </w:rPr>
+        <w:t xml:space="preserve"> Wash history (workshop 2)</w:t>
+      </w:r>
+      <w:r>
+        <w:rPr>
+          <w:rFonts w:ascii="Times New Roman" w:eastAsia="Times New Roman" w:hAnsi="Times New Roman" w:cs="Times New Roman"/>
+        </w:rPr>
+        <w:br/>
         <w:t>o</w:t>
       </w:r>
       <w:r>
         <w:rPr>
-          <w:rFonts w:ascii="Times New Roman" w:hAnsi="Times New Roman" w:eastAsia="Times New Roman" w:cs="Times New Roman"/>
+          <w:rFonts w:ascii="Times New Roman" w:eastAsia="Times New Roman" w:hAnsi="Times New Roman" w:cs="Times New Roman"/>
         </w:rPr>
         <w:tab/>
-      </w:r>
-      <w:r>
-        <w:rPr>
-          <w:rFonts w:ascii="Times New Roman" w:hAnsi="Times New Roman" w:eastAsia="Times New Roman" w:cs="Times New Roman"/>
-        </w:rPr>
         <w:t>Tier-based booking window:</w:t>
       </w:r>
       <w:r>
         <w:rPr>
-          <w:rFonts w:ascii="Times New Roman" w:hAnsi="Times New Roman" w:eastAsia="Times New Roman" w:cs="Times New Roman"/>
-        </w:rPr>
-        <w:br w:type="textWrapping"/>
-      </w:r>
-      <w:r>
-        <w:rPr>
-          <w:rFonts w:ascii="Times New Roman" w:hAnsi="Times New Roman" w:eastAsia="Times New Roman" w:cs="Times New Roman"/>
-        </w:rPr>
+          <w:rFonts w:ascii="Times New Roman" w:eastAsia="Times New Roman" w:hAnsi="Times New Roman" w:cs="Times New Roman"/>
+        </w:rPr>
+        <w:br/>
         <w:t>o</w:t>
       </w:r>
       <w:r>
         <w:rPr>
-          <w:rFonts w:ascii="Times New Roman" w:hAnsi="Times New Roman" w:eastAsia="Times New Roman" w:cs="Times New Roman"/>
+          <w:rFonts w:ascii="Times New Roman" w:eastAsia="Times New Roman" w:hAnsi="Times New Roman" w:cs="Times New Roman"/>
         </w:rPr>
         <w:tab/>
-      </w:r>
-      <w:r>
-        <w:rPr>
-          <w:rFonts w:ascii="Times New Roman" w:hAnsi="Times New Roman" w:eastAsia="Times New Roman" w:cs="Times New Roman"/>
-        </w:rPr>
         <w:t>Member: 7 days</w:t>
       </w:r>
       <w:r>
         <w:rPr>
-          <w:rFonts w:ascii="Times New Roman" w:hAnsi="Times New Roman" w:eastAsia="Times New Roman" w:cs="Times New Roman"/>
-        </w:rPr>
-        <w:br w:type="textWrapping"/>
-      </w:r>
-      <w:r>
-        <w:rPr>
-          <w:rFonts w:ascii="Times New Roman" w:hAnsi="Times New Roman" w:eastAsia="Times New Roman" w:cs="Times New Roman"/>
+          <w:rFonts w:ascii="Times New Roman" w:eastAsia="Times New Roman" w:hAnsi="Times New Roman" w:cs="Times New Roman"/>
+        </w:rPr>
+        <w:br/>
+      </w:r>
+      <w:proofErr w:type="spellStart"/>
+      <w:r>
+        <w:rPr>
+          <w:rFonts w:ascii="Times New Roman" w:eastAsia="Times New Roman" w:hAnsi="Times New Roman" w:cs="Times New Roman"/>
         </w:rPr>
         <w:t>o</w:t>
       </w:r>
-      <w:r>
-        <w:rPr>
-          <w:rFonts w:ascii="Times New Roman" w:hAnsi="Times New Roman" w:eastAsia="Times New Roman" w:cs="Times New Roman"/>
+      <w:proofErr w:type="spellEnd"/>
+      <w:r>
+        <w:rPr>
+          <w:rFonts w:ascii="Times New Roman" w:eastAsia="Times New Roman" w:hAnsi="Times New Roman" w:cs="Times New Roman"/>
         </w:rPr>
         <w:tab/>
-      </w:r>
-      <w:r>
-        <w:rPr>
-          <w:rFonts w:ascii="Times New Roman" w:hAnsi="Times New Roman" w:eastAsia="Times New Roman" w:cs="Times New Roman"/>
-        </w:rPr>
         <w:t>Silver: 10 days</w:t>
       </w:r>
       <w:r>
         <w:rPr>
-          <w:rFonts w:ascii="Times New Roman" w:hAnsi="Times New Roman" w:eastAsia="Times New Roman" w:cs="Times New Roman"/>
-        </w:rPr>
-        <w:br w:type="textWrapping"/>
-      </w:r>
-      <w:r>
-        <w:rPr>
-          <w:rFonts w:ascii="Times New Roman" w:hAnsi="Times New Roman" w:eastAsia="Times New Roman" w:cs="Times New Roman"/>
+          <w:rFonts w:ascii="Times New Roman" w:eastAsia="Times New Roman" w:hAnsi="Times New Roman" w:cs="Times New Roman"/>
+        </w:rPr>
+        <w:br/>
+      </w:r>
+      <w:proofErr w:type="spellStart"/>
+      <w:r>
+        <w:rPr>
+          <w:rFonts w:ascii="Times New Roman" w:eastAsia="Times New Roman" w:hAnsi="Times New Roman" w:cs="Times New Roman"/>
         </w:rPr>
         <w:t>o</w:t>
       </w:r>
-      <w:r>
-        <w:rPr>
-          <w:rFonts w:ascii="Times New Roman" w:hAnsi="Times New Roman" w:eastAsia="Times New Roman" w:cs="Times New Roman"/>
+      <w:proofErr w:type="spellEnd"/>
+      <w:r>
+        <w:rPr>
+          <w:rFonts w:ascii="Times New Roman" w:eastAsia="Times New Roman" w:hAnsi="Times New Roman" w:cs="Times New Roman"/>
         </w:rPr>
         <w:tab/>
-      </w:r>
-      <w:r>
-        <w:rPr>
-          <w:rFonts w:ascii="Times New Roman" w:hAnsi="Times New Roman" w:eastAsia="Times New Roman" w:cs="Times New Roman"/>
-        </w:rPr>
         <w:t>Gold: 12 days</w:t>
       </w:r>
       <w:r>
         <w:rPr>
-          <w:rFonts w:ascii="Times New Roman" w:hAnsi="Times New Roman" w:eastAsia="Times New Roman" w:cs="Times New Roman"/>
-        </w:rPr>
-        <w:br w:type="textWrapping"/>
-      </w:r>
-      <w:r>
-        <w:rPr>
-          <w:rFonts w:ascii="Times New Roman" w:hAnsi="Times New Roman" w:eastAsia="Times New Roman" w:cs="Times New Roman"/>
+          <w:rFonts w:ascii="Times New Roman" w:eastAsia="Times New Roman" w:hAnsi="Times New Roman" w:cs="Times New Roman"/>
+        </w:rPr>
+        <w:br/>
+      </w:r>
+      <w:proofErr w:type="spellStart"/>
+      <w:r>
+        <w:rPr>
+          <w:rFonts w:ascii="Times New Roman" w:eastAsia="Times New Roman" w:hAnsi="Times New Roman" w:cs="Times New Roman"/>
         </w:rPr>
         <w:t>o</w:t>
       </w:r>
-      <w:r>
-        <w:rPr>
-          <w:rFonts w:ascii="Times New Roman" w:hAnsi="Times New Roman" w:eastAsia="Times New Roman" w:cs="Times New Roman"/>
+      <w:proofErr w:type="spellEnd"/>
+      <w:r>
+        <w:rPr>
+          <w:rFonts w:ascii="Times New Roman" w:eastAsia="Times New Roman" w:hAnsi="Times New Roman" w:cs="Times New Roman"/>
         </w:rPr>
         <w:tab/>
-      </w:r>
-      <w:r>
-        <w:rPr>
-          <w:rFonts w:ascii="Times New Roman" w:hAnsi="Times New Roman" w:eastAsia="Times New Roman" w:cs="Times New Roman"/>
-        </w:rPr>
         <w:t>Platinum: 14 days</w:t>
       </w:r>
       <w:r>
         <w:rPr>
-          <w:rFonts w:ascii="Times New Roman" w:hAnsi="Times New Roman" w:eastAsia="Times New Roman" w:cs="Times New Roman"/>
-        </w:rPr>
-        <w:br w:type="textWrapping"/>
-      </w:r>
-      <w:r>
-        <w:rPr>
-          <w:rFonts w:ascii="Times New Roman" w:hAnsi="Times New Roman" w:eastAsia="Times New Roman" w:cs="Times New Roman"/>
+          <w:rFonts w:ascii="Times New Roman" w:eastAsia="Times New Roman" w:hAnsi="Times New Roman" w:cs="Times New Roman"/>
+        </w:rPr>
+        <w:br/>
+      </w:r>
+      <w:proofErr w:type="spellStart"/>
+      <w:r>
+        <w:rPr>
+          <w:rFonts w:ascii="Times New Roman" w:eastAsia="Times New Roman" w:hAnsi="Times New Roman" w:cs="Times New Roman"/>
         </w:rPr>
         <w:t>o</w:t>
       </w:r>
-      <w:r>
-        <w:rPr>
-          <w:rFonts w:ascii="Times New Roman" w:hAnsi="Times New Roman" w:eastAsia="Times New Roman" w:cs="Times New Roman"/>
+      <w:proofErr w:type="spellEnd"/>
+      <w:r>
+        <w:rPr>
+          <w:rFonts w:ascii="Times New Roman" w:eastAsia="Times New Roman" w:hAnsi="Times New Roman" w:cs="Times New Roman"/>
         </w:rPr>
         <w:tab/>
-      </w:r>
-      <w:r>
-        <w:rPr>
-          <w:rFonts w:ascii="Times New Roman" w:hAnsi="Times New Roman" w:eastAsia="Times New Roman" w:cs="Times New Roman"/>
-        </w:rPr>
-        <w:t>Priority queue: Higher tie</w:t>
-      </w:r>
-      <w:bookmarkStart w:id="0" w:name="_GoBack"/>
-      <w:bookmarkEnd w:id="0"/>
-      <w:r>
-        <w:rPr>
-          <w:rFonts w:ascii="Times New Roman" w:hAnsi="Times New Roman" w:eastAsia="Times New Roman" w:cs="Times New Roman"/>
-        </w:rPr>
-        <w:t>r = earlier access</w:t>
-      </w:r>
-      <w:r>
-        <w:rPr>
-          <w:rFonts w:ascii="Times New Roman" w:hAnsi="Times New Roman" w:eastAsia="Times New Roman" w:cs="Times New Roman"/>
-        </w:rPr>
-        <w:br w:type="textWrapping"/>
-      </w:r>
-      <w:r>
-        <w:rPr>
-          <w:rFonts w:ascii="Times New Roman" w:hAnsi="Times New Roman" w:eastAsia="Times New Roman" w:cs="Times New Roman"/>
-          <w:highlight w:val="yellow"/>
-        </w:rPr>
-        <w:t>Admin Controls(asignment)</w:t>
-      </w:r>
-      <w:r>
-        <w:rPr>
-          <w:rFonts w:ascii="Times New Roman" w:hAnsi="Times New Roman" w:eastAsia="Times New Roman" w:cs="Times New Roman"/>
-        </w:rPr>
-        <w:br w:type="textWrapping"/>
-      </w:r>
-      <w:r>
-        <w:rPr>
-          <w:rFonts w:ascii="Times New Roman" w:hAnsi="Times New Roman" w:eastAsia="Times New Roman" w:cs="Times New Roman"/>
-        </w:rPr>
-        <w:t>o</w:t>
-      </w:r>
-      <w:r>
-        <w:rPr>
-          <w:rFonts w:ascii="Times New Roman" w:hAnsi="Times New Roman" w:eastAsia="Times New Roman" w:cs="Times New Roman"/>
-        </w:rPr>
-        <w:tab/>
-      </w:r>
-      <w:r>
-        <w:rPr>
-          <w:rFonts w:ascii="Times New Roman" w:hAnsi="Times New Roman" w:eastAsia="Times New Roman" w:cs="Times New Roman"/>
-        </w:rPr>
-        <w:t>Configure tier rules, point rates</w:t>
-      </w:r>
-      <w:r>
-        <w:rPr>
-          <w:rFonts w:ascii="Times New Roman" w:hAnsi="Times New Roman" w:eastAsia="Times New Roman" w:cs="Times New Roman"/>
-        </w:rPr>
-        <w:br w:type="textWrapping"/>
-      </w:r>
-      <w:r>
-        <w:rPr>
-          <w:rFonts w:ascii="Times New Roman" w:hAnsi="Times New Roman" w:eastAsia="Times New Roman" w:cs="Times New Roman"/>
-        </w:rPr>
-        <w:t>o</w:t>
-      </w:r>
-      <w:r>
-        <w:rPr>
-          <w:rFonts w:ascii="Times New Roman" w:hAnsi="Times New Roman" w:eastAsia="Times New Roman" w:cs="Times New Roman"/>
-        </w:rPr>
-        <w:tab/>
-      </w:r>
-      <w:r>
-        <w:rPr>
-          <w:rFonts w:ascii="Times New Roman" w:hAnsi="Times New Roman" w:eastAsia="Times New Roman" w:cs="Times New Roman"/>
-        </w:rPr>
-        <w:t>Run targeted promos: “Send to Silver+ only”</w:t>
-      </w:r>
-    </w:p>
-    <w:p>
-      <w:pPr>
-        <w:ind w:left="1440"/>
-        <w:rPr>
-          <w:rFonts w:ascii="Times New Roman" w:hAnsi="Times New Roman" w:eastAsia="Times New Roman" w:cs="Times New Roman"/>
-        </w:rPr>
-      </w:pPr>
-      <w:r>
-        <w:rPr>
-          <w:rFonts w:ascii="Times New Roman" w:hAnsi="Times New Roman" w:eastAsia="Times New Roman" w:cs="Times New Roman"/>
-        </w:rPr>
-        <w:tab/>
-      </w:r>
-      <w:r>
-        <w:rPr>
-          <w:rFonts w:ascii="Times New Roman" w:hAnsi="Times New Roman" w:eastAsia="Times New Roman" w:cs="Times New Roman"/>
-        </w:rPr>
-        <w:t>Reports(eg. the number of customers, …)</w:t>
-      </w:r>
-      <w:r>
-        <w:rPr>
-          <w:rFonts w:ascii="Times New Roman" w:hAnsi="Times New Roman" w:eastAsia="Times New Roman" w:cs="Times New Roman"/>
-        </w:rPr>
-        <w:br w:type="textWrapping"/>
+        <w:t>Priority queue: Higher tier = earlier access</w:t>
+      </w:r>
+      <w:r>
+        <w:rPr>
+          <w:rFonts w:ascii="Times New Roman" w:eastAsia="Times New Roman" w:hAnsi="Times New Roman" w:cs="Times New Roman"/>
+        </w:rPr>
+        <w:br/>
+      </w:r>
+      <w:r>
+        <w:rPr>
+          <w:rFonts w:ascii="Times New Roman" w:eastAsia="Times New Roman" w:hAnsi="Times New Roman" w:cs="Times New Roman"/>
+        </w:rPr>
+        <w:t xml:space="preserve"> </w:t>
+      </w:r>
+      <w:r>
+        <w:rPr>
+          <w:rFonts w:ascii="Times New Roman" w:eastAsia="Times New Roman" w:hAnsi="Times New Roman" w:cs="Times New Roman"/>
+        </w:rPr>
+        <w:br/>
       </w:r>
     </w:p>
     <w:p>
@@ -1217,12 +1365,12 @@
         </w:numPr>
         <w:ind w:left="1080"/>
         <w:rPr>
-          <w:rFonts w:ascii="Times New Roman" w:hAnsi="Times New Roman" w:eastAsia="Times New Roman" w:cs="Times New Roman"/>
-        </w:rPr>
-      </w:pPr>
-      <w:r>
-        <w:rPr>
-          <w:rFonts w:ascii="Times New Roman" w:hAnsi="Times New Roman" w:eastAsia="Times New Roman" w:cs="Times New Roman"/>
+          <w:rFonts w:ascii="Times New Roman" w:eastAsia="Times New Roman" w:hAnsi="Times New Roman" w:cs="Times New Roman"/>
+        </w:rPr>
+      </w:pPr>
+      <w:r>
+        <w:rPr>
+          <w:rFonts w:ascii="Times New Roman" w:eastAsia="Times New Roman" w:hAnsi="Times New Roman" w:cs="Times New Roman"/>
           <w:b/>
           <w:sz w:val="24"/>
           <w:szCs w:val="24"/>
@@ -1231,7 +1379,7 @@
       </w:r>
       <w:r>
         <w:rPr>
-          <w:rFonts w:ascii="Times New Roman" w:hAnsi="Times New Roman" w:eastAsia="Times New Roman" w:cs="Times New Roman"/>
+          <w:rFonts w:ascii="Times New Roman" w:eastAsia="Times New Roman" w:hAnsi="Times New Roman" w:cs="Times New Roman"/>
           <w:sz w:val="24"/>
           <w:szCs w:val="24"/>
         </w:rPr>
@@ -1242,146 +1390,91 @@
       <w:pPr>
         <w:ind w:left="1440"/>
         <w:rPr>
-          <w:rFonts w:ascii="Times New Roman" w:hAnsi="Times New Roman" w:eastAsia="Times New Roman" w:cs="Times New Roman"/>
+          <w:rFonts w:ascii="Times New Roman" w:eastAsia="Times New Roman" w:hAnsi="Times New Roman" w:cs="Times New Roman"/>
           <w:lang w:val="vi-VN"/>
         </w:rPr>
       </w:pPr>
       <w:r>
         <w:rPr>
-          <w:rFonts w:ascii="Times New Roman" w:hAnsi="Times New Roman" w:eastAsia="Times New Roman" w:cs="Times New Roman"/>
+          <w:rFonts w:ascii="Times New Roman" w:eastAsia="Times New Roman" w:hAnsi="Times New Roman" w:cs="Times New Roman"/>
         </w:rPr>
         <w:t>NFR-01: Response Time</w:t>
       </w:r>
       <w:r>
         <w:rPr>
-          <w:rFonts w:ascii="Times New Roman" w:hAnsi="Times New Roman" w:eastAsia="Times New Roman" w:cs="Times New Roman"/>
-        </w:rPr>
-        <w:br w:type="textWrapping"/>
-      </w:r>
-      <w:r>
-        <w:rPr>
-          <w:rFonts w:ascii="Times New Roman" w:hAnsi="Times New Roman" w:eastAsia="Times New Roman" w:cs="Times New Roman"/>
-        </w:rPr>
+          <w:rFonts w:ascii="Times New Roman" w:eastAsia="Times New Roman" w:hAnsi="Times New Roman" w:cs="Times New Roman"/>
+        </w:rPr>
+        <w:br/>
         <w:t>The system shall respond to user actions within ≤ 5 seconds for 95% of requests under normal load.</w:t>
       </w:r>
       <w:r>
         <w:rPr>
-          <w:rFonts w:ascii="Times New Roman" w:hAnsi="Times New Roman" w:eastAsia="Times New Roman" w:cs="Times New Roman"/>
-        </w:rPr>
-        <w:br w:type="textWrapping"/>
-      </w:r>
-      <w:r>
-        <w:rPr>
-          <w:rFonts w:ascii="Times New Roman" w:hAnsi="Times New Roman" w:eastAsia="Times New Roman" w:cs="Times New Roman"/>
-        </w:rPr>
+          <w:rFonts w:ascii="Times New Roman" w:eastAsia="Times New Roman" w:hAnsi="Times New Roman" w:cs="Times New Roman"/>
+        </w:rPr>
+        <w:br/>
         <w:t>NFR-02: Booking Processing</w:t>
       </w:r>
       <w:r>
         <w:rPr>
-          <w:rFonts w:ascii="Times New Roman" w:hAnsi="Times New Roman" w:eastAsia="Times New Roman" w:cs="Times New Roman"/>
-        </w:rPr>
-        <w:br w:type="textWrapping"/>
-      </w:r>
-      <w:r>
-        <w:rPr>
-          <w:rFonts w:ascii="Times New Roman" w:hAnsi="Times New Roman" w:eastAsia="Times New Roman" w:cs="Times New Roman"/>
-        </w:rPr>
+          <w:rFonts w:ascii="Times New Roman" w:eastAsia="Times New Roman" w:hAnsi="Times New Roman" w:cs="Times New Roman"/>
+        </w:rPr>
+        <w:br/>
         <w:t>Booking transactions shall be completed within ≤ 5 seconds, including loyalty calculation and reward application.</w:t>
       </w:r>
       <w:r>
         <w:rPr>
-          <w:rFonts w:ascii="Times New Roman" w:hAnsi="Times New Roman" w:eastAsia="Times New Roman" w:cs="Times New Roman"/>
-        </w:rPr>
-        <w:br w:type="textWrapping"/>
-      </w:r>
-      <w:r>
-        <w:rPr>
-          <w:rFonts w:ascii="Times New Roman" w:hAnsi="Times New Roman" w:eastAsia="Times New Roman" w:cs="Times New Roman"/>
-        </w:rPr>
+          <w:rFonts w:ascii="Times New Roman" w:eastAsia="Times New Roman" w:hAnsi="Times New Roman" w:cs="Times New Roman"/>
+        </w:rPr>
+        <w:br/>
         <w:t>NFR-03: Concurrent Users</w:t>
       </w:r>
       <w:r>
         <w:rPr>
-          <w:rFonts w:ascii="Times New Roman" w:hAnsi="Times New Roman" w:eastAsia="Times New Roman" w:cs="Times New Roman"/>
-        </w:rPr>
-        <w:br w:type="textWrapping"/>
-      </w:r>
-      <w:r>
-        <w:rPr>
-          <w:rFonts w:ascii="Times New Roman" w:hAnsi="Times New Roman" w:eastAsia="Times New Roman" w:cs="Times New Roman"/>
-        </w:rPr>
+          <w:rFonts w:ascii="Times New Roman" w:eastAsia="Times New Roman" w:hAnsi="Times New Roman" w:cs="Times New Roman"/>
+        </w:rPr>
+        <w:br/>
         <w:t>The system shall support at least 500 concurrent users without performance degradation.</w:t>
       </w:r>
       <w:r>
         <w:rPr>
-          <w:rFonts w:ascii="Times New Roman" w:hAnsi="Times New Roman" w:eastAsia="Times New Roman" w:cs="Times New Roman"/>
-        </w:rPr>
-        <w:br w:type="textWrapping"/>
-      </w:r>
-      <w:r>
-        <w:rPr>
-          <w:rFonts w:ascii="Times New Roman" w:hAnsi="Times New Roman" w:eastAsia="Times New Roman" w:cs="Times New Roman"/>
-        </w:rPr>
+          <w:rFonts w:ascii="Times New Roman" w:eastAsia="Times New Roman" w:hAnsi="Times New Roman" w:cs="Times New Roman"/>
+        </w:rPr>
+        <w:br/>
         <w:t>NFR-04: LPR Processing Speed</w:t>
       </w:r>
       <w:r>
         <w:rPr>
-          <w:rFonts w:ascii="Times New Roman" w:hAnsi="Times New Roman" w:eastAsia="Times New Roman" w:cs="Times New Roman"/>
-        </w:rPr>
-        <w:br w:type="textWrapping"/>
-      </w:r>
-      <w:r>
-        <w:rPr>
-          <w:rFonts w:ascii="Times New Roman" w:hAnsi="Times New Roman" w:eastAsia="Times New Roman" w:cs="Times New Roman"/>
-        </w:rPr>
+          <w:rFonts w:ascii="Times New Roman" w:eastAsia="Times New Roman" w:hAnsi="Times New Roman" w:cs="Times New Roman"/>
+        </w:rPr>
+        <w:br/>
         <w:t>License Plate Recognition (LPR) shall identify vehicles within ≤ 10 second after capture.</w:t>
       </w:r>
       <w:r>
         <w:rPr>
-          <w:rFonts w:ascii="Times New Roman" w:hAnsi="Times New Roman" w:eastAsia="Times New Roman" w:cs="Times New Roman"/>
-        </w:rPr>
-        <w:br w:type="textWrapping"/>
-      </w:r>
-      <w:r>
-        <w:rPr>
-          <w:rFonts w:ascii="Times New Roman" w:hAnsi="Times New Roman" w:eastAsia="Times New Roman" w:cs="Times New Roman"/>
-        </w:rPr>
+          <w:rFonts w:ascii="Times New Roman" w:eastAsia="Times New Roman" w:hAnsi="Times New Roman" w:cs="Times New Roman"/>
+        </w:rPr>
+        <w:br/>
         <w:t>NFR-05: System Availability</w:t>
       </w:r>
       <w:r>
         <w:rPr>
-          <w:rFonts w:ascii="Times New Roman" w:hAnsi="Times New Roman" w:eastAsia="Times New Roman" w:cs="Times New Roman"/>
-        </w:rPr>
-        <w:br w:type="textWrapping"/>
-      </w:r>
-      <w:r>
-        <w:rPr>
-          <w:rFonts w:ascii="Times New Roman" w:hAnsi="Times New Roman" w:eastAsia="Times New Roman" w:cs="Times New Roman"/>
-        </w:rPr>
+          <w:rFonts w:ascii="Times New Roman" w:eastAsia="Times New Roman" w:hAnsi="Times New Roman" w:cs="Times New Roman"/>
+        </w:rPr>
+        <w:br/>
         <w:t>The system shall maintain 99.5% uptime excluding scheduled maintenance.</w:t>
       </w:r>
       <w:r>
         <w:rPr>
-          <w:rFonts w:ascii="Times New Roman" w:hAnsi="Times New Roman" w:eastAsia="Times New Roman" w:cs="Times New Roman"/>
-        </w:rPr>
-        <w:br w:type="textWrapping"/>
-      </w:r>
-      <w:r>
-        <w:rPr>
-          <w:rFonts w:ascii="Times New Roman" w:hAnsi="Times New Roman" w:eastAsia="Times New Roman" w:cs="Times New Roman"/>
-        </w:rPr>
+          <w:rFonts w:ascii="Times New Roman" w:eastAsia="Times New Roman" w:hAnsi="Times New Roman" w:cs="Times New Roman"/>
+        </w:rPr>
+        <w:br/>
         <w:t>NFR-06: Data Backup</w:t>
       </w:r>
       <w:r>
         <w:rPr>
-          <w:rFonts w:ascii="Times New Roman" w:hAnsi="Times New Roman" w:eastAsia="Times New Roman" w:cs="Times New Roman"/>
-        </w:rPr>
-        <w:br w:type="textWrapping"/>
-      </w:r>
-      <w:r>
-        <w:rPr>
-          <w:rFonts w:ascii="Times New Roman" w:hAnsi="Times New Roman" w:eastAsia="Times New Roman" w:cs="Times New Roman"/>
-        </w:rPr>
+          <w:rFonts w:ascii="Times New Roman" w:eastAsia="Times New Roman" w:hAnsi="Times New Roman" w:cs="Times New Roman"/>
+        </w:rPr>
+        <w:br/>
         <w:t>Data shall be backed up daily with a recovery time objective (RTO) of ≤ 2 hours.</w:t>
       </w:r>
     </w:p>
@@ -1390,14 +1483,14 @@
         <w:shd w:val="clear" w:color="auto" w:fill="FFFFFF"/>
         <w:jc w:val="both"/>
         <w:rPr>
-          <w:rFonts w:ascii="Times New Roman" w:hAnsi="Times New Roman" w:eastAsia="Times New Roman" w:cs="Times New Roman"/>
-          <w:sz w:val="24"/>
-          <w:szCs w:val="24"/>
-        </w:rPr>
-      </w:pPr>
-      <w:r>
-        <w:rPr>
-          <w:rFonts w:ascii="Times New Roman" w:hAnsi="Times New Roman" w:eastAsia="Times New Roman" w:cs="Times New Roman"/>
+          <w:rFonts w:ascii="Times New Roman" w:eastAsia="Times New Roman" w:hAnsi="Times New Roman" w:cs="Times New Roman"/>
+          <w:sz w:val="24"/>
+          <w:szCs w:val="24"/>
+        </w:rPr>
+      </w:pPr>
+      <w:r>
+        <w:rPr>
+          <w:rFonts w:ascii="Times New Roman" w:eastAsia="Times New Roman" w:hAnsi="Times New Roman" w:cs="Times New Roman"/>
           <w:sz w:val="24"/>
           <w:szCs w:val="24"/>
         </w:rPr>
@@ -1412,12 +1505,12 @@
         </w:numPr>
         <w:ind w:left="1080"/>
         <w:rPr>
-          <w:rFonts w:ascii="Times New Roman" w:hAnsi="Times New Roman" w:eastAsia="Times New Roman" w:cs="Times New Roman"/>
-        </w:rPr>
-      </w:pPr>
-      <w:r>
-        <w:rPr>
-          <w:rFonts w:ascii="Times New Roman" w:hAnsi="Times New Roman" w:eastAsia="Times New Roman" w:cs="Times New Roman"/>
+          <w:rFonts w:ascii="Times New Roman" w:eastAsia="Times New Roman" w:hAnsi="Times New Roman" w:cs="Times New Roman"/>
+        </w:rPr>
+      </w:pPr>
+      <w:r>
+        <w:rPr>
+          <w:rFonts w:ascii="Times New Roman" w:eastAsia="Times New Roman" w:hAnsi="Times New Roman" w:cs="Times New Roman"/>
           <w:b/>
           <w:sz w:val="24"/>
           <w:szCs w:val="24"/>
@@ -1429,113 +1522,118 @@
       <w:pPr>
         <w:ind w:left="1080"/>
         <w:rPr>
-          <w:rFonts w:ascii="Times New Roman" w:hAnsi="Times New Roman" w:eastAsia="Times New Roman" w:cs="Times New Roman"/>
-        </w:rPr>
-      </w:pPr>
-      <w:r>
-        <w:rPr>
-          <w:rFonts w:ascii="Times New Roman" w:hAnsi="Times New Roman" w:eastAsia="Times New Roman" w:cs="Times New Roman"/>
+          <w:rFonts w:ascii="Times New Roman" w:eastAsia="Times New Roman" w:hAnsi="Times New Roman" w:cs="Times New Roman"/>
+        </w:rPr>
+      </w:pPr>
+      <w:r>
+        <w:rPr>
+          <w:rFonts w:ascii="Times New Roman" w:eastAsia="Times New Roman" w:hAnsi="Times New Roman" w:cs="Times New Roman"/>
         </w:rPr>
         <w:t>•</w:t>
       </w:r>
       <w:r>
         <w:rPr>
-          <w:rFonts w:ascii="Times New Roman" w:hAnsi="Times New Roman" w:eastAsia="Times New Roman" w:cs="Times New Roman"/>
+          <w:rFonts w:ascii="Times New Roman" w:eastAsia="Times New Roman" w:hAnsi="Times New Roman" w:cs="Times New Roman"/>
         </w:rPr>
         <w:tab/>
-      </w:r>
-      <w:r>
-        <w:rPr>
-          <w:rFonts w:ascii="Times New Roman" w:hAnsi="Times New Roman" w:eastAsia="Times New Roman" w:cs="Times New Roman"/>
-        </w:rPr>
         <w:t>Full SDLC: SRS, Design, Code, Testing, Deployment</w:t>
       </w:r>
       <w:r>
         <w:rPr>
-          <w:rFonts w:ascii="Times New Roman" w:hAnsi="Times New Roman" w:eastAsia="Times New Roman" w:cs="Times New Roman"/>
-        </w:rPr>
-        <w:br w:type="textWrapping"/>
-      </w:r>
-      <w:r>
-        <w:rPr>
-          <w:rFonts w:ascii="Times New Roman" w:hAnsi="Times New Roman" w:eastAsia="Times New Roman" w:cs="Times New Roman"/>
-        </w:rPr>
+          <w:rFonts w:ascii="Times New Roman" w:eastAsia="Times New Roman" w:hAnsi="Times New Roman" w:cs="Times New Roman"/>
+        </w:rPr>
+        <w:br/>
         <w:t>•</w:t>
       </w:r>
       <w:r>
         <w:rPr>
-          <w:rFonts w:ascii="Times New Roman" w:hAnsi="Times New Roman" w:eastAsia="Times New Roman" w:cs="Times New Roman"/>
+          <w:rFonts w:ascii="Times New Roman" w:eastAsia="Times New Roman" w:hAnsi="Times New Roman" w:cs="Times New Roman"/>
         </w:rPr>
         <w:tab/>
-      </w:r>
-      <w:r>
-        <w:rPr>
-          <w:rFonts w:ascii="Times New Roman" w:hAnsi="Times New Roman" w:eastAsia="Times New Roman" w:cs="Times New Roman"/>
-        </w:rPr>
         <w:t>Loyalty Logic: State machine for tier transitions</w:t>
       </w:r>
       <w:r>
         <w:rPr>
-          <w:rFonts w:ascii="Times New Roman" w:hAnsi="Times New Roman" w:eastAsia="Times New Roman" w:cs="Times New Roman"/>
-        </w:rPr>
-        <w:br w:type="textWrapping"/>
-      </w:r>
-      <w:r>
-        <w:rPr>
-          <w:rFonts w:ascii="Times New Roman" w:hAnsi="Times New Roman" w:eastAsia="Times New Roman" w:cs="Times New Roman"/>
-        </w:rPr>
+          <w:rFonts w:ascii="Times New Roman" w:eastAsia="Times New Roman" w:hAnsi="Times New Roman" w:cs="Times New Roman"/>
+        </w:rPr>
+        <w:br/>
         <w:t>•</w:t>
       </w:r>
       <w:r>
         <w:rPr>
-          <w:rFonts w:ascii="Times New Roman" w:hAnsi="Times New Roman" w:eastAsia="Times New Roman" w:cs="Times New Roman"/>
+          <w:rFonts w:ascii="Times New Roman" w:eastAsia="Times New Roman" w:hAnsi="Times New Roman" w:cs="Times New Roman"/>
         </w:rPr>
         <w:tab/>
       </w:r>
-      <w:r>
-        <w:rPr>
-          <w:rFonts w:ascii="Times New Roman" w:hAnsi="Times New Roman" w:eastAsia="Times New Roman" w:cs="Times New Roman"/>
-        </w:rPr>
-        <w:t>Backend+Frontend: Servlet +JSP + html +css+…</w:t>
+      <w:proofErr w:type="spellStart"/>
+      <w:r>
+        <w:rPr>
+          <w:rFonts w:ascii="Times New Roman" w:eastAsia="Times New Roman" w:hAnsi="Times New Roman" w:cs="Times New Roman"/>
+        </w:rPr>
+        <w:t>Backend+Frontend</w:t>
+      </w:r>
+      <w:proofErr w:type="spellEnd"/>
+      <w:r>
+        <w:rPr>
+          <w:rFonts w:ascii="Times New Roman" w:eastAsia="Times New Roman" w:hAnsi="Times New Roman" w:cs="Times New Roman"/>
+        </w:rPr>
+        <w:t>: Servlet +JSP + html +</w:t>
+      </w:r>
+      <w:proofErr w:type="spellStart"/>
+      <w:r>
+        <w:rPr>
+          <w:rFonts w:ascii="Times New Roman" w:eastAsia="Times New Roman" w:hAnsi="Times New Roman" w:cs="Times New Roman"/>
+        </w:rPr>
+        <w:t>css</w:t>
+      </w:r>
+      <w:proofErr w:type="spellEnd"/>
+      <w:r>
+        <w:rPr>
+          <w:rFonts w:ascii="Times New Roman" w:eastAsia="Times New Roman" w:hAnsi="Times New Roman" w:cs="Times New Roman"/>
+        </w:rPr>
+        <w:t>+…</w:t>
       </w:r>
     </w:p>
     <w:p>
       <w:pPr>
         <w:ind w:left="1080"/>
         <w:rPr>
-          <w:rFonts w:ascii="Times New Roman" w:hAnsi="Times New Roman" w:eastAsia="Times New Roman" w:cs="Times New Roman"/>
+          <w:rFonts w:ascii="Times New Roman" w:eastAsia="Times New Roman" w:hAnsi="Times New Roman" w:cs="Times New Roman"/>
           <w:lang w:val="vi-VN"/>
         </w:rPr>
       </w:pPr>
       <w:r>
         <w:rPr>
-          <w:rFonts w:ascii="Times New Roman" w:hAnsi="Times New Roman" w:eastAsia="Times New Roman" w:cs="Times New Roman"/>
+          <w:rFonts w:ascii="Times New Roman" w:eastAsia="Times New Roman" w:hAnsi="Times New Roman" w:cs="Times New Roman"/>
         </w:rPr>
         <w:t>•</w:t>
       </w:r>
       <w:r>
         <w:rPr>
-          <w:rFonts w:ascii="Times New Roman" w:hAnsi="Times New Roman" w:eastAsia="Times New Roman" w:cs="Times New Roman"/>
+          <w:rFonts w:ascii="Times New Roman" w:eastAsia="Times New Roman" w:hAnsi="Times New Roman" w:cs="Times New Roman"/>
         </w:rPr>
         <w:tab/>
-      </w:r>
-      <w:r>
-        <w:rPr>
-          <w:rFonts w:ascii="Times New Roman" w:hAnsi="Times New Roman" w:eastAsia="Times New Roman" w:cs="Times New Roman"/>
-        </w:rPr>
-        <w:t>Database: SQLserver</w:t>
-      </w:r>
-      <w:r>
-        <w:rPr>
-          <w:rFonts w:ascii="Times New Roman" w:hAnsi="Times New Roman" w:eastAsia="Times New Roman" w:cs="Times New Roman"/>
-        </w:rPr>
-        <w:br w:type="textWrapping"/>
-      </w:r>
-      <w:r>
-        <w:rPr>
-          <w:rFonts w:ascii="Times New Roman" w:hAnsi="Times New Roman" w:eastAsia="Times New Roman" w:cs="Times New Roman"/>
-        </w:rPr>
-        <w:br w:type="textWrapping"/>
+        <w:t xml:space="preserve">Database: </w:t>
+      </w:r>
+      <w:proofErr w:type="spellStart"/>
+      <w:r>
+        <w:rPr>
+          <w:rFonts w:ascii="Times New Roman" w:eastAsia="Times New Roman" w:hAnsi="Times New Roman" w:cs="Times New Roman"/>
+        </w:rPr>
+        <w:t>SQLserver</w:t>
+      </w:r>
+      <w:proofErr w:type="spellEnd"/>
+      <w:r>
+        <w:rPr>
+          <w:rFonts w:ascii="Times New Roman" w:eastAsia="Times New Roman" w:hAnsi="Times New Roman" w:cs="Times New Roman"/>
+        </w:rPr>
+        <w:br/>
+      </w:r>
+      <w:r>
+        <w:rPr>
+          <w:rFonts w:ascii="Times New Roman" w:eastAsia="Times New Roman" w:hAnsi="Times New Roman" w:cs="Times New Roman"/>
+        </w:rPr>
+        <w:br/>
       </w:r>
     </w:p>
     <w:p>
@@ -1546,12 +1644,12 @@
         </w:numPr>
         <w:ind w:left="1080"/>
         <w:rPr>
-          <w:rFonts w:ascii="Times New Roman" w:hAnsi="Times New Roman" w:eastAsia="Times New Roman" w:cs="Times New Roman"/>
-        </w:rPr>
-      </w:pPr>
-      <w:r>
-        <w:rPr>
-          <w:rFonts w:ascii="Times New Roman" w:hAnsi="Times New Roman" w:eastAsia="Times New Roman" w:cs="Times New Roman"/>
+          <w:rFonts w:ascii="Times New Roman" w:eastAsia="Times New Roman" w:hAnsi="Times New Roman" w:cs="Times New Roman"/>
+        </w:rPr>
+      </w:pPr>
+      <w:r>
+        <w:rPr>
+          <w:rFonts w:ascii="Times New Roman" w:eastAsia="Times New Roman" w:hAnsi="Times New Roman" w:cs="Times New Roman"/>
           <w:b/>
           <w:sz w:val="24"/>
           <w:szCs w:val="24"/>
@@ -1563,44 +1661,54 @@
       <w:pPr>
         <w:ind w:left="1080"/>
         <w:rPr>
-          <w:rFonts w:ascii="Times New Roman" w:hAnsi="Times New Roman" w:eastAsia="Times New Roman" w:cs="Times New Roman"/>
-        </w:rPr>
-      </w:pPr>
-      <w:r>
-        <w:rPr>
-          <w:rFonts w:ascii="Times New Roman" w:hAnsi="Times New Roman" w:eastAsia="Times New Roman" w:cs="Times New Roman"/>
-        </w:rPr>
-        <w:t xml:space="preserve">Build a Wep-App for Admin </w:t>
-      </w:r>
-      <w:r>
-        <w:rPr>
-          <w:rFonts w:ascii="Times New Roman" w:hAnsi="Times New Roman" w:eastAsia="Times New Roman" w:cs="Times New Roman"/>
-        </w:rPr>
-        <w:br w:type="textWrapping"/>
-      </w:r>
-      <w:r>
-        <w:rPr>
-          <w:rFonts w:ascii="Times New Roman" w:hAnsi="Times New Roman" w:eastAsia="Times New Roman" w:cs="Times New Roman"/>
-        </w:rPr>
+          <w:rFonts w:ascii="Times New Roman" w:eastAsia="Times New Roman" w:hAnsi="Times New Roman" w:cs="Times New Roman"/>
+        </w:rPr>
+      </w:pPr>
+      <w:r>
+        <w:rPr>
+          <w:rFonts w:ascii="Times New Roman" w:eastAsia="Times New Roman" w:hAnsi="Times New Roman" w:cs="Times New Roman"/>
+        </w:rPr>
+        <w:lastRenderedPageBreak/>
+        <w:t xml:space="preserve">Build a </w:t>
+      </w:r>
+      <w:proofErr w:type="spellStart"/>
+      <w:r>
+        <w:rPr>
+          <w:rFonts w:ascii="Times New Roman" w:eastAsia="Times New Roman" w:hAnsi="Times New Roman" w:cs="Times New Roman"/>
+        </w:rPr>
+        <w:t>Wep</w:t>
+      </w:r>
+      <w:proofErr w:type="spellEnd"/>
+      <w:r>
+        <w:rPr>
+          <w:rFonts w:ascii="Times New Roman" w:eastAsia="Times New Roman" w:hAnsi="Times New Roman" w:cs="Times New Roman"/>
+        </w:rPr>
+        <w:t xml:space="preserve">-App for Admin </w:t>
+      </w:r>
+      <w:r>
+        <w:rPr>
+          <w:rFonts w:ascii="Times New Roman" w:eastAsia="Times New Roman" w:hAnsi="Times New Roman" w:cs="Times New Roman"/>
+        </w:rPr>
+        <w:br/>
         <w:t xml:space="preserve">Build a Mobile-App for customer </w:t>
       </w:r>
       <w:r>
         <w:rPr>
-          <w:rFonts w:ascii="Times New Roman" w:hAnsi="Times New Roman" w:eastAsia="Times New Roman" w:cs="Times New Roman"/>
-        </w:rPr>
-        <w:br w:type="textWrapping"/>
+          <w:rFonts w:ascii="Times New Roman" w:eastAsia="Times New Roman" w:hAnsi="Times New Roman" w:cs="Times New Roman"/>
+        </w:rPr>
+        <w:br/>
       </w:r>
     </w:p>
     <w:p>
       <w:pPr>
         <w:ind w:left="1080"/>
         <w:rPr>
-          <w:rFonts w:ascii="Times New Roman" w:hAnsi="Times New Roman" w:eastAsia="Times New Roman" w:cs="Times New Roman"/>
-        </w:rPr>
-      </w:pPr>
-      <w:r>
-        <w:rPr>
-          <w:rFonts w:ascii="Times New Roman" w:hAnsi="Times New Roman" w:eastAsia="Times New Roman" w:cs="Times New Roman"/>
+          <w:rFonts w:ascii="Times New Roman" w:eastAsia="Times New Roman" w:hAnsi="Times New Roman" w:cs="Times New Roman"/>
+        </w:rPr>
+      </w:pPr>
+      <w:r>
+        <w:rPr>
+          <w:rFonts w:ascii="Times New Roman" w:eastAsia="Times New Roman" w:hAnsi="Times New Roman" w:cs="Times New Roman"/>
         </w:rPr>
         <w:t>Each work group should have many students participating, but there will be one member responsible for the primary responsibility Notice: all students are required to understand the reference documents thoroughly and may need to explain them to the viva committee.</w:t>
       </w:r>
@@ -1609,7 +1717,7 @@
       <w:pPr>
         <w:ind w:left="1080"/>
         <w:rPr>
-          <w:rFonts w:ascii="Times New Roman" w:hAnsi="Times New Roman" w:eastAsia="Times New Roman" w:cs="Times New Roman"/>
+          <w:rFonts w:ascii="Times New Roman" w:eastAsia="Times New Roman" w:hAnsi="Times New Roman" w:cs="Times New Roman"/>
         </w:rPr>
       </w:pPr>
     </w:p>
@@ -1618,14 +1726,14 @@
         <w:shd w:val="clear" w:color="auto" w:fill="FFFFFF"/>
         <w:jc w:val="both"/>
         <w:rPr>
-          <w:rFonts w:ascii="Times New Roman" w:hAnsi="Times New Roman" w:eastAsia="Times New Roman" w:cs="Times New Roman"/>
-          <w:sz w:val="24"/>
-          <w:szCs w:val="24"/>
-        </w:rPr>
-      </w:pPr>
-      <w:r>
-        <w:rPr>
-          <w:rFonts w:ascii="Times New Roman" w:hAnsi="Times New Roman" w:eastAsia="Times New Roman" w:cs="Times New Roman"/>
+          <w:rFonts w:ascii="Times New Roman" w:eastAsia="Times New Roman" w:hAnsi="Times New Roman" w:cs="Times New Roman"/>
+          <w:sz w:val="24"/>
+          <w:szCs w:val="24"/>
+        </w:rPr>
+      </w:pPr>
+      <w:r>
+        <w:rPr>
+          <w:rFonts w:ascii="Times New Roman" w:eastAsia="Times New Roman" w:hAnsi="Times New Roman" w:cs="Times New Roman"/>
           <w:sz w:val="24"/>
           <w:szCs w:val="24"/>
         </w:rPr>
@@ -1640,14 +1748,14 @@
         </w:numPr>
         <w:spacing w:before="100" w:beforeAutospacing="1" w:after="100" w:afterAutospacing="1" w:line="240" w:lineRule="auto"/>
         <w:rPr>
-          <w:rFonts w:ascii="Times New Roman" w:hAnsi="Times New Roman" w:eastAsia="Times New Roman" w:cs="Times New Roman"/>
-          <w:sz w:val="24"/>
-          <w:szCs w:val="24"/>
-        </w:rPr>
-      </w:pPr>
-      <w:r>
-        <w:rPr>
-          <w:rFonts w:ascii="Times New Roman" w:hAnsi="Times New Roman" w:eastAsia="Times New Roman" w:cs="Times New Roman"/>
+          <w:rFonts w:ascii="Times New Roman" w:eastAsia="Times New Roman" w:hAnsi="Times New Roman" w:cs="Times New Roman"/>
+          <w:sz w:val="24"/>
+          <w:szCs w:val="24"/>
+        </w:rPr>
+      </w:pPr>
+      <w:r>
+        <w:rPr>
+          <w:rFonts w:ascii="Times New Roman" w:eastAsia="Times New Roman" w:hAnsi="Times New Roman" w:cs="Times New Roman"/>
           <w:sz w:val="24"/>
           <w:szCs w:val="24"/>
         </w:rPr>
@@ -1655,7 +1763,7 @@
       </w:r>
       <w:r>
         <w:rPr>
-          <w:rFonts w:ascii="Times New Roman" w:hAnsi="Times New Roman" w:eastAsia="Times New Roman" w:cs="Times New Roman"/>
+          <w:rFonts w:ascii="Times New Roman" w:eastAsia="Times New Roman" w:hAnsi="Times New Roman" w:cs="Times New Roman"/>
           <w:b/>
           <w:bCs/>
           <w:sz w:val="24"/>
@@ -1665,7 +1773,7 @@
       </w:r>
       <w:r>
         <w:rPr>
-          <w:rFonts w:ascii="Times New Roman" w:hAnsi="Times New Roman" w:eastAsia="Times New Roman" w:cs="Times New Roman"/>
+          <w:rFonts w:ascii="Times New Roman" w:eastAsia="Times New Roman" w:hAnsi="Times New Roman" w:cs="Times New Roman"/>
           <w:sz w:val="24"/>
           <w:szCs w:val="24"/>
         </w:rPr>
@@ -1680,14 +1788,14 @@
         </w:numPr>
         <w:spacing w:before="100" w:beforeAutospacing="1" w:after="100" w:afterAutospacing="1" w:line="240" w:lineRule="auto"/>
         <w:rPr>
-          <w:rFonts w:ascii="Times New Roman" w:hAnsi="Times New Roman" w:eastAsia="Times New Roman" w:cs="Times New Roman"/>
-          <w:sz w:val="24"/>
-          <w:szCs w:val="24"/>
-        </w:rPr>
-      </w:pPr>
-      <w:r>
-        <w:rPr>
-          <w:rFonts w:ascii="Times New Roman" w:hAnsi="Times New Roman" w:eastAsia="Times New Roman" w:cs="Times New Roman"/>
+          <w:rFonts w:ascii="Times New Roman" w:eastAsia="Times New Roman" w:hAnsi="Times New Roman" w:cs="Times New Roman"/>
+          <w:sz w:val="24"/>
+          <w:szCs w:val="24"/>
+        </w:rPr>
+      </w:pPr>
+      <w:r>
+        <w:rPr>
+          <w:rFonts w:ascii="Times New Roman" w:eastAsia="Times New Roman" w:hAnsi="Times New Roman" w:cs="Times New Roman"/>
           <w:sz w:val="24"/>
           <w:szCs w:val="24"/>
         </w:rPr>
@@ -1702,14 +1810,14 @@
         </w:numPr>
         <w:spacing w:before="100" w:beforeAutospacing="1" w:after="100" w:afterAutospacing="1" w:line="240" w:lineRule="auto"/>
         <w:rPr>
-          <w:rFonts w:ascii="Times New Roman" w:hAnsi="Times New Roman" w:eastAsia="Times New Roman" w:cs="Times New Roman"/>
-          <w:sz w:val="24"/>
-          <w:szCs w:val="24"/>
-        </w:rPr>
-      </w:pPr>
-      <w:r>
-        <w:rPr>
-          <w:rFonts w:ascii="Times New Roman" w:hAnsi="Times New Roman" w:eastAsia="Times New Roman" w:cs="Times New Roman"/>
+          <w:rFonts w:ascii="Times New Roman" w:eastAsia="Times New Roman" w:hAnsi="Times New Roman" w:cs="Times New Roman"/>
+          <w:sz w:val="24"/>
+          <w:szCs w:val="24"/>
+        </w:rPr>
+      </w:pPr>
+      <w:r>
+        <w:rPr>
+          <w:rFonts w:ascii="Times New Roman" w:eastAsia="Times New Roman" w:hAnsi="Times New Roman" w:cs="Times New Roman"/>
           <w:sz w:val="24"/>
           <w:szCs w:val="24"/>
         </w:rPr>
@@ -1717,17 +1825,39 @@
       </w:r>
       <w:r>
         <w:rPr>
-          <w:rFonts w:ascii="Times New Roman" w:hAnsi="Times New Roman" w:eastAsia="Times New Roman" w:cs="Times New Roman"/>
+          <w:rFonts w:ascii="Times New Roman" w:eastAsia="Times New Roman" w:hAnsi="Times New Roman" w:cs="Times New Roman"/>
           <w:b/>
           <w:bCs/>
           <w:sz w:val="24"/>
           <w:szCs w:val="24"/>
         </w:rPr>
-        <w:t>as Gold member</w:t>
-      </w:r>
-      <w:r>
-        <w:rPr>
-          <w:rFonts w:ascii="Times New Roman" w:hAnsi="Times New Roman" w:eastAsia="Times New Roman" w:cs="Times New Roman"/>
+        <w:t xml:space="preserve">as </w:t>
+      </w:r>
+      <w:proofErr w:type="gramStart"/>
+      <w:r>
+        <w:rPr>
+          <w:rFonts w:ascii="Times New Roman" w:eastAsia="Times New Roman" w:hAnsi="Times New Roman" w:cs="Times New Roman"/>
+          <w:b/>
+          <w:bCs/>
+          <w:sz w:val="24"/>
+          <w:szCs w:val="24"/>
+        </w:rPr>
+        <w:t>Gold</w:t>
+      </w:r>
+      <w:proofErr w:type="gramEnd"/>
+      <w:r>
+        <w:rPr>
+          <w:rFonts w:ascii="Times New Roman" w:eastAsia="Times New Roman" w:hAnsi="Times New Roman" w:cs="Times New Roman"/>
+          <w:b/>
+          <w:bCs/>
+          <w:sz w:val="24"/>
+          <w:szCs w:val="24"/>
+        </w:rPr>
+        <w:t xml:space="preserve"> member</w:t>
+      </w:r>
+      <w:r>
+        <w:rPr>
+          <w:rFonts w:ascii="Times New Roman" w:eastAsia="Times New Roman" w:hAnsi="Times New Roman" w:cs="Times New Roman"/>
           <w:sz w:val="24"/>
           <w:szCs w:val="24"/>
         </w:rPr>
@@ -1742,18 +1872,36 @@
         </w:numPr>
         <w:spacing w:before="100" w:beforeAutospacing="1" w:after="100" w:afterAutospacing="1" w:line="240" w:lineRule="auto"/>
         <w:rPr>
-          <w:rFonts w:ascii="Times New Roman" w:hAnsi="Times New Roman" w:eastAsia="Times New Roman" w:cs="Times New Roman"/>
-          <w:sz w:val="24"/>
-          <w:szCs w:val="24"/>
-        </w:rPr>
-      </w:pPr>
-      <w:r>
-        <w:rPr>
-          <w:rFonts w:ascii="Times New Roman" w:hAnsi="Times New Roman" w:eastAsia="Times New Roman" w:cs="Times New Roman"/>
-          <w:sz w:val="24"/>
-          <w:szCs w:val="24"/>
-        </w:rPr>
-        <w:t xml:space="preserve">A customer view his points, reward. </w:t>
+          <w:rFonts w:ascii="Times New Roman" w:eastAsia="Times New Roman" w:hAnsi="Times New Roman" w:cs="Times New Roman"/>
+          <w:sz w:val="24"/>
+          <w:szCs w:val="24"/>
+        </w:rPr>
+      </w:pPr>
+      <w:r>
+        <w:rPr>
+          <w:rFonts w:ascii="Times New Roman" w:eastAsia="Times New Roman" w:hAnsi="Times New Roman" w:cs="Times New Roman"/>
+          <w:sz w:val="24"/>
+          <w:szCs w:val="24"/>
+        </w:rPr>
+        <w:t xml:space="preserve">A customer </w:t>
+      </w:r>
+      <w:proofErr w:type="gramStart"/>
+      <w:r>
+        <w:rPr>
+          <w:rFonts w:ascii="Times New Roman" w:eastAsia="Times New Roman" w:hAnsi="Times New Roman" w:cs="Times New Roman"/>
+          <w:sz w:val="24"/>
+          <w:szCs w:val="24"/>
+        </w:rPr>
+        <w:t>view</w:t>
+      </w:r>
+      <w:proofErr w:type="gramEnd"/>
+      <w:r>
+        <w:rPr>
+          <w:rFonts w:ascii="Times New Roman" w:eastAsia="Times New Roman" w:hAnsi="Times New Roman" w:cs="Times New Roman"/>
+          <w:sz w:val="24"/>
+          <w:szCs w:val="24"/>
+        </w:rPr>
+        <w:t xml:space="preserve"> his points, reward. </w:t>
       </w:r>
     </w:p>
     <w:p>
@@ -1764,14 +1912,14 @@
         </w:numPr>
         <w:spacing w:before="100" w:beforeAutospacing="1" w:after="100" w:afterAutospacing="1" w:line="240" w:lineRule="auto"/>
         <w:rPr>
-          <w:rFonts w:ascii="Times New Roman" w:hAnsi="Times New Roman" w:eastAsia="Times New Roman" w:cs="Times New Roman"/>
-          <w:sz w:val="24"/>
-          <w:szCs w:val="24"/>
-        </w:rPr>
-      </w:pPr>
-      <w:r>
-        <w:rPr>
-          <w:rFonts w:ascii="Times New Roman" w:hAnsi="Times New Roman" w:eastAsia="Times New Roman" w:cs="Times New Roman"/>
+          <w:rFonts w:ascii="Times New Roman" w:eastAsia="Times New Roman" w:hAnsi="Times New Roman" w:cs="Times New Roman"/>
+          <w:sz w:val="24"/>
+          <w:szCs w:val="24"/>
+        </w:rPr>
+      </w:pPr>
+      <w:r>
+        <w:rPr>
+          <w:rFonts w:ascii="Times New Roman" w:eastAsia="Times New Roman" w:hAnsi="Times New Roman" w:cs="Times New Roman"/>
           <w:sz w:val="24"/>
           <w:szCs w:val="24"/>
         </w:rPr>
@@ -1780,7 +1928,7 @@
     </w:p>
     <w:p>
       <w:pPr>
-        <w:pStyle w:val="17"/>
+        <w:pStyle w:val="ListParagraph"/>
         <w:numPr>
           <w:ilvl w:val="0"/>
           <w:numId w:val="8"/>
@@ -1788,36 +1936,216 @@
         <w:spacing w:before="100" w:beforeAutospacing="1" w:after="100" w:afterAutospacing="1" w:line="240" w:lineRule="auto"/>
         <w:ind w:left="810" w:hanging="1440"/>
         <w:rPr>
-          <w:rFonts w:ascii="Times New Roman" w:hAnsi="Times New Roman" w:eastAsia="Times New Roman" w:cs="Times New Roman"/>
-          <w:sz w:val="24"/>
-          <w:szCs w:val="24"/>
-        </w:rPr>
-      </w:pPr>
-      <w:r>
-        <w:rPr>
-          <w:rFonts w:ascii="Times New Roman" w:hAnsi="Times New Roman" w:eastAsia="Times New Roman" w:cs="Times New Roman"/>
-          <w:sz w:val="24"/>
-          <w:szCs w:val="24"/>
-        </w:rPr>
-        <w:t>Deadline: Các nhóm nộp theo deadline trên lms và chấm vấn đáp với GV</w:t>
+          <w:rFonts w:ascii="Times New Roman" w:eastAsia="Times New Roman" w:hAnsi="Times New Roman" w:cs="Times New Roman"/>
+          <w:sz w:val="24"/>
+          <w:szCs w:val="24"/>
+        </w:rPr>
+      </w:pPr>
+      <w:r>
+        <w:rPr>
+          <w:rFonts w:ascii="Times New Roman" w:eastAsia="Times New Roman" w:hAnsi="Times New Roman" w:cs="Times New Roman"/>
+          <w:sz w:val="24"/>
+          <w:szCs w:val="24"/>
+        </w:rPr>
+        <w:t xml:space="preserve">Deadline: Các </w:t>
+      </w:r>
+      <w:proofErr w:type="spellStart"/>
+      <w:r>
+        <w:rPr>
+          <w:rFonts w:ascii="Times New Roman" w:eastAsia="Times New Roman" w:hAnsi="Times New Roman" w:cs="Times New Roman"/>
+          <w:sz w:val="24"/>
+          <w:szCs w:val="24"/>
+        </w:rPr>
+        <w:t>nhóm</w:t>
+      </w:r>
+      <w:proofErr w:type="spellEnd"/>
+      <w:r>
+        <w:rPr>
+          <w:rFonts w:ascii="Times New Roman" w:eastAsia="Times New Roman" w:hAnsi="Times New Roman" w:cs="Times New Roman"/>
+          <w:sz w:val="24"/>
+          <w:szCs w:val="24"/>
+        </w:rPr>
+        <w:t xml:space="preserve"> </w:t>
+      </w:r>
+      <w:proofErr w:type="spellStart"/>
+      <w:r>
+        <w:rPr>
+          <w:rFonts w:ascii="Times New Roman" w:eastAsia="Times New Roman" w:hAnsi="Times New Roman" w:cs="Times New Roman"/>
+          <w:sz w:val="24"/>
+          <w:szCs w:val="24"/>
+        </w:rPr>
+        <w:t>nộp</w:t>
+      </w:r>
+      <w:proofErr w:type="spellEnd"/>
+      <w:r>
+        <w:rPr>
+          <w:rFonts w:ascii="Times New Roman" w:eastAsia="Times New Roman" w:hAnsi="Times New Roman" w:cs="Times New Roman"/>
+          <w:sz w:val="24"/>
+          <w:szCs w:val="24"/>
+        </w:rPr>
+        <w:t xml:space="preserve"> </w:t>
+      </w:r>
+      <w:proofErr w:type="spellStart"/>
+      <w:r>
+        <w:rPr>
+          <w:rFonts w:ascii="Times New Roman" w:eastAsia="Times New Roman" w:hAnsi="Times New Roman" w:cs="Times New Roman"/>
+          <w:sz w:val="24"/>
+          <w:szCs w:val="24"/>
+        </w:rPr>
+        <w:t>theo</w:t>
+      </w:r>
+      <w:proofErr w:type="spellEnd"/>
+      <w:r>
+        <w:rPr>
+          <w:rFonts w:ascii="Times New Roman" w:eastAsia="Times New Roman" w:hAnsi="Times New Roman" w:cs="Times New Roman"/>
+          <w:sz w:val="24"/>
+          <w:szCs w:val="24"/>
+        </w:rPr>
+        <w:t xml:space="preserve"> deadline </w:t>
+      </w:r>
+      <w:proofErr w:type="spellStart"/>
+      <w:r>
+        <w:rPr>
+          <w:rFonts w:ascii="Times New Roman" w:eastAsia="Times New Roman" w:hAnsi="Times New Roman" w:cs="Times New Roman"/>
+          <w:sz w:val="24"/>
+          <w:szCs w:val="24"/>
+        </w:rPr>
+        <w:t>trên</w:t>
+      </w:r>
+      <w:proofErr w:type="spellEnd"/>
+      <w:r>
+        <w:rPr>
+          <w:rFonts w:ascii="Times New Roman" w:eastAsia="Times New Roman" w:hAnsi="Times New Roman" w:cs="Times New Roman"/>
+          <w:sz w:val="24"/>
+          <w:szCs w:val="24"/>
+        </w:rPr>
+        <w:t xml:space="preserve"> </w:t>
+      </w:r>
+      <w:proofErr w:type="spellStart"/>
+      <w:r>
+        <w:rPr>
+          <w:rFonts w:ascii="Times New Roman" w:eastAsia="Times New Roman" w:hAnsi="Times New Roman" w:cs="Times New Roman"/>
+          <w:sz w:val="24"/>
+          <w:szCs w:val="24"/>
+        </w:rPr>
+        <w:t>lms</w:t>
+      </w:r>
+      <w:proofErr w:type="spellEnd"/>
+      <w:r>
+        <w:rPr>
+          <w:rFonts w:ascii="Times New Roman" w:eastAsia="Times New Roman" w:hAnsi="Times New Roman" w:cs="Times New Roman"/>
+          <w:sz w:val="24"/>
+          <w:szCs w:val="24"/>
+        </w:rPr>
+        <w:t xml:space="preserve"> </w:t>
+      </w:r>
+      <w:proofErr w:type="spellStart"/>
+      <w:r>
+        <w:rPr>
+          <w:rFonts w:ascii="Times New Roman" w:eastAsia="Times New Roman" w:hAnsi="Times New Roman" w:cs="Times New Roman"/>
+          <w:sz w:val="24"/>
+          <w:szCs w:val="24"/>
+        </w:rPr>
+        <w:t>và</w:t>
+      </w:r>
+      <w:proofErr w:type="spellEnd"/>
+      <w:r>
+        <w:rPr>
+          <w:rFonts w:ascii="Times New Roman" w:eastAsia="Times New Roman" w:hAnsi="Times New Roman" w:cs="Times New Roman"/>
+          <w:sz w:val="24"/>
+          <w:szCs w:val="24"/>
+        </w:rPr>
+        <w:t xml:space="preserve"> </w:t>
+      </w:r>
+      <w:proofErr w:type="spellStart"/>
+      <w:r>
+        <w:rPr>
+          <w:rFonts w:ascii="Times New Roman" w:eastAsia="Times New Roman" w:hAnsi="Times New Roman" w:cs="Times New Roman"/>
+          <w:sz w:val="24"/>
+          <w:szCs w:val="24"/>
+        </w:rPr>
+        <w:t>chấm</w:t>
+      </w:r>
+      <w:proofErr w:type="spellEnd"/>
+      <w:r>
+        <w:rPr>
+          <w:rFonts w:ascii="Times New Roman" w:eastAsia="Times New Roman" w:hAnsi="Times New Roman" w:cs="Times New Roman"/>
+          <w:sz w:val="24"/>
+          <w:szCs w:val="24"/>
+        </w:rPr>
+        <w:t xml:space="preserve"> </w:t>
+      </w:r>
+      <w:proofErr w:type="spellStart"/>
+      <w:r>
+        <w:rPr>
+          <w:rFonts w:ascii="Times New Roman" w:eastAsia="Times New Roman" w:hAnsi="Times New Roman" w:cs="Times New Roman"/>
+          <w:sz w:val="24"/>
+          <w:szCs w:val="24"/>
+        </w:rPr>
+        <w:t>vấn</w:t>
+      </w:r>
+      <w:proofErr w:type="spellEnd"/>
+      <w:r>
+        <w:rPr>
+          <w:rFonts w:ascii="Times New Roman" w:eastAsia="Times New Roman" w:hAnsi="Times New Roman" w:cs="Times New Roman"/>
+          <w:sz w:val="24"/>
+          <w:szCs w:val="24"/>
+        </w:rPr>
+        <w:t xml:space="preserve"> </w:t>
+      </w:r>
+      <w:proofErr w:type="spellStart"/>
+      <w:r>
+        <w:rPr>
+          <w:rFonts w:ascii="Times New Roman" w:eastAsia="Times New Roman" w:hAnsi="Times New Roman" w:cs="Times New Roman"/>
+          <w:sz w:val="24"/>
+          <w:szCs w:val="24"/>
+        </w:rPr>
+        <w:t>đáp</w:t>
+      </w:r>
+      <w:proofErr w:type="spellEnd"/>
+      <w:r>
+        <w:rPr>
+          <w:rFonts w:ascii="Times New Roman" w:eastAsia="Times New Roman" w:hAnsi="Times New Roman" w:cs="Times New Roman"/>
+          <w:sz w:val="24"/>
+          <w:szCs w:val="24"/>
+        </w:rPr>
+        <w:t xml:space="preserve"> </w:t>
+      </w:r>
+      <w:proofErr w:type="spellStart"/>
+      <w:r>
+        <w:rPr>
+          <w:rFonts w:ascii="Times New Roman" w:eastAsia="Times New Roman" w:hAnsi="Times New Roman" w:cs="Times New Roman"/>
+          <w:sz w:val="24"/>
+          <w:szCs w:val="24"/>
+        </w:rPr>
+        <w:t>với</w:t>
+      </w:r>
+      <w:proofErr w:type="spellEnd"/>
+      <w:r>
+        <w:rPr>
+          <w:rFonts w:ascii="Times New Roman" w:eastAsia="Times New Roman" w:hAnsi="Times New Roman" w:cs="Times New Roman"/>
+          <w:sz w:val="24"/>
+          <w:szCs w:val="24"/>
+        </w:rPr>
+        <w:t xml:space="preserve"> GV</w:t>
       </w:r>
     </w:p>
     <w:p/>
     <w:sectPr>
-      <w:headerReference r:id="rId5" w:type="default"/>
-      <w:footerReference r:id="rId6" w:type="default"/>
+      <w:headerReference w:type="default" r:id="rId8"/>
+      <w:footerReference w:type="default" r:id="rId9"/>
       <w:pgSz w:w="12240" w:h="15840"/>
       <w:pgMar w:top="1440" w:right="1440" w:bottom="1440" w:left="1440" w:header="720" w:footer="720" w:gutter="0"/>
       <w:pgNumType w:start="1"/>
-      <w:cols w:space="720" w:num="1"/>
+      <w:cols w:space="720"/>
     </w:sectPr>
   </w:body>
 </w:document>
 </file>
 
 <file path=word/endnotes.xml><?xml version="1.0" encoding="utf-8"?>
-<w:endnotes xmlns:wpc="http://schemas.microsoft.com/office/word/2010/wordprocessingCanvas" xmlns:mc="http://schemas.openxmlformats.org/markup-compatibility/2006" xmlns:o="urn:schemas-microsoft-com:office:office" xmlns:r="http://schemas.openxmlformats.org/officeDocument/2006/relationships" xmlns:m="http://schemas.openxmlformats.org/officeDocument/2006/math" xmlns:v="urn:schemas-microsoft-com:vml" xmlns:wp14="http://schemas.microsoft.com/office/word/2010/wordprocessingDrawing" xmlns:wp="http://schemas.openxmlformats.org/drawingml/2006/wordprocessingDrawing" xmlns:w="http://schemas.openxmlformats.org/wordprocessingml/2006/main" xmlns:w14="http://schemas.microsoft.com/office/word/2010/wordml" xmlns:w15="http://schemas.microsoft.com/office/word/2012/wordml" xmlns:w10="urn:schemas-microsoft-com:office:word" xmlns:wpg="http://schemas.microsoft.com/office/word/2010/wordprocessingGroup" xmlns:wpi="http://schemas.microsoft.com/office/word/2010/wordprocessingInk" xmlns:wne="http://schemas.microsoft.com/office/word/2006/wordml" xmlns:wps="http://schemas.microsoft.com/office/word/2010/wordprocessingShape" xmlns:wpsCustomData="http://www.wps.cn/officeDocument/2013/wpsCustomData" mc:Ignorable="w14 w15 wp14">
-  <w:endnote w:type="separator" w:id="0">
+<w:endnotes xmlns:wpc="http://schemas.microsoft.com/office/word/2010/wordprocessingCanvas" xmlns:cx="http://schemas.microsoft.com/office/drawing/2014/chartex" xmlns:cx1="http://schemas.microsoft.com/office/drawing/2015/9/8/chartex" xmlns:cx2="http://schemas.microsoft.com/office/drawing/2015/10/21/chartex" xmlns:cx3="http://schemas.microsoft.com/office/drawing/2016/5/9/chartex" xmlns:cx4="http://schemas.microsoft.com/office/drawing/2016/5/10/chartex" xmlns:cx5="http://schemas.microsoft.com/office/drawing/2016/5/11/chartex" xmlns:cx6="http://schemas.microsoft.com/office/drawing/2016/5/12/chartex" xmlns:cx7="http://schemas.microsoft.com/office/drawing/2016/5/13/chartex" xmlns:cx8="http://schemas.microsoft.com/office/drawing/2016/5/14/chartex" xmlns:mc="http://schemas.openxmlformats.org/markup-compatibility/2006" xmlns:aink="http://schemas.microsoft.com/office/drawing/2016/ink" xmlns:am3d="http://schemas.microsoft.com/office/drawing/2017/model3d" xmlns:o="urn:schemas-microsoft-com:office:office" xmlns:oel="http://schemas.microsoft.com/office/2019/extlst" xmlns:r="http://schemas.openxmlformats.org/officeDocument/2006/relationships" xmlns:m="http://schemas.openxmlformats.org/officeDocument/2006/math" xmlns:v="urn:schemas-microsoft-com:vml" xmlns:wp14="http://schemas.microsoft.com/office/word/2010/wordprocessingDrawing" xmlns:wp="http://schemas.openxmlformats.org/drawingml/2006/wordprocessingDrawing" xmlns:w10="urn:schemas-microsoft-com:office:word" xmlns:w="http://schemas.openxmlformats.org/wordprocessingml/2006/main" xmlns:w14="http://schemas.microsoft.com/office/word/2010/wordml" xmlns:w15="http://schemas.microsoft.com/office/word/2012/wordml" xmlns:w16cex="http://schemas.microsoft.com/office/word/2018/wordml/cex" xmlns:w16cid="http://schemas.microsoft.com/office/word/2016/wordml/cid" xmlns:w16="http://schemas.microsoft.com/office/word/2018/wordml" xmlns:w16du="http://schemas.microsoft.com/office/word/2023/wordml/word16du" xmlns:w16sdtdh="http://schemas.microsoft.com/office/word/2020/wordml/sdtdatahash" xmlns:w16sdtfl="http://schemas.microsoft.com/office/word/2024/wordml/sdtformatlock" xmlns:w16se="http://schemas.microsoft.com/office/word/2015/wordml/symex" xmlns:wpg="http://schemas.microsoft.com/office/word/2010/wordprocessingGroup" xmlns:wpi="http://schemas.microsoft.com/office/word/2010/wordprocessingInk" xmlns:wne="http://schemas.microsoft.com/office/word/2006/wordml" xmlns:wps="http://schemas.microsoft.com/office/word/2010/wordprocessingShape" mc:Ignorable="w14 w15 w16se w16cid w16 w16cex w16sdtdh w16sdtfl w16du wp14">
+  <w:endnote w:type="separator" w:id="-1">
     <w:p>
       <w:pPr>
         <w:spacing w:line="240" w:lineRule="auto"/>
@@ -1827,7 +2155,7 @@
       </w:r>
     </w:p>
   </w:endnote>
-  <w:endnote w:type="continuationSeparator" w:id="1">
+  <w:endnote w:type="continuationSeparator" w:id="0">
     <w:p>
       <w:pPr>
         <w:spacing w:line="240" w:lineRule="auto"/>
@@ -1841,28 +2169,22 @@
 </file>
 
 <file path=word/footer1.xml><?xml version="1.0" encoding="utf-8"?>
-<w:ftr xmlns:wpc="http://schemas.microsoft.com/office/word/2010/wordprocessingCanvas" xmlns:mc="http://schemas.openxmlformats.org/markup-compatibility/2006" xmlns:o="urn:schemas-microsoft-com:office:office" xmlns:r="http://schemas.openxmlformats.org/officeDocument/2006/relationships" xmlns:m="http://schemas.openxmlformats.org/officeDocument/2006/math" xmlns:v="urn:schemas-microsoft-com:vml" xmlns:wp14="http://schemas.microsoft.com/office/word/2010/wordprocessingDrawing" xmlns:wp="http://schemas.openxmlformats.org/drawingml/2006/wordprocessingDrawing" xmlns:w10="urn:schemas-microsoft-com:office:word" xmlns:w="http://schemas.openxmlformats.org/wordprocessingml/2006/main" xmlns:w14="http://schemas.microsoft.com/office/word/2010/wordml" xmlns:w15="http://schemas.microsoft.com/office/word/2012/wordml" xmlns:wpg="http://schemas.microsoft.com/office/word/2010/wordprocessingGroup" xmlns:wpi="http://schemas.microsoft.com/office/word/2010/wordprocessingInk" xmlns:wne="http://schemas.microsoft.com/office/word/2006/wordml" xmlns:wps="http://schemas.microsoft.com/office/word/2010/wordprocessingShape" xmlns:wpsCustomData="http://www.wps.cn/officeDocument/2013/wpsCustomData" mc:Ignorable="w14 w15 wp14">
+<w:ftr xmlns:wpc="http://schemas.microsoft.com/office/word/2010/wordprocessingCanvas" xmlns:cx="http://schemas.microsoft.com/office/drawing/2014/chartex" xmlns:cx1="http://schemas.microsoft.com/office/drawing/2015/9/8/chartex" xmlns:cx2="http://schemas.microsoft.com/office/drawing/2015/10/21/chartex" xmlns:cx3="http://schemas.microsoft.com/office/drawing/2016/5/9/chartex" xmlns:cx4="http://schemas.microsoft.com/office/drawing/2016/5/10/chartex" xmlns:cx5="http://schemas.microsoft.com/office/drawing/2016/5/11/chartex" xmlns:cx6="http://schemas.microsoft.com/office/drawing/2016/5/12/chartex" xmlns:cx7="http://schemas.microsoft.com/office/drawing/2016/5/13/chartex" xmlns:cx8="http://schemas.microsoft.com/office/drawing/2016/5/14/chartex" xmlns:mc="http://schemas.openxmlformats.org/markup-compatibility/2006" xmlns:aink="http://schemas.microsoft.com/office/drawing/2016/ink" xmlns:am3d="http://schemas.microsoft.com/office/drawing/2017/model3d" xmlns:o="urn:schemas-microsoft-com:office:office" xmlns:oel="http://schemas.microsoft.com/office/2019/extlst" xmlns:r="http://schemas.openxmlformats.org/officeDocument/2006/relationships" xmlns:m="http://schemas.openxmlformats.org/officeDocument/2006/math" xmlns:v="urn:schemas-microsoft-com:vml" xmlns:wp14="http://schemas.microsoft.com/office/word/2010/wordprocessingDrawing" xmlns:wp="http://schemas.openxmlformats.org/drawingml/2006/wordprocessingDrawing" xmlns:w10="urn:schemas-microsoft-com:office:word" xmlns:w="http://schemas.openxmlformats.org/wordprocessingml/2006/main" xmlns:w14="http://schemas.microsoft.com/office/word/2010/wordml" xmlns:w15="http://schemas.microsoft.com/office/word/2012/wordml" xmlns:w16cex="http://schemas.microsoft.com/office/word/2018/wordml/cex" xmlns:w16cid="http://schemas.microsoft.com/office/word/2016/wordml/cid" xmlns:w16="http://schemas.microsoft.com/office/word/2018/wordml" xmlns:w16du="http://schemas.microsoft.com/office/word/2023/wordml/word16du" xmlns:w16sdtdh="http://schemas.microsoft.com/office/word/2020/wordml/sdtdatahash" xmlns:w16sdtfl="http://schemas.microsoft.com/office/word/2024/wordml/sdtformatlock" xmlns:w16se="http://schemas.microsoft.com/office/word/2015/wordml/symex" xmlns:wpg="http://schemas.microsoft.com/office/word/2010/wordprocessingGroup" xmlns:wpi="http://schemas.microsoft.com/office/word/2010/wordprocessingInk" xmlns:wne="http://schemas.microsoft.com/office/word/2006/wordml" xmlns:wps="http://schemas.microsoft.com/office/word/2010/wordprocessingShape" mc:Ignorable="w14 w15 w16se w16cid w16 w16cex w16sdtdh w16sdtfl w16du wp14">
   <w:p/>
 </w:ftr>
 </file>
 
 <file path=word/footnotes.xml><?xml version="1.0" encoding="utf-8"?>
-<w:footnotes xmlns:wpc="http://schemas.microsoft.com/office/word/2010/wordprocessingCanvas" xmlns:mc="http://schemas.openxmlformats.org/markup-compatibility/2006" xmlns:o="urn:schemas-microsoft-com:office:office" xmlns:r="http://schemas.openxmlformats.org/officeDocument/2006/relationships" xmlns:m="http://schemas.openxmlformats.org/officeDocument/2006/math" xmlns:v="urn:schemas-microsoft-com:vml" xmlns:wp14="http://schemas.microsoft.com/office/word/2010/wordprocessingDrawing" xmlns:wp="http://schemas.openxmlformats.org/drawingml/2006/wordprocessingDrawing" xmlns:w="http://schemas.openxmlformats.org/wordprocessingml/2006/main" xmlns:w14="http://schemas.microsoft.com/office/word/2010/wordml" xmlns:w15="http://schemas.microsoft.com/office/word/2012/wordml" xmlns:w10="urn:schemas-microsoft-com:office:word" xmlns:wpg="http://schemas.microsoft.com/office/word/2010/wordprocessingGroup" xmlns:wpi="http://schemas.microsoft.com/office/word/2010/wordprocessingInk" xmlns:wne="http://schemas.microsoft.com/office/word/2006/wordml" xmlns:wps="http://schemas.microsoft.com/office/word/2010/wordprocessingShape" xmlns:wpsCustomData="http://www.wps.cn/officeDocument/2013/wpsCustomData" mc:Ignorable="w14 w15 wp14">
-  <w:footnote w:type="separator" w:id="0">
+<w:footnotes xmlns:wpc="http://schemas.microsoft.com/office/word/2010/wordprocessingCanvas" xmlns:cx="http://schemas.microsoft.com/office/drawing/2014/chartex" xmlns:cx1="http://schemas.microsoft.com/office/drawing/2015/9/8/chartex" xmlns:cx2="http://schemas.microsoft.com/office/drawing/2015/10/21/chartex" xmlns:cx3="http://schemas.microsoft.com/office/drawing/2016/5/9/chartex" xmlns:cx4="http://schemas.microsoft.com/office/drawing/2016/5/10/chartex" xmlns:cx5="http://schemas.microsoft.com/office/drawing/2016/5/11/chartex" xmlns:cx6="http://schemas.microsoft.com/office/drawing/2016/5/12/chartex" xmlns:cx7="http://schemas.microsoft.com/office/drawing/2016/5/13/chartex" xmlns:cx8="http://schemas.microsoft.com/office/drawing/2016/5/14/chartex" xmlns:mc="http://schemas.openxmlformats.org/markup-compatibility/2006" xmlns:aink="http://schemas.microsoft.com/office/drawing/2016/ink" xmlns:am3d="http://schemas.microsoft.com/office/drawing/2017/model3d" xmlns:o="urn:schemas-microsoft-com:office:office" xmlns:oel="http://schemas.microsoft.com/office/2019/extlst" xmlns:r="http://schemas.openxmlformats.org/officeDocument/2006/relationships" xmlns:m="http://schemas.openxmlformats.org/officeDocument/2006/math" xmlns:v="urn:schemas-microsoft-com:vml" xmlns:wp14="http://schemas.microsoft.com/office/word/2010/wordprocessingDrawing" xmlns:wp="http://schemas.openxmlformats.org/drawingml/2006/wordprocessingDrawing" xmlns:w10="urn:schemas-microsoft-com:office:word" xmlns:w="http://schemas.openxmlformats.org/wordprocessingml/2006/main" xmlns:w14="http://schemas.microsoft.com/office/word/2010/wordml" xmlns:w15="http://schemas.microsoft.com/office/word/2012/wordml" xmlns:w16cex="http://schemas.microsoft.com/office/word/2018/wordml/cex" xmlns:w16cid="http://schemas.microsoft.com/office/word/2016/wordml/cid" xmlns:w16="http://schemas.microsoft.com/office/word/2018/wordml" xmlns:w16du="http://schemas.microsoft.com/office/word/2023/wordml/word16du" xmlns:w16sdtdh="http://schemas.microsoft.com/office/word/2020/wordml/sdtdatahash" xmlns:w16sdtfl="http://schemas.microsoft.com/office/word/2024/wordml/sdtformatlock" xmlns:w16se="http://schemas.microsoft.com/office/word/2015/wordml/symex" xmlns:wpg="http://schemas.microsoft.com/office/word/2010/wordprocessingGroup" xmlns:wpi="http://schemas.microsoft.com/office/word/2010/wordprocessingInk" xmlns:wne="http://schemas.microsoft.com/office/word/2006/wordml" xmlns:wps="http://schemas.microsoft.com/office/word/2010/wordprocessingShape" mc:Ignorable="w14 w15 w16se w16cid w16 w16cex w16sdtdh w16sdtfl w16du wp14">
+  <w:footnote w:type="separator" w:id="-1">
     <w:p>
-      <w:pPr>
-        <w:spacing w:line="276" w:lineRule="auto"/>
-      </w:pPr>
       <w:r>
         <w:separator/>
       </w:r>
     </w:p>
   </w:footnote>
-  <w:footnote w:type="continuationSeparator" w:id="1">
+  <w:footnote w:type="continuationSeparator" w:id="0">
     <w:p>
-      <w:pPr>
-        <w:spacing w:line="276" w:lineRule="auto"/>
-      </w:pPr>
       <w:r>
         <w:continuationSeparator/>
       </w:r>
@@ -1872,18 +2194,18 @@
 </file>
 
 <file path=word/header1.xml><?xml version="1.0" encoding="utf-8"?>
-<w:hdr xmlns:wpc="http://schemas.microsoft.com/office/word/2010/wordprocessingCanvas" xmlns:mc="http://schemas.openxmlformats.org/markup-compatibility/2006" xmlns:o="urn:schemas-microsoft-com:office:office" xmlns:r="http://schemas.openxmlformats.org/officeDocument/2006/relationships" xmlns:m="http://schemas.openxmlformats.org/officeDocument/2006/math" xmlns:v="urn:schemas-microsoft-com:vml" xmlns:wp14="http://schemas.microsoft.com/office/word/2010/wordprocessingDrawing" xmlns:wp="http://schemas.openxmlformats.org/drawingml/2006/wordprocessingDrawing" xmlns:w10="urn:schemas-microsoft-com:office:word" xmlns:w="http://schemas.openxmlformats.org/wordprocessingml/2006/main" xmlns:w14="http://schemas.microsoft.com/office/word/2010/wordml" xmlns:w15="http://schemas.microsoft.com/office/word/2012/wordml" xmlns:wpg="http://schemas.microsoft.com/office/word/2010/wordprocessingGroup" xmlns:wpi="http://schemas.microsoft.com/office/word/2010/wordprocessingInk" xmlns:wne="http://schemas.microsoft.com/office/word/2006/wordml" xmlns:wps="http://schemas.microsoft.com/office/word/2010/wordprocessingShape" xmlns:wpsCustomData="http://www.wps.cn/officeDocument/2013/wpsCustomData" mc:Ignorable="w14 w15 wp14">
+<w:hdr xmlns:wpc="http://schemas.microsoft.com/office/word/2010/wordprocessingCanvas" xmlns:cx="http://schemas.microsoft.com/office/drawing/2014/chartex" xmlns:cx1="http://schemas.microsoft.com/office/drawing/2015/9/8/chartex" xmlns:cx2="http://schemas.microsoft.com/office/drawing/2015/10/21/chartex" xmlns:cx3="http://schemas.microsoft.com/office/drawing/2016/5/9/chartex" xmlns:cx4="http://schemas.microsoft.com/office/drawing/2016/5/10/chartex" xmlns:cx5="http://schemas.microsoft.com/office/drawing/2016/5/11/chartex" xmlns:cx6="http://schemas.microsoft.com/office/drawing/2016/5/12/chartex" xmlns:cx7="http://schemas.microsoft.com/office/drawing/2016/5/13/chartex" xmlns:cx8="http://schemas.microsoft.com/office/drawing/2016/5/14/chartex" xmlns:mc="http://schemas.openxmlformats.org/markup-compatibility/2006" xmlns:aink="http://schemas.microsoft.com/office/drawing/2016/ink" xmlns:am3d="http://schemas.microsoft.com/office/drawing/2017/model3d" xmlns:o="urn:schemas-microsoft-com:office:office" xmlns:oel="http://schemas.microsoft.com/office/2019/extlst" xmlns:r="http://schemas.openxmlformats.org/officeDocument/2006/relationships" xmlns:m="http://schemas.openxmlformats.org/officeDocument/2006/math" xmlns:v="urn:schemas-microsoft-com:vml" xmlns:wp14="http://schemas.microsoft.com/office/word/2010/wordprocessingDrawing" xmlns:wp="http://schemas.openxmlformats.org/drawingml/2006/wordprocessingDrawing" xmlns:w10="urn:schemas-microsoft-com:office:word" xmlns:w="http://schemas.openxmlformats.org/wordprocessingml/2006/main" xmlns:w14="http://schemas.microsoft.com/office/word/2010/wordml" xmlns:w15="http://schemas.microsoft.com/office/word/2012/wordml" xmlns:w16cex="http://schemas.microsoft.com/office/word/2018/wordml/cex" xmlns:w16cid="http://schemas.microsoft.com/office/word/2016/wordml/cid" xmlns:w16="http://schemas.microsoft.com/office/word/2018/wordml" xmlns:w16du="http://schemas.microsoft.com/office/word/2023/wordml/word16du" xmlns:w16sdtdh="http://schemas.microsoft.com/office/word/2020/wordml/sdtdatahash" xmlns:w16sdtfl="http://schemas.microsoft.com/office/word/2024/wordml/sdtformatlock" xmlns:w16se="http://schemas.microsoft.com/office/word/2015/wordml/symex" xmlns:wpg="http://schemas.microsoft.com/office/word/2010/wordprocessingGroup" xmlns:wpi="http://schemas.microsoft.com/office/word/2010/wordprocessingInk" xmlns:wne="http://schemas.microsoft.com/office/word/2006/wordml" xmlns:wps="http://schemas.microsoft.com/office/word/2010/wordprocessingShape" mc:Ignorable="w14 w15 w16se w16cid w16 w16cex w16sdtdh w16sdtfl w16du wp14">
   <w:p/>
 </w:hdr>
 </file>
 
 <file path=word/numbering.xml><?xml version="1.0" encoding="utf-8"?>
-<w:numbering xmlns:wpc="http://schemas.microsoft.com/office/word/2010/wordprocessingCanvas" xmlns:mc="http://schemas.openxmlformats.org/markup-compatibility/2006" xmlns:o="urn:schemas-microsoft-com:office:office" xmlns:r="http://schemas.openxmlformats.org/officeDocument/2006/relationships" xmlns:m="http://schemas.openxmlformats.org/officeDocument/2006/math" xmlns:v="urn:schemas-microsoft-com:vml" xmlns:wp14="http://schemas.microsoft.com/office/word/2010/wordprocessingDrawing" xmlns:wp="http://schemas.openxmlformats.org/drawingml/2006/wordprocessingDrawing" xmlns:w10="urn:schemas-microsoft-com:office:word" xmlns:w="http://schemas.openxmlformats.org/wordprocessingml/2006/main" xmlns:w14="http://schemas.microsoft.com/office/word/2010/wordml" xmlns:wpg="http://schemas.microsoft.com/office/word/2010/wordprocessingGroup" xmlns:wpi="http://schemas.microsoft.com/office/word/2010/wordprocessingInk" xmlns:wne="http://schemas.microsoft.com/office/word/2006/wordml" xmlns:wps="http://schemas.microsoft.com/office/word/2010/wordprocessingShape" xmlns:wpsCustomData="http://www.wps.cn/officeDocument/2013/wpsCustomData" mc:Ignorable="w14 wp14">
-  <w:abstractNum w:abstractNumId="0">
+<w:numbering xmlns:wpc="http://schemas.microsoft.com/office/word/2010/wordprocessingCanvas" xmlns:cx="http://schemas.microsoft.com/office/drawing/2014/chartex" xmlns:cx1="http://schemas.microsoft.com/office/drawing/2015/9/8/chartex" xmlns:cx2="http://schemas.microsoft.com/office/drawing/2015/10/21/chartex" xmlns:cx3="http://schemas.microsoft.com/office/drawing/2016/5/9/chartex" xmlns:cx4="http://schemas.microsoft.com/office/drawing/2016/5/10/chartex" xmlns:cx5="http://schemas.microsoft.com/office/drawing/2016/5/11/chartex" xmlns:cx6="http://schemas.microsoft.com/office/drawing/2016/5/12/chartex" xmlns:cx7="http://schemas.microsoft.com/office/drawing/2016/5/13/chartex" xmlns:cx8="http://schemas.microsoft.com/office/drawing/2016/5/14/chartex" xmlns:mc="http://schemas.openxmlformats.org/markup-compatibility/2006" xmlns:aink="http://schemas.microsoft.com/office/drawing/2016/ink" xmlns:am3d="http://schemas.microsoft.com/office/drawing/2017/model3d" xmlns:o="urn:schemas-microsoft-com:office:office" xmlns:oel="http://schemas.microsoft.com/office/2019/extlst" xmlns:r="http://schemas.openxmlformats.org/officeDocument/2006/relationships" xmlns:m="http://schemas.openxmlformats.org/officeDocument/2006/math" xmlns:v="urn:schemas-microsoft-com:vml" xmlns:wp14="http://schemas.microsoft.com/office/word/2010/wordprocessingDrawing" xmlns:wp="http://schemas.openxmlformats.org/drawingml/2006/wordprocessingDrawing" xmlns:w10="urn:schemas-microsoft-com:office:word" xmlns:w="http://schemas.openxmlformats.org/wordprocessingml/2006/main" xmlns:w14="http://schemas.microsoft.com/office/word/2010/wordml" xmlns:w15="http://schemas.microsoft.com/office/word/2012/wordml" xmlns:w16cex="http://schemas.microsoft.com/office/word/2018/wordml/cex" xmlns:w16cid="http://schemas.microsoft.com/office/word/2016/wordml/cid" xmlns:w16="http://schemas.microsoft.com/office/word/2018/wordml" xmlns:w16du="http://schemas.microsoft.com/office/word/2023/wordml/word16du" xmlns:w16sdtdh="http://schemas.microsoft.com/office/word/2020/wordml/sdtdatahash" xmlns:w16sdtfl="http://schemas.microsoft.com/office/word/2024/wordml/sdtformatlock" xmlns:w16se="http://schemas.microsoft.com/office/word/2015/wordml/symex" xmlns:wpg="http://schemas.microsoft.com/office/word/2010/wordprocessingGroup" xmlns:wpi="http://schemas.microsoft.com/office/word/2010/wordprocessingInk" xmlns:wne="http://schemas.microsoft.com/office/word/2006/wordml" xmlns:wps="http://schemas.microsoft.com/office/word/2010/wordprocessingShape" mc:Ignorable="w14 w15 w16se w16cid w16 w16cex w16sdtdh w16sdtfl w16du wp14">
+  <w:abstractNum w:abstractNumId="0" w15:restartNumberingAfterBreak="0">
     <w:nsid w:val="22E72DC2"/>
     <w:multiLevelType w:val="multilevel"/>
     <w:tmpl w:val="22E72DC2"/>
-    <w:lvl w:ilvl="0" w:tentative="0">
+    <w:lvl w:ilvl="0">
       <w:start w:val="1"/>
       <w:numFmt w:val="bullet"/>
       <w:lvlText w:val="●"/>
@@ -1892,13 +2214,13 @@
         <w:ind w:left="720" w:hanging="360"/>
       </w:pPr>
       <w:rPr>
-        <w:rFonts w:ascii="Verdana" w:hAnsi="Verdana" w:eastAsia="Verdana" w:cs="Verdana"/>
+        <w:rFonts w:ascii="Verdana" w:eastAsia="Verdana" w:hAnsi="Verdana" w:cs="Verdana"/>
         <w:sz w:val="18"/>
         <w:szCs w:val="18"/>
         <w:u w:val="none"/>
       </w:rPr>
     </w:lvl>
-    <w:lvl w:ilvl="1" w:tentative="0">
+    <w:lvl w:ilvl="1">
       <w:start w:val="1"/>
       <w:numFmt w:val="bullet"/>
       <w:lvlText w:val="○"/>
@@ -1910,7 +2232,7 @@
         <w:u w:val="none"/>
       </w:rPr>
     </w:lvl>
-    <w:lvl w:ilvl="2" w:tentative="0">
+    <w:lvl w:ilvl="2">
       <w:start w:val="1"/>
       <w:numFmt w:val="bullet"/>
       <w:lvlText w:val="■"/>
@@ -1922,7 +2244,7 @@
         <w:u w:val="none"/>
       </w:rPr>
     </w:lvl>
-    <w:lvl w:ilvl="3" w:tentative="0">
+    <w:lvl w:ilvl="3">
       <w:start w:val="1"/>
       <w:numFmt w:val="bullet"/>
       <w:lvlText w:val="●"/>
@@ -1934,7 +2256,7 @@
         <w:u w:val="none"/>
       </w:rPr>
     </w:lvl>
-    <w:lvl w:ilvl="4" w:tentative="0">
+    <w:lvl w:ilvl="4">
       <w:start w:val="1"/>
       <w:numFmt w:val="bullet"/>
       <w:lvlText w:val="○"/>
@@ -1946,7 +2268,7 @@
         <w:u w:val="none"/>
       </w:rPr>
     </w:lvl>
-    <w:lvl w:ilvl="5" w:tentative="0">
+    <w:lvl w:ilvl="5">
       <w:start w:val="1"/>
       <w:numFmt w:val="bullet"/>
       <w:lvlText w:val="■"/>
@@ -1958,7 +2280,7 @@
         <w:u w:val="none"/>
       </w:rPr>
     </w:lvl>
-    <w:lvl w:ilvl="6" w:tentative="0">
+    <w:lvl w:ilvl="6">
       <w:start w:val="1"/>
       <w:numFmt w:val="bullet"/>
       <w:lvlText w:val="●"/>
@@ -1970,7 +2292,7 @@
         <w:u w:val="none"/>
       </w:rPr>
     </w:lvl>
-    <w:lvl w:ilvl="7" w:tentative="0">
+    <w:lvl w:ilvl="7">
       <w:start w:val="1"/>
       <w:numFmt w:val="bullet"/>
       <w:lvlText w:val="○"/>
@@ -1982,7 +2304,7 @@
         <w:u w:val="none"/>
       </w:rPr>
     </w:lvl>
-    <w:lvl w:ilvl="8" w:tentative="0">
+    <w:lvl w:ilvl="8">
       <w:start w:val="1"/>
       <w:numFmt w:val="bullet"/>
       <w:lvlText w:val="■"/>
@@ -1995,11 +2317,11 @@
       </w:rPr>
     </w:lvl>
   </w:abstractNum>
-  <w:abstractNum w:abstractNumId="1">
+  <w:abstractNum w:abstractNumId="1" w15:restartNumberingAfterBreak="0">
     <w:nsid w:val="29BF41A1"/>
     <w:multiLevelType w:val="multilevel"/>
     <w:tmpl w:val="29BF41A1"/>
-    <w:lvl w:ilvl="0" w:tentative="0">
+    <w:lvl w:ilvl="0">
       <w:start w:val="1"/>
       <w:numFmt w:val="bullet"/>
       <w:lvlText w:val=""/>
@@ -2011,11 +2333,11 @@
         <w:ind w:left="720" w:hanging="360"/>
       </w:pPr>
       <w:rPr>
-        <w:rFonts w:hint="default" w:ascii="Symbol" w:hAnsi="Symbol"/>
+        <w:rFonts w:ascii="Symbol" w:hAnsi="Symbol" w:hint="default"/>
         <w:sz w:val="20"/>
       </w:rPr>
     </w:lvl>
-    <w:lvl w:ilvl="1" w:tentative="0">
+    <w:lvl w:ilvl="1">
       <w:start w:val="1"/>
       <w:numFmt w:val="decimal"/>
       <w:lvlText w:val="%2."/>
@@ -2027,7 +2349,7 @@
         <w:ind w:left="1440" w:hanging="360"/>
       </w:pPr>
     </w:lvl>
-    <w:lvl w:ilvl="2" w:tentative="0">
+    <w:lvl w:ilvl="2">
       <w:start w:val="1"/>
       <w:numFmt w:val="bullet"/>
       <w:lvlText w:val=""/>
@@ -2039,11 +2361,11 @@
         <w:ind w:left="2160" w:hanging="360"/>
       </w:pPr>
       <w:rPr>
-        <w:rFonts w:hint="default" w:ascii="Wingdings" w:hAnsi="Wingdings"/>
+        <w:rFonts w:ascii="Wingdings" w:hAnsi="Wingdings" w:hint="default"/>
         <w:sz w:val="20"/>
       </w:rPr>
     </w:lvl>
-    <w:lvl w:ilvl="3" w:tentative="0">
+    <w:lvl w:ilvl="3">
       <w:start w:val="1"/>
       <w:numFmt w:val="bullet"/>
       <w:lvlText w:val=""/>
@@ -2055,11 +2377,11 @@
         <w:ind w:left="2880" w:hanging="360"/>
       </w:pPr>
       <w:rPr>
-        <w:rFonts w:hint="default" w:ascii="Wingdings" w:hAnsi="Wingdings"/>
+        <w:rFonts w:ascii="Wingdings" w:hAnsi="Wingdings" w:hint="default"/>
         <w:sz w:val="20"/>
       </w:rPr>
     </w:lvl>
-    <w:lvl w:ilvl="4" w:tentative="0">
+    <w:lvl w:ilvl="4">
       <w:start w:val="1"/>
       <w:numFmt w:val="bullet"/>
       <w:lvlText w:val=""/>
@@ -2071,11 +2393,11 @@
         <w:ind w:left="3600" w:hanging="360"/>
       </w:pPr>
       <w:rPr>
-        <w:rFonts w:hint="default" w:ascii="Wingdings" w:hAnsi="Wingdings"/>
+        <w:rFonts w:ascii="Wingdings" w:hAnsi="Wingdings" w:hint="default"/>
         <w:sz w:val="20"/>
       </w:rPr>
     </w:lvl>
-    <w:lvl w:ilvl="5" w:tentative="0">
+    <w:lvl w:ilvl="5">
       <w:start w:val="1"/>
       <w:numFmt w:val="bullet"/>
       <w:lvlText w:val=""/>
@@ -2087,11 +2409,11 @@
         <w:ind w:left="4320" w:hanging="360"/>
       </w:pPr>
       <w:rPr>
-        <w:rFonts w:hint="default" w:ascii="Wingdings" w:hAnsi="Wingdings"/>
+        <w:rFonts w:ascii="Wingdings" w:hAnsi="Wingdings" w:hint="default"/>
         <w:sz w:val="20"/>
       </w:rPr>
     </w:lvl>
-    <w:lvl w:ilvl="6" w:tentative="0">
+    <w:lvl w:ilvl="6">
       <w:start w:val="1"/>
       <w:numFmt w:val="bullet"/>
       <w:lvlText w:val=""/>
@@ -2103,11 +2425,11 @@
         <w:ind w:left="5040" w:hanging="360"/>
       </w:pPr>
       <w:rPr>
-        <w:rFonts w:hint="default" w:ascii="Wingdings" w:hAnsi="Wingdings"/>
+        <w:rFonts w:ascii="Wingdings" w:hAnsi="Wingdings" w:hint="default"/>
         <w:sz w:val="20"/>
       </w:rPr>
     </w:lvl>
-    <w:lvl w:ilvl="7" w:tentative="0">
+    <w:lvl w:ilvl="7">
       <w:start w:val="1"/>
       <w:numFmt w:val="bullet"/>
       <w:lvlText w:val=""/>
@@ -2119,11 +2441,11 @@
         <w:ind w:left="5760" w:hanging="360"/>
       </w:pPr>
       <w:rPr>
-        <w:rFonts w:hint="default" w:ascii="Wingdings" w:hAnsi="Wingdings"/>
+        <w:rFonts w:ascii="Wingdings" w:hAnsi="Wingdings" w:hint="default"/>
         <w:sz w:val="20"/>
       </w:rPr>
     </w:lvl>
-    <w:lvl w:ilvl="8" w:tentative="0">
+    <w:lvl w:ilvl="8">
       <w:start w:val="1"/>
       <w:numFmt w:val="bullet"/>
       <w:lvlText w:val=""/>
@@ -2135,16 +2457,16 @@
         <w:ind w:left="6480" w:hanging="360"/>
       </w:pPr>
       <w:rPr>
-        <w:rFonts w:hint="default" w:ascii="Wingdings" w:hAnsi="Wingdings"/>
+        <w:rFonts w:ascii="Wingdings" w:hAnsi="Wingdings" w:hint="default"/>
         <w:sz w:val="20"/>
       </w:rPr>
     </w:lvl>
   </w:abstractNum>
-  <w:abstractNum w:abstractNumId="2">
+  <w:abstractNum w:abstractNumId="2" w15:restartNumberingAfterBreak="0">
     <w:nsid w:val="3CA8302C"/>
     <w:multiLevelType w:val="multilevel"/>
     <w:tmpl w:val="3CA8302C"/>
-    <w:lvl w:ilvl="0" w:tentative="0">
+    <w:lvl w:ilvl="0">
       <w:start w:val="1"/>
       <w:numFmt w:val="lowerLetter"/>
       <w:lvlText w:val="%1."/>
@@ -2153,13 +2475,13 @@
         <w:ind w:left="720" w:hanging="360"/>
       </w:pPr>
       <w:rPr>
-        <w:rFonts w:ascii="Arial" w:hAnsi="Arial" w:eastAsia="Arial" w:cs="Arial"/>
+        <w:rFonts w:ascii="Arial" w:eastAsia="Arial" w:hAnsi="Arial" w:cs="Arial"/>
         <w:sz w:val="18"/>
         <w:szCs w:val="18"/>
         <w:u w:val="none"/>
       </w:rPr>
     </w:lvl>
-    <w:lvl w:ilvl="1" w:tentative="0">
+    <w:lvl w:ilvl="1">
       <w:start w:val="1"/>
       <w:numFmt w:val="lowerLetter"/>
       <w:lvlText w:val="%2."/>
@@ -2171,7 +2493,7 @@
         <w:u w:val="none"/>
       </w:rPr>
     </w:lvl>
-    <w:lvl w:ilvl="2" w:tentative="0">
+    <w:lvl w:ilvl="2">
       <w:start w:val="1"/>
       <w:numFmt w:val="lowerRoman"/>
       <w:lvlText w:val="%3."/>
@@ -2183,7 +2505,7 @@
         <w:u w:val="none"/>
       </w:rPr>
     </w:lvl>
-    <w:lvl w:ilvl="3" w:tentative="0">
+    <w:lvl w:ilvl="3">
       <w:start w:val="1"/>
       <w:numFmt w:val="decimal"/>
       <w:lvlText w:val="%4."/>
@@ -2195,7 +2517,7 @@
         <w:u w:val="none"/>
       </w:rPr>
     </w:lvl>
-    <w:lvl w:ilvl="4" w:tentative="0">
+    <w:lvl w:ilvl="4">
       <w:start w:val="1"/>
       <w:numFmt w:val="lowerLetter"/>
       <w:lvlText w:val="%5."/>
@@ -2207,7 +2529,7 @@
         <w:u w:val="none"/>
       </w:rPr>
     </w:lvl>
-    <w:lvl w:ilvl="5" w:tentative="0">
+    <w:lvl w:ilvl="5">
       <w:start w:val="1"/>
       <w:numFmt w:val="lowerRoman"/>
       <w:lvlText w:val="%6."/>
@@ -2219,7 +2541,7 @@
         <w:u w:val="none"/>
       </w:rPr>
     </w:lvl>
-    <w:lvl w:ilvl="6" w:tentative="0">
+    <w:lvl w:ilvl="6">
       <w:start w:val="1"/>
       <w:numFmt w:val="decimal"/>
       <w:lvlText w:val="%7."/>
@@ -2231,7 +2553,7 @@
         <w:u w:val="none"/>
       </w:rPr>
     </w:lvl>
-    <w:lvl w:ilvl="7" w:tentative="0">
+    <w:lvl w:ilvl="7">
       <w:start w:val="1"/>
       <w:numFmt w:val="lowerLetter"/>
       <w:lvlText w:val="%8."/>
@@ -2243,7 +2565,7 @@
         <w:u w:val="none"/>
       </w:rPr>
     </w:lvl>
-    <w:lvl w:ilvl="8" w:tentative="0">
+    <w:lvl w:ilvl="8">
       <w:start w:val="1"/>
       <w:numFmt w:val="lowerRoman"/>
       <w:lvlText w:val="%9."/>
@@ -2256,11 +2578,11 @@
       </w:rPr>
     </w:lvl>
   </w:abstractNum>
-  <w:abstractNum w:abstractNumId="3">
+  <w:abstractNum w:abstractNumId="3" w15:restartNumberingAfterBreak="0">
     <w:nsid w:val="505B02CE"/>
     <w:multiLevelType w:val="multilevel"/>
     <w:tmpl w:val="505B02CE"/>
-    <w:lvl w:ilvl="0" w:tentative="0">
+    <w:lvl w:ilvl="0">
       <w:start w:val="2"/>
       <w:numFmt w:val="lowerLetter"/>
       <w:lvlText w:val="%1."/>
@@ -2269,13 +2591,13 @@
         <w:ind w:left="720" w:hanging="360"/>
       </w:pPr>
       <w:rPr>
-        <w:rFonts w:ascii="Arial" w:hAnsi="Arial" w:eastAsia="Arial" w:cs="Arial"/>
+        <w:rFonts w:ascii="Arial" w:eastAsia="Arial" w:hAnsi="Arial" w:cs="Arial"/>
         <w:sz w:val="18"/>
         <w:szCs w:val="18"/>
         <w:u w:val="none"/>
       </w:rPr>
     </w:lvl>
-    <w:lvl w:ilvl="1" w:tentative="0">
+    <w:lvl w:ilvl="1">
       <w:start w:val="1"/>
       <w:numFmt w:val="lowerLetter"/>
       <w:lvlText w:val="%2."/>
@@ -2287,7 +2609,7 @@
         <w:u w:val="none"/>
       </w:rPr>
     </w:lvl>
-    <w:lvl w:ilvl="2" w:tentative="0">
+    <w:lvl w:ilvl="2">
       <w:start w:val="1"/>
       <w:numFmt w:val="lowerRoman"/>
       <w:lvlText w:val="%3."/>
@@ -2299,7 +2621,7 @@
         <w:u w:val="none"/>
       </w:rPr>
     </w:lvl>
-    <w:lvl w:ilvl="3" w:tentative="0">
+    <w:lvl w:ilvl="3">
       <w:start w:val="1"/>
       <w:numFmt w:val="decimal"/>
       <w:lvlText w:val="%4."/>
@@ -2311,7 +2633,7 @@
         <w:u w:val="none"/>
       </w:rPr>
     </w:lvl>
-    <w:lvl w:ilvl="4" w:tentative="0">
+    <w:lvl w:ilvl="4">
       <w:start w:val="1"/>
       <w:numFmt w:val="lowerLetter"/>
       <w:lvlText w:val="%5."/>
@@ -2323,7 +2645,7 @@
         <w:u w:val="none"/>
       </w:rPr>
     </w:lvl>
-    <w:lvl w:ilvl="5" w:tentative="0">
+    <w:lvl w:ilvl="5">
       <w:start w:val="1"/>
       <w:numFmt w:val="lowerRoman"/>
       <w:lvlText w:val="%6."/>
@@ -2335,7 +2657,7 @@
         <w:u w:val="none"/>
       </w:rPr>
     </w:lvl>
-    <w:lvl w:ilvl="6" w:tentative="0">
+    <w:lvl w:ilvl="6">
       <w:start w:val="1"/>
       <w:numFmt w:val="decimal"/>
       <w:lvlText w:val="%7."/>
@@ -2347,7 +2669,7 @@
         <w:u w:val="none"/>
       </w:rPr>
     </w:lvl>
-    <w:lvl w:ilvl="7" w:tentative="0">
+    <w:lvl w:ilvl="7">
       <w:start w:val="1"/>
       <w:numFmt w:val="lowerLetter"/>
       <w:lvlText w:val="%8."/>
@@ -2359,7 +2681,7 @@
         <w:u w:val="none"/>
       </w:rPr>
     </w:lvl>
-    <w:lvl w:ilvl="8" w:tentative="0">
+    <w:lvl w:ilvl="8">
       <w:start w:val="1"/>
       <w:numFmt w:val="lowerRoman"/>
       <w:lvlText w:val="%9."/>
@@ -2372,11 +2694,11 @@
       </w:rPr>
     </w:lvl>
   </w:abstractNum>
-  <w:abstractNum w:abstractNumId="4">
+  <w:abstractNum w:abstractNumId="4" w15:restartNumberingAfterBreak="0">
     <w:nsid w:val="5F4F2804"/>
     <w:multiLevelType w:val="multilevel"/>
     <w:tmpl w:val="5F4F2804"/>
-    <w:lvl w:ilvl="0" w:tentative="0">
+    <w:lvl w:ilvl="0">
       <w:start w:val="1"/>
       <w:numFmt w:val="bullet"/>
       <w:lvlText w:val="●"/>
@@ -2385,13 +2707,13 @@
         <w:ind w:left="720" w:hanging="360"/>
       </w:pPr>
       <w:rPr>
-        <w:rFonts w:ascii="Verdana" w:hAnsi="Verdana" w:eastAsia="Verdana" w:cs="Verdana"/>
+        <w:rFonts w:ascii="Verdana" w:eastAsia="Verdana" w:hAnsi="Verdana" w:cs="Verdana"/>
         <w:sz w:val="18"/>
         <w:szCs w:val="18"/>
         <w:u w:val="none"/>
       </w:rPr>
     </w:lvl>
-    <w:lvl w:ilvl="1" w:tentative="0">
+    <w:lvl w:ilvl="1">
       <w:start w:val="1"/>
       <w:numFmt w:val="bullet"/>
       <w:lvlText w:val="○"/>
@@ -2403,7 +2725,7 @@
         <w:u w:val="none"/>
       </w:rPr>
     </w:lvl>
-    <w:lvl w:ilvl="2" w:tentative="0">
+    <w:lvl w:ilvl="2">
       <w:start w:val="1"/>
       <w:numFmt w:val="bullet"/>
       <w:lvlText w:val="■"/>
@@ -2415,7 +2737,7 @@
         <w:u w:val="none"/>
       </w:rPr>
     </w:lvl>
-    <w:lvl w:ilvl="3" w:tentative="0">
+    <w:lvl w:ilvl="3">
       <w:start w:val="1"/>
       <w:numFmt w:val="bullet"/>
       <w:lvlText w:val="●"/>
@@ -2427,7 +2749,7 @@
         <w:u w:val="none"/>
       </w:rPr>
     </w:lvl>
-    <w:lvl w:ilvl="4" w:tentative="0">
+    <w:lvl w:ilvl="4">
       <w:start w:val="1"/>
       <w:numFmt w:val="bullet"/>
       <w:lvlText w:val="○"/>
@@ -2439,7 +2761,7 @@
         <w:u w:val="none"/>
       </w:rPr>
     </w:lvl>
-    <w:lvl w:ilvl="5" w:tentative="0">
+    <w:lvl w:ilvl="5">
       <w:start w:val="1"/>
       <w:numFmt w:val="bullet"/>
       <w:lvlText w:val="■"/>
@@ -2451,7 +2773,7 @@
         <w:u w:val="none"/>
       </w:rPr>
     </w:lvl>
-    <w:lvl w:ilvl="6" w:tentative="0">
+    <w:lvl w:ilvl="6">
       <w:start w:val="1"/>
       <w:numFmt w:val="bullet"/>
       <w:lvlText w:val="●"/>
@@ -2463,7 +2785,7 @@
         <w:u w:val="none"/>
       </w:rPr>
     </w:lvl>
-    <w:lvl w:ilvl="7" w:tentative="0">
+    <w:lvl w:ilvl="7">
       <w:start w:val="1"/>
       <w:numFmt w:val="bullet"/>
       <w:lvlText w:val="○"/>
@@ -2475,7 +2797,7 @@
         <w:u w:val="none"/>
       </w:rPr>
     </w:lvl>
-    <w:lvl w:ilvl="8" w:tentative="0">
+    <w:lvl w:ilvl="8">
       <w:start w:val="1"/>
       <w:numFmt w:val="bullet"/>
       <w:lvlText w:val="■"/>
@@ -2488,11 +2810,11 @@
       </w:rPr>
     </w:lvl>
   </w:abstractNum>
-  <w:abstractNum w:abstractNumId="5">
+  <w:abstractNum w:abstractNumId="5" w15:restartNumberingAfterBreak="0">
     <w:nsid w:val="63E5172F"/>
     <w:multiLevelType w:val="multilevel"/>
     <w:tmpl w:val="63E5172F"/>
-    <w:lvl w:ilvl="0" w:tentative="0">
+    <w:lvl w:ilvl="0">
       <w:start w:val="1"/>
       <w:numFmt w:val="bullet"/>
       <w:lvlText w:val=""/>
@@ -2501,10 +2823,10 @@
         <w:ind w:left="1800" w:hanging="360"/>
       </w:pPr>
       <w:rPr>
-        <w:rFonts w:hint="default" w:ascii="Symbol" w:hAnsi="Symbol"/>
-      </w:rPr>
-    </w:lvl>
-    <w:lvl w:ilvl="1" w:tentative="0">
+        <w:rFonts w:ascii="Symbol" w:hAnsi="Symbol" w:hint="default"/>
+      </w:rPr>
+    </w:lvl>
+    <w:lvl w:ilvl="1">
       <w:start w:val="1"/>
       <w:numFmt w:val="bullet"/>
       <w:lvlText w:val="o"/>
@@ -2513,10 +2835,10 @@
         <w:ind w:left="2520" w:hanging="360"/>
       </w:pPr>
       <w:rPr>
-        <w:rFonts w:hint="default" w:ascii="Courier New" w:hAnsi="Courier New" w:cs="Courier New"/>
-      </w:rPr>
-    </w:lvl>
-    <w:lvl w:ilvl="2" w:tentative="0">
+        <w:rFonts w:ascii="Courier New" w:hAnsi="Courier New" w:cs="Courier New" w:hint="default"/>
+      </w:rPr>
+    </w:lvl>
+    <w:lvl w:ilvl="2">
       <w:start w:val="1"/>
       <w:numFmt w:val="bullet"/>
       <w:lvlText w:val=""/>
@@ -2525,10 +2847,10 @@
         <w:ind w:left="3240" w:hanging="360"/>
       </w:pPr>
       <w:rPr>
-        <w:rFonts w:hint="default" w:ascii="Wingdings" w:hAnsi="Wingdings"/>
-      </w:rPr>
-    </w:lvl>
-    <w:lvl w:ilvl="3" w:tentative="0">
+        <w:rFonts w:ascii="Wingdings" w:hAnsi="Wingdings" w:hint="default"/>
+      </w:rPr>
+    </w:lvl>
+    <w:lvl w:ilvl="3">
       <w:start w:val="1"/>
       <w:numFmt w:val="bullet"/>
       <w:lvlText w:val=""/>
@@ -2537,10 +2859,10 @@
         <w:ind w:left="3960" w:hanging="360"/>
       </w:pPr>
       <w:rPr>
-        <w:rFonts w:hint="default" w:ascii="Symbol" w:hAnsi="Symbol"/>
-      </w:rPr>
-    </w:lvl>
-    <w:lvl w:ilvl="4" w:tentative="0">
+        <w:rFonts w:ascii="Symbol" w:hAnsi="Symbol" w:hint="default"/>
+      </w:rPr>
+    </w:lvl>
+    <w:lvl w:ilvl="4">
       <w:start w:val="1"/>
       <w:numFmt w:val="bullet"/>
       <w:lvlText w:val="o"/>
@@ -2549,10 +2871,10 @@
         <w:ind w:left="4680" w:hanging="360"/>
       </w:pPr>
       <w:rPr>
-        <w:rFonts w:hint="default" w:ascii="Courier New" w:hAnsi="Courier New" w:cs="Courier New"/>
-      </w:rPr>
-    </w:lvl>
-    <w:lvl w:ilvl="5" w:tentative="0">
+        <w:rFonts w:ascii="Courier New" w:hAnsi="Courier New" w:cs="Courier New" w:hint="default"/>
+      </w:rPr>
+    </w:lvl>
+    <w:lvl w:ilvl="5">
       <w:start w:val="1"/>
       <w:numFmt w:val="bullet"/>
       <w:lvlText w:val=""/>
@@ -2561,10 +2883,10 @@
         <w:ind w:left="5400" w:hanging="360"/>
       </w:pPr>
       <w:rPr>
-        <w:rFonts w:hint="default" w:ascii="Wingdings" w:hAnsi="Wingdings"/>
-      </w:rPr>
-    </w:lvl>
-    <w:lvl w:ilvl="6" w:tentative="0">
+        <w:rFonts w:ascii="Wingdings" w:hAnsi="Wingdings" w:hint="default"/>
+      </w:rPr>
+    </w:lvl>
+    <w:lvl w:ilvl="6">
       <w:start w:val="1"/>
       <w:numFmt w:val="bullet"/>
       <w:lvlText w:val=""/>
@@ -2573,10 +2895,10 @@
         <w:ind w:left="6120" w:hanging="360"/>
       </w:pPr>
       <w:rPr>
-        <w:rFonts w:hint="default" w:ascii="Symbol" w:hAnsi="Symbol"/>
-      </w:rPr>
-    </w:lvl>
-    <w:lvl w:ilvl="7" w:tentative="0">
+        <w:rFonts w:ascii="Symbol" w:hAnsi="Symbol" w:hint="default"/>
+      </w:rPr>
+    </w:lvl>
+    <w:lvl w:ilvl="7">
       <w:start w:val="1"/>
       <w:numFmt w:val="bullet"/>
       <w:lvlText w:val="o"/>
@@ -2585,10 +2907,10 @@
         <w:ind w:left="6840" w:hanging="360"/>
       </w:pPr>
       <w:rPr>
-        <w:rFonts w:hint="default" w:ascii="Courier New" w:hAnsi="Courier New" w:cs="Courier New"/>
-      </w:rPr>
-    </w:lvl>
-    <w:lvl w:ilvl="8" w:tentative="0">
+        <w:rFonts w:ascii="Courier New" w:hAnsi="Courier New" w:cs="Courier New" w:hint="default"/>
+      </w:rPr>
+    </w:lvl>
+    <w:lvl w:ilvl="8">
       <w:start w:val="1"/>
       <w:numFmt w:val="bullet"/>
       <w:lvlText w:val=""/>
@@ -2597,15 +2919,15 @@
         <w:ind w:left="7560" w:hanging="360"/>
       </w:pPr>
       <w:rPr>
-        <w:rFonts w:hint="default" w:ascii="Wingdings" w:hAnsi="Wingdings"/>
+        <w:rFonts w:ascii="Wingdings" w:hAnsi="Wingdings" w:hint="default"/>
       </w:rPr>
     </w:lvl>
   </w:abstractNum>
-  <w:abstractNum w:abstractNumId="6">
+  <w:abstractNum w:abstractNumId="6" w15:restartNumberingAfterBreak="0">
     <w:nsid w:val="651F2184"/>
     <w:multiLevelType w:val="multilevel"/>
     <w:tmpl w:val="651F2184"/>
-    <w:lvl w:ilvl="0" w:tentative="0">
+    <w:lvl w:ilvl="0">
       <w:start w:val="2"/>
       <w:numFmt w:val="lowerLetter"/>
       <w:lvlText w:val="%1."/>
@@ -2614,13 +2936,13 @@
         <w:ind w:left="720" w:hanging="360"/>
       </w:pPr>
       <w:rPr>
-        <w:rFonts w:ascii="Arial" w:hAnsi="Arial" w:eastAsia="Arial" w:cs="Arial"/>
+        <w:rFonts w:ascii="Arial" w:eastAsia="Arial" w:hAnsi="Arial" w:cs="Arial"/>
         <w:sz w:val="18"/>
         <w:szCs w:val="18"/>
         <w:u w:val="none"/>
       </w:rPr>
     </w:lvl>
-    <w:lvl w:ilvl="1" w:tentative="0">
+    <w:lvl w:ilvl="1">
       <w:start w:val="1"/>
       <w:numFmt w:val="lowerLetter"/>
       <w:lvlText w:val="%2."/>
@@ -2632,7 +2954,7 @@
         <w:u w:val="none"/>
       </w:rPr>
     </w:lvl>
-    <w:lvl w:ilvl="2" w:tentative="0">
+    <w:lvl w:ilvl="2">
       <w:start w:val="1"/>
       <w:numFmt w:val="lowerRoman"/>
       <w:lvlText w:val="%3."/>
@@ -2644,7 +2966,7 @@
         <w:u w:val="none"/>
       </w:rPr>
     </w:lvl>
-    <w:lvl w:ilvl="3" w:tentative="0">
+    <w:lvl w:ilvl="3">
       <w:start w:val="1"/>
       <w:numFmt w:val="decimal"/>
       <w:lvlText w:val="%4."/>
@@ -2656,7 +2978,7 @@
         <w:u w:val="none"/>
       </w:rPr>
     </w:lvl>
-    <w:lvl w:ilvl="4" w:tentative="0">
+    <w:lvl w:ilvl="4">
       <w:start w:val="1"/>
       <w:numFmt w:val="lowerLetter"/>
       <w:lvlText w:val="%5."/>
@@ -2668,7 +2990,7 @@
         <w:u w:val="none"/>
       </w:rPr>
     </w:lvl>
-    <w:lvl w:ilvl="5" w:tentative="0">
+    <w:lvl w:ilvl="5">
       <w:start w:val="1"/>
       <w:numFmt w:val="lowerRoman"/>
       <w:lvlText w:val="%6."/>
@@ -2680,7 +3002,7 @@
         <w:u w:val="none"/>
       </w:rPr>
     </w:lvl>
-    <w:lvl w:ilvl="6" w:tentative="0">
+    <w:lvl w:ilvl="6">
       <w:start w:val="1"/>
       <w:numFmt w:val="decimal"/>
       <w:lvlText w:val="%7."/>
@@ -2692,7 +3014,7 @@
         <w:u w:val="none"/>
       </w:rPr>
     </w:lvl>
-    <w:lvl w:ilvl="7" w:tentative="0">
+    <w:lvl w:ilvl="7">
       <w:start w:val="1"/>
       <w:numFmt w:val="lowerLetter"/>
       <w:lvlText w:val="%8."/>
@@ -2704,7 +3026,7 @@
         <w:u w:val="none"/>
       </w:rPr>
     </w:lvl>
-    <w:lvl w:ilvl="8" w:tentative="0">
+    <w:lvl w:ilvl="8">
       <w:start w:val="1"/>
       <w:numFmt w:val="lowerRoman"/>
       <w:lvlText w:val="%9."/>
@@ -2717,11 +3039,11 @@
       </w:rPr>
     </w:lvl>
   </w:abstractNum>
-  <w:abstractNum w:abstractNumId="7">
+  <w:abstractNum w:abstractNumId="7" w15:restartNumberingAfterBreak="0">
     <w:nsid w:val="6DA47261"/>
     <w:multiLevelType w:val="multilevel"/>
     <w:tmpl w:val="6DA47261"/>
-    <w:lvl w:ilvl="0" w:tentative="0">
+    <w:lvl w:ilvl="0">
       <w:start w:val="1"/>
       <w:numFmt w:val="bullet"/>
       <w:lvlText w:val="●"/>
@@ -2730,13 +3052,13 @@
         <w:ind w:left="720" w:hanging="360"/>
       </w:pPr>
       <w:rPr>
-        <w:rFonts w:ascii="Verdana" w:hAnsi="Verdana" w:eastAsia="Verdana" w:cs="Verdana"/>
+        <w:rFonts w:ascii="Verdana" w:eastAsia="Verdana" w:hAnsi="Verdana" w:cs="Verdana"/>
         <w:sz w:val="18"/>
         <w:szCs w:val="18"/>
         <w:u w:val="none"/>
       </w:rPr>
     </w:lvl>
-    <w:lvl w:ilvl="1" w:tentative="0">
+    <w:lvl w:ilvl="1">
       <w:start w:val="1"/>
       <w:numFmt w:val="bullet"/>
       <w:lvlText w:val="○"/>
@@ -2748,7 +3070,7 @@
         <w:u w:val="none"/>
       </w:rPr>
     </w:lvl>
-    <w:lvl w:ilvl="2" w:tentative="0">
+    <w:lvl w:ilvl="2">
       <w:start w:val="1"/>
       <w:numFmt w:val="bullet"/>
       <w:lvlText w:val="■"/>
@@ -2760,7 +3082,7 @@
         <w:u w:val="none"/>
       </w:rPr>
     </w:lvl>
-    <w:lvl w:ilvl="3" w:tentative="0">
+    <w:lvl w:ilvl="3">
       <w:start w:val="1"/>
       <w:numFmt w:val="bullet"/>
       <w:lvlText w:val="●"/>
@@ -2772,7 +3094,7 @@
         <w:u w:val="none"/>
       </w:rPr>
     </w:lvl>
-    <w:lvl w:ilvl="4" w:tentative="0">
+    <w:lvl w:ilvl="4">
       <w:start w:val="1"/>
       <w:numFmt w:val="bullet"/>
       <w:lvlText w:val="○"/>
@@ -2784,7 +3106,7 @@
         <w:u w:val="none"/>
       </w:rPr>
     </w:lvl>
-    <w:lvl w:ilvl="5" w:tentative="0">
+    <w:lvl w:ilvl="5">
       <w:start w:val="1"/>
       <w:numFmt w:val="bullet"/>
       <w:lvlText w:val="■"/>
@@ -2796,7 +3118,7 @@
         <w:u w:val="none"/>
       </w:rPr>
     </w:lvl>
-    <w:lvl w:ilvl="6" w:tentative="0">
+    <w:lvl w:ilvl="6">
       <w:start w:val="1"/>
       <w:numFmt w:val="bullet"/>
       <w:lvlText w:val="●"/>
@@ -2808,7 +3130,7 @@
         <w:u w:val="none"/>
       </w:rPr>
     </w:lvl>
-    <w:lvl w:ilvl="7" w:tentative="0">
+    <w:lvl w:ilvl="7">
       <w:start w:val="1"/>
       <w:numFmt w:val="bullet"/>
       <w:lvlText w:val="○"/>
@@ -2820,7 +3142,7 @@
         <w:u w:val="none"/>
       </w:rPr>
     </w:lvl>
-    <w:lvl w:ilvl="8" w:tentative="0">
+    <w:lvl w:ilvl="8">
       <w:start w:val="1"/>
       <w:numFmt w:val="bullet"/>
       <w:lvlText w:val="■"/>
@@ -2833,314 +3155,440 @@
       </w:rPr>
     </w:lvl>
   </w:abstractNum>
-  <w:num w:numId="1">
+  <w:num w:numId="1" w16cid:durableId="1245337925">
     <w:abstractNumId w:val="0"/>
   </w:num>
-  <w:num w:numId="2">
+  <w:num w:numId="2" w16cid:durableId="2127651530">
     <w:abstractNumId w:val="6"/>
   </w:num>
-  <w:num w:numId="3">
+  <w:num w:numId="3" w16cid:durableId="1604075413">
     <w:abstractNumId w:val="4"/>
   </w:num>
-  <w:num w:numId="4">
+  <w:num w:numId="4" w16cid:durableId="1163086927">
     <w:abstractNumId w:val="7"/>
   </w:num>
-  <w:num w:numId="5">
+  <w:num w:numId="5" w16cid:durableId="1500535464">
     <w:abstractNumId w:val="2"/>
   </w:num>
-  <w:num w:numId="6">
+  <w:num w:numId="6" w16cid:durableId="926966307">
     <w:abstractNumId w:val="3"/>
   </w:num>
-  <w:num w:numId="7">
+  <w:num w:numId="7" w16cid:durableId="1866480906">
     <w:abstractNumId w:val="1"/>
   </w:num>
-  <w:num w:numId="8">
+  <w:num w:numId="8" w16cid:durableId="609707598">
     <w:abstractNumId w:val="5"/>
   </w:num>
 </w:numbering>
 </file>
 
 <file path=word/styles.xml><?xml version="1.0" encoding="utf-8"?>
-<w:styles xmlns:mc="http://schemas.openxmlformats.org/markup-compatibility/2006" xmlns:o="urn:schemas-microsoft-com:office:office" xmlns:r="http://schemas.openxmlformats.org/officeDocument/2006/relationships" xmlns:m="http://schemas.openxmlformats.org/officeDocument/2006/math" xmlns:v="urn:schemas-microsoft-com:vml" xmlns:w="http://schemas.openxmlformats.org/wordprocessingml/2006/main" xmlns:w14="http://schemas.microsoft.com/office/word/2010/wordml" xmlns:w10="urn:schemas-microsoft-com:office:word" xmlns:sl="http://schemas.openxmlformats.org/schemaLibrary/2006/main" xmlns:wpsCustomData="http://www.wps.cn/officeDocument/2013/wpsCustomData" mc:Ignorable="w14">
+<w:styles xmlns:mc="http://schemas.openxmlformats.org/markup-compatibility/2006" xmlns:r="http://schemas.openxmlformats.org/officeDocument/2006/relationships" xmlns:w="http://schemas.openxmlformats.org/wordprocessingml/2006/main" xmlns:w14="http://schemas.microsoft.com/office/word/2010/wordml" xmlns:w15="http://schemas.microsoft.com/office/word/2012/wordml" xmlns:w16cex="http://schemas.microsoft.com/office/word/2018/wordml/cex" xmlns:w16cid="http://schemas.microsoft.com/office/word/2016/wordml/cid" xmlns:w16="http://schemas.microsoft.com/office/word/2018/wordml" xmlns:w16du="http://schemas.microsoft.com/office/word/2023/wordml/word16du" xmlns:w16sdtdh="http://schemas.microsoft.com/office/word/2020/wordml/sdtdatahash" xmlns:w16sdtfl="http://schemas.microsoft.com/office/word/2024/wordml/sdtformatlock" xmlns:w16se="http://schemas.microsoft.com/office/word/2015/wordml/symex" mc:Ignorable="w14 w15 w16se w16cid w16 w16cex w16sdtdh w16sdtfl w16du">
   <w:docDefaults>
     <w:rPrDefault>
       <w:rPr>
-        <w:rFonts w:ascii="Arial" w:hAnsi="Arial" w:eastAsia="Arial" w:cs="Arial"/>
+        <w:rFonts w:ascii="Arial" w:eastAsia="Arial" w:hAnsi="Arial" w:cs="Arial"/>
+        <w:lang w:val="en-US" w:eastAsia="en-US" w:bidi="ar-SA"/>
       </w:rPr>
     </w:rPrDefault>
     <w:pPrDefault/>
   </w:docDefaults>
-  <w:latentStyles w:count="260" w:defQFormat="0" w:defUnhideWhenUsed="1" w:defSemiHidden="1" w:defUIPriority="99" w:defLockedState="0">
-    <w:lsdException w:qFormat="1" w:unhideWhenUsed="0" w:uiPriority="0" w:semiHidden="0" w:name="Normal"/>
-    <w:lsdException w:qFormat="1" w:unhideWhenUsed="0" w:uiPriority="9" w:semiHidden="0" w:name="heading 1"/>
-    <w:lsdException w:qFormat="1" w:uiPriority="9" w:name="heading 2"/>
-    <w:lsdException w:qFormat="1" w:uiPriority="9" w:name="heading 3"/>
-    <w:lsdException w:qFormat="1" w:uiPriority="9" w:name="heading 4"/>
-    <w:lsdException w:qFormat="1" w:uiPriority="9" w:name="heading 5"/>
-    <w:lsdException w:qFormat="1" w:uiPriority="9" w:name="heading 6"/>
-    <w:lsdException w:qFormat="1" w:uiPriority="9" w:name="heading 7"/>
-    <w:lsdException w:qFormat="1" w:uiPriority="9" w:name="heading 8"/>
-    <w:lsdException w:qFormat="1" w:uiPriority="9" w:name="heading 9"/>
-    <w:lsdException w:uiPriority="99" w:name="index 1"/>
-    <w:lsdException w:uiPriority="99" w:name="index 2"/>
-    <w:lsdException w:uiPriority="99" w:name="index 3"/>
-    <w:lsdException w:uiPriority="99" w:name="index 4"/>
-    <w:lsdException w:uiPriority="99" w:name="index 5"/>
-    <w:lsdException w:uiPriority="99" w:name="index 6"/>
-    <w:lsdException w:uiPriority="99" w:name="index 7"/>
-    <w:lsdException w:uiPriority="99" w:name="index 8"/>
-    <w:lsdException w:uiPriority="99" w:name="index 9"/>
-    <w:lsdException w:uiPriority="39" w:name="toc 1"/>
-    <w:lsdException w:uiPriority="39" w:name="toc 2"/>
-    <w:lsdException w:uiPriority="39" w:name="toc 3"/>
-    <w:lsdException w:uiPriority="39" w:name="toc 4"/>
-    <w:lsdException w:uiPriority="39" w:name="toc 5"/>
-    <w:lsdException w:uiPriority="39" w:name="toc 6"/>
-    <w:lsdException w:uiPriority="39" w:name="toc 7"/>
-    <w:lsdException w:uiPriority="39" w:name="toc 8"/>
-    <w:lsdException w:uiPriority="39" w:name="toc 9"/>
-    <w:lsdException w:uiPriority="99" w:name="Normal Indent"/>
-    <w:lsdException w:uiPriority="99" w:name="footnote text"/>
-    <w:lsdException w:uiPriority="99" w:name="annotation text"/>
-    <w:lsdException w:uiPriority="99" w:name="header"/>
-    <w:lsdException w:uiPriority="99" w:name="footer"/>
-    <w:lsdException w:uiPriority="99" w:name="index heading"/>
-    <w:lsdException w:qFormat="1" w:uiPriority="35" w:name="caption"/>
-    <w:lsdException w:uiPriority="99" w:name="table of figures"/>
-    <w:lsdException w:uiPriority="99" w:name="envelope address"/>
-    <w:lsdException w:uiPriority="99" w:name="envelope return"/>
-    <w:lsdException w:uiPriority="99" w:name="footnote reference"/>
-    <w:lsdException w:uiPriority="99" w:name="annotation reference"/>
-    <w:lsdException w:uiPriority="99" w:name="line number"/>
-    <w:lsdException w:uiPriority="99" w:name="page number"/>
-    <w:lsdException w:uiPriority="99" w:name="endnote reference"/>
-    <w:lsdException w:uiPriority="99" w:name="endnote text"/>
-    <w:lsdException w:uiPriority="99" w:name="table of authorities"/>
-    <w:lsdException w:uiPriority="99" w:name="macro"/>
-    <w:lsdException w:uiPriority="99" w:name="toa heading"/>
-    <w:lsdException w:uiPriority="99" w:name="List"/>
-    <w:lsdException w:uiPriority="99" w:name="List Bullet"/>
-    <w:lsdException w:uiPriority="99" w:name="List Number"/>
-    <w:lsdException w:uiPriority="99" w:name="List 2"/>
-    <w:lsdException w:uiPriority="99" w:name="List 3"/>
-    <w:lsdException w:uiPriority="99" w:name="List 4"/>
-    <w:lsdException w:uiPriority="99" w:name="List 5"/>
-    <w:lsdException w:uiPriority="99" w:name="List Bullet 2"/>
-    <w:lsdException w:uiPriority="99" w:name="List Bullet 3"/>
-    <w:lsdException w:uiPriority="99" w:name="List Bullet 4"/>
-    <w:lsdException w:uiPriority="99" w:name="List Bullet 5"/>
-    <w:lsdException w:uiPriority="99" w:name="List Number 2"/>
-    <w:lsdException w:uiPriority="99" w:name="List Number 3"/>
-    <w:lsdException w:uiPriority="99" w:name="List Number 4"/>
-    <w:lsdException w:uiPriority="99" w:name="List Number 5"/>
-    <w:lsdException w:qFormat="1" w:unhideWhenUsed="0" w:uiPriority="10" w:semiHidden="0" w:name="Title"/>
-    <w:lsdException w:uiPriority="99" w:name="Closing"/>
-    <w:lsdException w:uiPriority="99" w:name="Signature"/>
-    <w:lsdException w:qFormat="1" w:uiPriority="1" w:name="Default Paragraph Font"/>
-    <w:lsdException w:uiPriority="99" w:name="Body Text"/>
-    <w:lsdException w:uiPriority="99" w:name="Body Text Indent"/>
-    <w:lsdException w:uiPriority="99" w:name="List Continue"/>
-    <w:lsdException w:uiPriority="99" w:name="List Continue 2"/>
-    <w:lsdException w:uiPriority="99" w:name="List Continue 3"/>
-    <w:lsdException w:uiPriority="99" w:name="List Continue 4"/>
-    <w:lsdException w:uiPriority="99" w:name="List Continue 5"/>
-    <w:lsdException w:uiPriority="99" w:name="Message Header"/>
-    <w:lsdException w:qFormat="1" w:unhideWhenUsed="0" w:uiPriority="11" w:semiHidden="0" w:name="Subtitle"/>
-    <w:lsdException w:uiPriority="99" w:name="Salutation"/>
-    <w:lsdException w:uiPriority="99" w:name="Date"/>
-    <w:lsdException w:uiPriority="99" w:name="Body Text First Indent"/>
-    <w:lsdException w:uiPriority="99" w:name="Body Text First Indent 2"/>
-    <w:lsdException w:uiPriority="99" w:name="Note Heading"/>
-    <w:lsdException w:uiPriority="99" w:name="Body Text 2"/>
-    <w:lsdException w:uiPriority="99" w:name="Body Text 3"/>
-    <w:lsdException w:uiPriority="99" w:name="Body Text Indent 2"/>
-    <w:lsdException w:uiPriority="99" w:name="Body Text Indent 3"/>
-    <w:lsdException w:uiPriority="99" w:name="Block Text"/>
-    <w:lsdException w:uiPriority="99" w:name="Hyperlink"/>
-    <w:lsdException w:uiPriority="99" w:name="FollowedHyperlink"/>
-    <w:lsdException w:qFormat="1" w:unhideWhenUsed="0" w:uiPriority="22" w:semiHidden="0" w:name="Strong"/>
-    <w:lsdException w:qFormat="1" w:unhideWhenUsed="0" w:uiPriority="20" w:semiHidden="0" w:name="Emphasis"/>
-    <w:lsdException w:uiPriority="99" w:name="Document Map"/>
-    <w:lsdException w:uiPriority="99" w:name="Plain Text"/>
-    <w:lsdException w:uiPriority="99" w:name="E-mail Signature"/>
-    <w:lsdException w:uiPriority="99" w:name="Normal (Web)"/>
-    <w:lsdException w:uiPriority="99" w:name="HTML Acronym"/>
-    <w:lsdException w:uiPriority="99" w:name="HTML Address"/>
-    <w:lsdException w:uiPriority="99" w:name="HTML Cite"/>
-    <w:lsdException w:uiPriority="99" w:name="HTML Code"/>
-    <w:lsdException w:uiPriority="99" w:name="HTML Definition"/>
-    <w:lsdException w:uiPriority="99" w:name="HTML Keyboard"/>
-    <w:lsdException w:uiPriority="99" w:name="HTML Preformatted"/>
-    <w:lsdException w:uiPriority="99" w:name="HTML Sample"/>
-    <w:lsdException w:uiPriority="99" w:name="HTML Typewriter"/>
-    <w:lsdException w:uiPriority="99" w:name="HTML Variable"/>
-    <w:lsdException w:qFormat="1" w:uiPriority="99" w:name="Normal Table"/>
-    <w:lsdException w:uiPriority="99" w:name="annotation subject"/>
-    <w:lsdException w:uiPriority="99" w:name="Table Simple 1"/>
-    <w:lsdException w:uiPriority="99" w:name="Table Simple 2"/>
-    <w:lsdException w:uiPriority="99" w:name="Table Simple 3"/>
-    <w:lsdException w:uiPriority="99" w:name="Table Classic 1"/>
-    <w:lsdException w:uiPriority="99" w:name="Table Classic 2"/>
-    <w:lsdException w:uiPriority="99" w:name="Table Classic 3"/>
-    <w:lsdException w:uiPriority="99" w:name="Table Classic 4"/>
-    <w:lsdException w:uiPriority="99" w:name="Table Colorful 1"/>
-    <w:lsdException w:uiPriority="99" w:name="Table Colorful 2"/>
-    <w:lsdException w:uiPriority="99" w:name="Table Colorful 3"/>
-    <w:lsdException w:uiPriority="99" w:name="Table Columns 1"/>
-    <w:lsdException w:uiPriority="99" w:name="Table Columns 2"/>
-    <w:lsdException w:uiPriority="99" w:name="Table Columns 3"/>
-    <w:lsdException w:uiPriority="99" w:name="Table Columns 4"/>
-    <w:lsdException w:uiPriority="99" w:name="Table Columns 5"/>
-    <w:lsdException w:uiPriority="99" w:name="Table Grid 1"/>
-    <w:lsdException w:uiPriority="99" w:name="Table Grid 2"/>
-    <w:lsdException w:uiPriority="99" w:name="Table Grid 3"/>
-    <w:lsdException w:uiPriority="99" w:name="Table Grid 4"/>
-    <w:lsdException w:uiPriority="99" w:name="Table Grid 5"/>
-    <w:lsdException w:uiPriority="99" w:name="Table Grid 6"/>
-    <w:lsdException w:uiPriority="99" w:name="Table Grid 7"/>
-    <w:lsdException w:uiPriority="99" w:name="Table Grid 8"/>
-    <w:lsdException w:uiPriority="99" w:name="Table List 1"/>
-    <w:lsdException w:uiPriority="99" w:name="Table List 2"/>
-    <w:lsdException w:uiPriority="99" w:name="Table List 3"/>
-    <w:lsdException w:uiPriority="99" w:name="Table List 4"/>
-    <w:lsdException w:uiPriority="99" w:name="Table List 5"/>
-    <w:lsdException w:uiPriority="99" w:name="Table List 6"/>
-    <w:lsdException w:uiPriority="99" w:name="Table List 7"/>
-    <w:lsdException w:uiPriority="99" w:name="Table List 8"/>
-    <w:lsdException w:uiPriority="99" w:name="Table 3D effects 1"/>
-    <w:lsdException w:uiPriority="99" w:name="Table 3D effects 2"/>
-    <w:lsdException w:uiPriority="99" w:name="Table 3D effects 3"/>
-    <w:lsdException w:uiPriority="99" w:name="Table Contemporary"/>
-    <w:lsdException w:uiPriority="99" w:name="Table Elegant"/>
-    <w:lsdException w:uiPriority="99" w:name="Table Professional"/>
-    <w:lsdException w:uiPriority="99" w:name="Table Subtle 1"/>
-    <w:lsdException w:uiPriority="99" w:name="Table Subtle 2"/>
-    <w:lsdException w:uiPriority="99" w:name="Table Web 1"/>
-    <w:lsdException w:uiPriority="99" w:name="Table Web 2"/>
-    <w:lsdException w:uiPriority="99" w:name="Table Web 3"/>
-    <w:lsdException w:qFormat="1" w:uiPriority="99" w:name="Balloon Text"/>
-    <w:lsdException w:unhideWhenUsed="0" w:uiPriority="39" w:semiHidden="0" w:name="Table Grid"/>
-    <w:lsdException w:uiPriority="99" w:name="Table Theme"/>
-    <w:lsdException w:unhideWhenUsed="0" w:uiPriority="60" w:semiHidden="0" w:name="Light Shading"/>
-    <w:lsdException w:unhideWhenUsed="0" w:uiPriority="61" w:semiHidden="0" w:name="Light List"/>
-    <w:lsdException w:unhideWhenUsed="0" w:uiPriority="62" w:semiHidden="0" w:name="Light Grid"/>
-    <w:lsdException w:unhideWhenUsed="0" w:uiPriority="63" w:semiHidden="0" w:name="Medium Shading 1"/>
-    <w:lsdException w:unhideWhenUsed="0" w:uiPriority="64" w:semiHidden="0" w:name="Medium Shading 2"/>
-    <w:lsdException w:unhideWhenUsed="0" w:uiPriority="65" w:semiHidden="0" w:name="Medium List 1"/>
-    <w:lsdException w:unhideWhenUsed="0" w:uiPriority="66" w:semiHidden="0" w:name="Medium List 2"/>
-    <w:lsdException w:unhideWhenUsed="0" w:uiPriority="67" w:semiHidden="0" w:name="Medium Grid 1"/>
-    <w:lsdException w:unhideWhenUsed="0" w:uiPriority="68" w:semiHidden="0" w:name="Medium Grid 2"/>
-    <w:lsdException w:unhideWhenUsed="0" w:uiPriority="69" w:semiHidden="0" w:name="Medium Grid 3"/>
-    <w:lsdException w:unhideWhenUsed="0" w:uiPriority="70" w:semiHidden="0" w:name="Dark List"/>
-    <w:lsdException w:unhideWhenUsed="0" w:uiPriority="71" w:semiHidden="0" w:name="Colorful Shading"/>
-    <w:lsdException w:unhideWhenUsed="0" w:uiPriority="72" w:semiHidden="0" w:name="Colorful List"/>
-    <w:lsdException w:unhideWhenUsed="0" w:uiPriority="73" w:semiHidden="0" w:name="Colorful Grid"/>
-    <w:lsdException w:unhideWhenUsed="0" w:uiPriority="60" w:semiHidden="0" w:name="Light Shading Accent 1"/>
-    <w:lsdException w:unhideWhenUsed="0" w:uiPriority="61" w:semiHidden="0" w:name="Light List Accent 1"/>
-    <w:lsdException w:unhideWhenUsed="0" w:uiPriority="62" w:semiHidden="0" w:name="Light Grid Accent 1"/>
-    <w:lsdException w:unhideWhenUsed="0" w:uiPriority="63" w:semiHidden="0" w:name="Medium Shading 1 Accent 1"/>
-    <w:lsdException w:unhideWhenUsed="0" w:uiPriority="64" w:semiHidden="0" w:name="Medium Shading 2 Accent 1"/>
-    <w:lsdException w:unhideWhenUsed="0" w:uiPriority="65" w:semiHidden="0" w:name="Medium List 1 Accent 1"/>
-    <w:lsdException w:qFormat="1" w:unhideWhenUsed="0" w:uiPriority="34" w:semiHidden="0" w:name="List Paragraph"/>
-    <w:lsdException w:unhideWhenUsed="0" w:uiPriority="66" w:semiHidden="0" w:name="Medium List 2 Accent 1"/>
-    <w:lsdException w:unhideWhenUsed="0" w:uiPriority="67" w:semiHidden="0" w:name="Medium Grid 1 Accent 1"/>
-    <w:lsdException w:unhideWhenUsed="0" w:uiPriority="68" w:semiHidden="0" w:name="Medium Grid 2 Accent 1"/>
-    <w:lsdException w:unhideWhenUsed="0" w:uiPriority="69" w:semiHidden="0" w:name="Medium Grid 3 Accent 1"/>
-    <w:lsdException w:unhideWhenUsed="0" w:uiPriority="70" w:semiHidden="0" w:name="Dark List Accent 1"/>
-    <w:lsdException w:unhideWhenUsed="0" w:uiPriority="71" w:semiHidden="0" w:name="Colorful Shading Accent 1"/>
-    <w:lsdException w:unhideWhenUsed="0" w:uiPriority="72" w:semiHidden="0" w:name="Colorful List Accent 1"/>
-    <w:lsdException w:unhideWhenUsed="0" w:uiPriority="73" w:semiHidden="0" w:name="Colorful Grid Accent 1"/>
-    <w:lsdException w:unhideWhenUsed="0" w:uiPriority="60" w:semiHidden="0" w:name="Light Shading Accent 2"/>
-    <w:lsdException w:unhideWhenUsed="0" w:uiPriority="61" w:semiHidden="0" w:name="Light List Accent 2"/>
-    <w:lsdException w:unhideWhenUsed="0" w:uiPriority="62" w:semiHidden="0" w:name="Light Grid Accent 2"/>
-    <w:lsdException w:unhideWhenUsed="0" w:uiPriority="63" w:semiHidden="0" w:name="Medium Shading 1 Accent 2"/>
-    <w:lsdException w:unhideWhenUsed="0" w:uiPriority="64" w:semiHidden="0" w:name="Medium Shading 2 Accent 2"/>
-    <w:lsdException w:unhideWhenUsed="0" w:uiPriority="65" w:semiHidden="0" w:name="Medium List 1 Accent 2"/>
-    <w:lsdException w:unhideWhenUsed="0" w:uiPriority="66" w:semiHidden="0" w:name="Medium List 2 Accent 2"/>
-    <w:lsdException w:unhideWhenUsed="0" w:uiPriority="67" w:semiHidden="0" w:name="Medium Grid 1 Accent 2"/>
-    <w:lsdException w:unhideWhenUsed="0" w:uiPriority="68" w:semiHidden="0" w:name="Medium Grid 2 Accent 2"/>
-    <w:lsdException w:unhideWhenUsed="0" w:uiPriority="69" w:semiHidden="0" w:name="Medium Grid 3 Accent 2"/>
-    <w:lsdException w:unhideWhenUsed="0" w:uiPriority="70" w:semiHidden="0" w:name="Dark List Accent 2"/>
-    <w:lsdException w:unhideWhenUsed="0" w:uiPriority="71" w:semiHidden="0" w:name="Colorful Shading Accent 2"/>
-    <w:lsdException w:unhideWhenUsed="0" w:uiPriority="72" w:semiHidden="0" w:name="Colorful List Accent 2"/>
-    <w:lsdException w:unhideWhenUsed="0" w:uiPriority="73" w:semiHidden="0" w:name="Colorful Grid Accent 2"/>
-    <w:lsdException w:unhideWhenUsed="0" w:uiPriority="60" w:semiHidden="0" w:name="Light Shading Accent 3"/>
-    <w:lsdException w:unhideWhenUsed="0" w:uiPriority="61" w:semiHidden="0" w:name="Light List Accent 3"/>
-    <w:lsdException w:unhideWhenUsed="0" w:uiPriority="62" w:semiHidden="0" w:name="Light Grid Accent 3"/>
-    <w:lsdException w:unhideWhenUsed="0" w:uiPriority="63" w:semiHidden="0" w:name="Medium Shading 1 Accent 3"/>
-    <w:lsdException w:unhideWhenUsed="0" w:uiPriority="64" w:semiHidden="0" w:name="Medium Shading 2 Accent 3"/>
-    <w:lsdException w:unhideWhenUsed="0" w:uiPriority="65" w:semiHidden="0" w:name="Medium List 1 Accent 3"/>
-    <w:lsdException w:unhideWhenUsed="0" w:uiPriority="66" w:semiHidden="0" w:name="Medium List 2 Accent 3"/>
-    <w:lsdException w:unhideWhenUsed="0" w:uiPriority="67" w:semiHidden="0" w:name="Medium Grid 1 Accent 3"/>
-    <w:lsdException w:unhideWhenUsed="0" w:uiPriority="68" w:semiHidden="0" w:name="Medium Grid 2 Accent 3"/>
-    <w:lsdException w:unhideWhenUsed="0" w:uiPriority="69" w:semiHidden="0" w:name="Medium Grid 3 Accent 3"/>
-    <w:lsdException w:unhideWhenUsed="0" w:uiPriority="70" w:semiHidden="0" w:name="Dark List Accent 3"/>
-    <w:lsdException w:unhideWhenUsed="0" w:uiPriority="71" w:semiHidden="0" w:name="Colorful Shading Accent 3"/>
-    <w:lsdException w:unhideWhenUsed="0" w:uiPriority="72" w:semiHidden="0" w:name="Colorful List Accent 3"/>
-    <w:lsdException w:unhideWhenUsed="0" w:uiPriority="73" w:semiHidden="0" w:name="Colorful Grid Accent 3"/>
-    <w:lsdException w:unhideWhenUsed="0" w:uiPriority="60" w:semiHidden="0" w:name="Light Shading Accent 4"/>
-    <w:lsdException w:unhideWhenUsed="0" w:uiPriority="61" w:semiHidden="0" w:name="Light List Accent 4"/>
-    <w:lsdException w:unhideWhenUsed="0" w:uiPriority="62" w:semiHidden="0" w:name="Light Grid Accent 4"/>
-    <w:lsdException w:unhideWhenUsed="0" w:uiPriority="63" w:semiHidden="0" w:name="Medium Shading 1 Accent 4"/>
-    <w:lsdException w:unhideWhenUsed="0" w:uiPriority="64" w:semiHidden="0" w:name="Medium Shading 2 Accent 4"/>
-    <w:lsdException w:unhideWhenUsed="0" w:uiPriority="65" w:semiHidden="0" w:name="Medium List 1 Accent 4"/>
-    <w:lsdException w:unhideWhenUsed="0" w:uiPriority="66" w:semiHidden="0" w:name="Medium List 2 Accent 4"/>
-    <w:lsdException w:unhideWhenUsed="0" w:uiPriority="67" w:semiHidden="0" w:name="Medium Grid 1 Accent 4"/>
-    <w:lsdException w:unhideWhenUsed="0" w:uiPriority="68" w:semiHidden="0" w:name="Medium Grid 2 Accent 4"/>
-    <w:lsdException w:unhideWhenUsed="0" w:uiPriority="69" w:semiHidden="0" w:name="Medium Grid 3 Accent 4"/>
-    <w:lsdException w:unhideWhenUsed="0" w:uiPriority="70" w:semiHidden="0" w:name="Dark List Accent 4"/>
-    <w:lsdException w:unhideWhenUsed="0" w:uiPriority="71" w:semiHidden="0" w:name="Colorful Shading Accent 4"/>
-    <w:lsdException w:unhideWhenUsed="0" w:uiPriority="72" w:semiHidden="0" w:name="Colorful List Accent 4"/>
-    <w:lsdException w:unhideWhenUsed="0" w:uiPriority="73" w:semiHidden="0" w:name="Colorful Grid Accent 4"/>
-    <w:lsdException w:unhideWhenUsed="0" w:uiPriority="60" w:semiHidden="0" w:name="Light Shading Accent 5"/>
-    <w:lsdException w:unhideWhenUsed="0" w:uiPriority="61" w:semiHidden="0" w:name="Light List Accent 5"/>
-    <w:lsdException w:unhideWhenUsed="0" w:uiPriority="62" w:semiHidden="0" w:name="Light Grid Accent 5"/>
-    <w:lsdException w:unhideWhenUsed="0" w:uiPriority="63" w:semiHidden="0" w:name="Medium Shading 1 Accent 5"/>
-    <w:lsdException w:unhideWhenUsed="0" w:uiPriority="64" w:semiHidden="0" w:name="Medium Shading 2 Accent 5"/>
-    <w:lsdException w:unhideWhenUsed="0" w:uiPriority="65" w:semiHidden="0" w:name="Medium List 1 Accent 5"/>
-    <w:lsdException w:unhideWhenUsed="0" w:uiPriority="66" w:semiHidden="0" w:name="Medium List 2 Accent 5"/>
-    <w:lsdException w:unhideWhenUsed="0" w:uiPriority="67" w:semiHidden="0" w:name="Medium Grid 1 Accent 5"/>
-    <w:lsdException w:unhideWhenUsed="0" w:uiPriority="68" w:semiHidden="0" w:name="Medium Grid 2 Accent 5"/>
-    <w:lsdException w:unhideWhenUsed="0" w:uiPriority="69" w:semiHidden="0" w:name="Medium Grid 3 Accent 5"/>
-    <w:lsdException w:unhideWhenUsed="0" w:uiPriority="70" w:semiHidden="0" w:name="Dark List Accent 5"/>
-    <w:lsdException w:unhideWhenUsed="0" w:uiPriority="71" w:semiHidden="0" w:name="Colorful Shading Accent 5"/>
-    <w:lsdException w:unhideWhenUsed="0" w:uiPriority="72" w:semiHidden="0" w:name="Colorful List Accent 5"/>
-    <w:lsdException w:unhideWhenUsed="0" w:uiPriority="73" w:semiHidden="0" w:name="Colorful Grid Accent 5"/>
-    <w:lsdException w:unhideWhenUsed="0" w:uiPriority="60" w:semiHidden="0" w:name="Light Shading Accent 6"/>
-    <w:lsdException w:unhideWhenUsed="0" w:uiPriority="61" w:semiHidden="0" w:name="Light List Accent 6"/>
-    <w:lsdException w:unhideWhenUsed="0" w:uiPriority="62" w:semiHidden="0" w:name="Light Grid Accent 6"/>
-    <w:lsdException w:unhideWhenUsed="0" w:uiPriority="63" w:semiHidden="0" w:name="Medium Shading 1 Accent 6"/>
-    <w:lsdException w:unhideWhenUsed="0" w:uiPriority="64" w:semiHidden="0" w:name="Medium Shading 2 Accent 6"/>
-    <w:lsdException w:unhideWhenUsed="0" w:uiPriority="65" w:semiHidden="0" w:name="Medium List 1 Accent 6"/>
-    <w:lsdException w:unhideWhenUsed="0" w:uiPriority="66" w:semiHidden="0" w:name="Medium List 2 Accent 6"/>
-    <w:lsdException w:unhideWhenUsed="0" w:uiPriority="67" w:semiHidden="0" w:name="Medium Grid 1 Accent 6"/>
-    <w:lsdException w:unhideWhenUsed="0" w:uiPriority="68" w:semiHidden="0" w:name="Medium Grid 2 Accent 6"/>
-    <w:lsdException w:unhideWhenUsed="0" w:uiPriority="69" w:semiHidden="0" w:name="Medium Grid 3 Accent 6"/>
-    <w:lsdException w:unhideWhenUsed="0" w:uiPriority="70" w:semiHidden="0" w:name="Dark List Accent 6"/>
-    <w:lsdException w:unhideWhenUsed="0" w:uiPriority="71" w:semiHidden="0" w:name="Colorful Shading Accent 6"/>
-    <w:lsdException w:unhideWhenUsed="0" w:uiPriority="72" w:semiHidden="0" w:name="Colorful List Accent 6"/>
-    <w:lsdException w:unhideWhenUsed="0" w:uiPriority="73" w:semiHidden="0" w:name="Colorful Grid Accent 6"/>
+  <w:latentStyles w:defLockedState="0" w:defUIPriority="99" w:defSemiHidden="0" w:defUnhideWhenUsed="0" w:defQFormat="0" w:count="376">
+    <w:lsdException w:name="Normal" w:uiPriority="0" w:qFormat="1"/>
+    <w:lsdException w:name="heading 1" w:uiPriority="9" w:qFormat="1"/>
+    <w:lsdException w:name="heading 2" w:semiHidden="1" w:uiPriority="9" w:unhideWhenUsed="1" w:qFormat="1"/>
+    <w:lsdException w:name="heading 3" w:semiHidden="1" w:uiPriority="9" w:unhideWhenUsed="1" w:qFormat="1"/>
+    <w:lsdException w:name="heading 4" w:semiHidden="1" w:uiPriority="9" w:unhideWhenUsed="1" w:qFormat="1"/>
+    <w:lsdException w:name="heading 5" w:semiHidden="1" w:uiPriority="9" w:unhideWhenUsed="1" w:qFormat="1"/>
+    <w:lsdException w:name="heading 6" w:semiHidden="1" w:uiPriority="9" w:unhideWhenUsed="1" w:qFormat="1"/>
+    <w:lsdException w:name="heading 7" w:semiHidden="1" w:uiPriority="9" w:unhideWhenUsed="1" w:qFormat="1"/>
+    <w:lsdException w:name="heading 8" w:semiHidden="1" w:uiPriority="9" w:unhideWhenUsed="1" w:qFormat="1"/>
+    <w:lsdException w:name="heading 9" w:semiHidden="1" w:uiPriority="9" w:unhideWhenUsed="1" w:qFormat="1"/>
+    <w:lsdException w:name="index 1" w:semiHidden="1" w:unhideWhenUsed="1"/>
+    <w:lsdException w:name="index 2" w:semiHidden="1" w:unhideWhenUsed="1"/>
+    <w:lsdException w:name="index 3" w:semiHidden="1" w:unhideWhenUsed="1"/>
+    <w:lsdException w:name="index 4" w:semiHidden="1" w:unhideWhenUsed="1"/>
+    <w:lsdException w:name="index 5" w:semiHidden="1" w:unhideWhenUsed="1"/>
+    <w:lsdException w:name="index 6" w:semiHidden="1" w:unhideWhenUsed="1"/>
+    <w:lsdException w:name="index 7" w:semiHidden="1" w:unhideWhenUsed="1"/>
+    <w:lsdException w:name="index 8" w:semiHidden="1" w:unhideWhenUsed="1"/>
+    <w:lsdException w:name="index 9" w:semiHidden="1" w:unhideWhenUsed="1"/>
+    <w:lsdException w:name="toc 1" w:semiHidden="1" w:uiPriority="39" w:unhideWhenUsed="1"/>
+    <w:lsdException w:name="toc 2" w:semiHidden="1" w:uiPriority="39" w:unhideWhenUsed="1"/>
+    <w:lsdException w:name="toc 3" w:semiHidden="1" w:uiPriority="39" w:unhideWhenUsed="1"/>
+    <w:lsdException w:name="toc 4" w:semiHidden="1" w:uiPriority="39" w:unhideWhenUsed="1"/>
+    <w:lsdException w:name="toc 5" w:semiHidden="1" w:uiPriority="39" w:unhideWhenUsed="1"/>
+    <w:lsdException w:name="toc 6" w:semiHidden="1" w:uiPriority="39" w:unhideWhenUsed="1"/>
+    <w:lsdException w:name="toc 7" w:semiHidden="1" w:uiPriority="39" w:unhideWhenUsed="1"/>
+    <w:lsdException w:name="toc 8" w:semiHidden="1" w:uiPriority="39" w:unhideWhenUsed="1"/>
+    <w:lsdException w:name="toc 9" w:semiHidden="1" w:uiPriority="39" w:unhideWhenUsed="1"/>
+    <w:lsdException w:name="Normal Indent" w:semiHidden="1" w:unhideWhenUsed="1"/>
+    <w:lsdException w:name="footnote text" w:semiHidden="1" w:unhideWhenUsed="1"/>
+    <w:lsdException w:name="annotation text" w:semiHidden="1" w:unhideWhenUsed="1"/>
+    <w:lsdException w:name="header" w:semiHidden="1" w:unhideWhenUsed="1"/>
+    <w:lsdException w:name="footer" w:semiHidden="1" w:unhideWhenUsed="1"/>
+    <w:lsdException w:name="index heading" w:semiHidden="1" w:unhideWhenUsed="1"/>
+    <w:lsdException w:name="caption" w:semiHidden="1" w:uiPriority="35" w:unhideWhenUsed="1" w:qFormat="1"/>
+    <w:lsdException w:name="table of figures" w:semiHidden="1" w:unhideWhenUsed="1"/>
+    <w:lsdException w:name="envelope address" w:semiHidden="1" w:unhideWhenUsed="1"/>
+    <w:lsdException w:name="envelope return" w:semiHidden="1" w:unhideWhenUsed="1"/>
+    <w:lsdException w:name="footnote reference" w:semiHidden="1" w:unhideWhenUsed="1"/>
+    <w:lsdException w:name="annotation reference" w:semiHidden="1" w:unhideWhenUsed="1"/>
+    <w:lsdException w:name="line number" w:semiHidden="1" w:unhideWhenUsed="1"/>
+    <w:lsdException w:name="page number" w:semiHidden="1" w:unhideWhenUsed="1"/>
+    <w:lsdException w:name="endnote reference" w:semiHidden="1" w:unhideWhenUsed="1"/>
+    <w:lsdException w:name="endnote text" w:semiHidden="1" w:unhideWhenUsed="1"/>
+    <w:lsdException w:name="table of authorities" w:semiHidden="1" w:unhideWhenUsed="1"/>
+    <w:lsdException w:name="macro" w:semiHidden="1" w:unhideWhenUsed="1"/>
+    <w:lsdException w:name="toa heading" w:semiHidden="1" w:unhideWhenUsed="1"/>
+    <w:lsdException w:name="List" w:semiHidden="1" w:unhideWhenUsed="1"/>
+    <w:lsdException w:name="List Bullet" w:semiHidden="1" w:unhideWhenUsed="1"/>
+    <w:lsdException w:name="List Number" w:semiHidden="1" w:unhideWhenUsed="1"/>
+    <w:lsdException w:name="List 2" w:semiHidden="1" w:unhideWhenUsed="1"/>
+    <w:lsdException w:name="List 3" w:semiHidden="1" w:unhideWhenUsed="1"/>
+    <w:lsdException w:name="List 4" w:semiHidden="1" w:unhideWhenUsed="1"/>
+    <w:lsdException w:name="List 5" w:semiHidden="1" w:unhideWhenUsed="1"/>
+    <w:lsdException w:name="List Bullet 2" w:semiHidden="1" w:unhideWhenUsed="1"/>
+    <w:lsdException w:name="List Bullet 3" w:semiHidden="1" w:unhideWhenUsed="1"/>
+    <w:lsdException w:name="List Bullet 4" w:semiHidden="1" w:unhideWhenUsed="1"/>
+    <w:lsdException w:name="List Bullet 5" w:semiHidden="1" w:unhideWhenUsed="1"/>
+    <w:lsdException w:name="List Number 2" w:semiHidden="1" w:unhideWhenUsed="1"/>
+    <w:lsdException w:name="List Number 3" w:semiHidden="1" w:unhideWhenUsed="1"/>
+    <w:lsdException w:name="List Number 4" w:semiHidden="1" w:unhideWhenUsed="1"/>
+    <w:lsdException w:name="List Number 5" w:semiHidden="1" w:unhideWhenUsed="1"/>
+    <w:lsdException w:name="Title" w:uiPriority="10" w:qFormat="1"/>
+    <w:lsdException w:name="Closing" w:semiHidden="1" w:unhideWhenUsed="1"/>
+    <w:lsdException w:name="Signature" w:semiHidden="1" w:unhideWhenUsed="1"/>
+    <w:lsdException w:name="Default Paragraph Font" w:semiHidden="1" w:uiPriority="1" w:unhideWhenUsed="1" w:qFormat="1"/>
+    <w:lsdException w:name="Body Text" w:semiHidden="1" w:unhideWhenUsed="1"/>
+    <w:lsdException w:name="Body Text Indent" w:semiHidden="1" w:unhideWhenUsed="1"/>
+    <w:lsdException w:name="List Continue" w:semiHidden="1" w:unhideWhenUsed="1"/>
+    <w:lsdException w:name="List Continue 2" w:semiHidden="1" w:unhideWhenUsed="1"/>
+    <w:lsdException w:name="List Continue 3" w:semiHidden="1" w:unhideWhenUsed="1"/>
+    <w:lsdException w:name="List Continue 4" w:semiHidden="1" w:unhideWhenUsed="1"/>
+    <w:lsdException w:name="List Continue 5" w:semiHidden="1" w:unhideWhenUsed="1"/>
+    <w:lsdException w:name="Message Header" w:semiHidden="1" w:unhideWhenUsed="1"/>
+    <w:lsdException w:name="Subtitle" w:uiPriority="11" w:qFormat="1"/>
+    <w:lsdException w:name="Salutation" w:semiHidden="1" w:unhideWhenUsed="1"/>
+    <w:lsdException w:name="Date" w:semiHidden="1" w:unhideWhenUsed="1"/>
+    <w:lsdException w:name="Body Text First Indent" w:semiHidden="1" w:unhideWhenUsed="1"/>
+    <w:lsdException w:name="Body Text First Indent 2" w:semiHidden="1" w:unhideWhenUsed="1"/>
+    <w:lsdException w:name="Note Heading" w:semiHidden="1" w:unhideWhenUsed="1"/>
+    <w:lsdException w:name="Body Text 2" w:semiHidden="1" w:unhideWhenUsed="1"/>
+    <w:lsdException w:name="Body Text 3" w:semiHidden="1" w:unhideWhenUsed="1"/>
+    <w:lsdException w:name="Body Text Indent 2" w:semiHidden="1" w:unhideWhenUsed="1"/>
+    <w:lsdException w:name="Body Text Indent 3" w:semiHidden="1" w:unhideWhenUsed="1"/>
+    <w:lsdException w:name="Block Text" w:semiHidden="1" w:unhideWhenUsed="1"/>
+    <w:lsdException w:name="Hyperlink" w:semiHidden="1" w:unhideWhenUsed="1"/>
+    <w:lsdException w:name="FollowedHyperlink" w:semiHidden="1" w:unhideWhenUsed="1"/>
+    <w:lsdException w:name="Strong" w:uiPriority="22" w:qFormat="1"/>
+    <w:lsdException w:name="Emphasis" w:uiPriority="20" w:qFormat="1"/>
+    <w:lsdException w:name="Document Map" w:semiHidden="1" w:unhideWhenUsed="1"/>
+    <w:lsdException w:name="Plain Text" w:semiHidden="1" w:unhideWhenUsed="1"/>
+    <w:lsdException w:name="E-mail Signature" w:semiHidden="1" w:unhideWhenUsed="1"/>
+    <w:lsdException w:name="HTML Top of Form" w:semiHidden="1" w:unhideWhenUsed="1"/>
+    <w:lsdException w:name="HTML Bottom of Form" w:semiHidden="1" w:unhideWhenUsed="1"/>
+    <w:lsdException w:name="Normal (Web)" w:semiHidden="1" w:unhideWhenUsed="1"/>
+    <w:lsdException w:name="HTML Acronym" w:semiHidden="1" w:unhideWhenUsed="1"/>
+    <w:lsdException w:name="HTML Address" w:semiHidden="1" w:unhideWhenUsed="1"/>
+    <w:lsdException w:name="HTML Cite" w:semiHidden="1" w:unhideWhenUsed="1"/>
+    <w:lsdException w:name="HTML Code" w:semiHidden="1" w:unhideWhenUsed="1"/>
+    <w:lsdException w:name="HTML Definition" w:semiHidden="1" w:unhideWhenUsed="1"/>
+    <w:lsdException w:name="HTML Keyboard" w:semiHidden="1" w:unhideWhenUsed="1"/>
+    <w:lsdException w:name="HTML Preformatted" w:semiHidden="1" w:unhideWhenUsed="1"/>
+    <w:lsdException w:name="HTML Sample" w:semiHidden="1" w:unhideWhenUsed="1"/>
+    <w:lsdException w:name="HTML Typewriter" w:semiHidden="1" w:unhideWhenUsed="1"/>
+    <w:lsdException w:name="HTML Variable" w:semiHidden="1" w:unhideWhenUsed="1"/>
+    <w:lsdException w:name="Normal Table" w:semiHidden="1" w:unhideWhenUsed="1" w:qFormat="1"/>
+    <w:lsdException w:name="annotation subject" w:semiHidden="1" w:unhideWhenUsed="1"/>
+    <w:lsdException w:name="No List" w:semiHidden="1" w:unhideWhenUsed="1"/>
+    <w:lsdException w:name="Outline List 1" w:semiHidden="1" w:unhideWhenUsed="1"/>
+    <w:lsdException w:name="Outline List 2" w:semiHidden="1" w:unhideWhenUsed="1"/>
+    <w:lsdException w:name="Outline List 3" w:semiHidden="1" w:unhideWhenUsed="1"/>
+    <w:lsdException w:name="Table Simple 1" w:semiHidden="1" w:unhideWhenUsed="1"/>
+    <w:lsdException w:name="Table Simple 2" w:semiHidden="1" w:unhideWhenUsed="1"/>
+    <w:lsdException w:name="Table Simple 3" w:semiHidden="1" w:unhideWhenUsed="1"/>
+    <w:lsdException w:name="Table Classic 1" w:semiHidden="1" w:unhideWhenUsed="1"/>
+    <w:lsdException w:name="Table Classic 2" w:semiHidden="1" w:unhideWhenUsed="1"/>
+    <w:lsdException w:name="Table Classic 3" w:semiHidden="1" w:unhideWhenUsed="1"/>
+    <w:lsdException w:name="Table Classic 4" w:semiHidden="1" w:unhideWhenUsed="1"/>
+    <w:lsdException w:name="Table Colorful 1" w:semiHidden="1" w:unhideWhenUsed="1"/>
+    <w:lsdException w:name="Table Colorful 2" w:semiHidden="1" w:unhideWhenUsed="1"/>
+    <w:lsdException w:name="Table Colorful 3" w:semiHidden="1" w:unhideWhenUsed="1"/>
+    <w:lsdException w:name="Table Columns 1" w:semiHidden="1" w:unhideWhenUsed="1"/>
+    <w:lsdException w:name="Table Columns 2" w:semiHidden="1" w:unhideWhenUsed="1"/>
+    <w:lsdException w:name="Table Columns 3" w:semiHidden="1" w:unhideWhenUsed="1"/>
+    <w:lsdException w:name="Table Columns 4" w:semiHidden="1" w:unhideWhenUsed="1"/>
+    <w:lsdException w:name="Table Columns 5" w:semiHidden="1" w:unhideWhenUsed="1"/>
+    <w:lsdException w:name="Table Grid 1" w:semiHidden="1" w:unhideWhenUsed="1"/>
+    <w:lsdException w:name="Table Grid 2" w:semiHidden="1" w:unhideWhenUsed="1"/>
+    <w:lsdException w:name="Table Grid 3" w:semiHidden="1" w:unhideWhenUsed="1"/>
+    <w:lsdException w:name="Table Grid 4" w:semiHidden="1" w:unhideWhenUsed="1"/>
+    <w:lsdException w:name="Table Grid 5" w:semiHidden="1" w:unhideWhenUsed="1"/>
+    <w:lsdException w:name="Table Grid 6" w:semiHidden="1" w:unhideWhenUsed="1"/>
+    <w:lsdException w:name="Table Grid 7" w:semiHidden="1" w:unhideWhenUsed="1"/>
+    <w:lsdException w:name="Table Grid 8" w:semiHidden="1" w:unhideWhenUsed="1"/>
+    <w:lsdException w:name="Table List 1" w:semiHidden="1" w:unhideWhenUsed="1"/>
+    <w:lsdException w:name="Table List 2" w:semiHidden="1" w:unhideWhenUsed="1"/>
+    <w:lsdException w:name="Table List 3" w:semiHidden="1" w:unhideWhenUsed="1"/>
+    <w:lsdException w:name="Table List 4" w:semiHidden="1" w:unhideWhenUsed="1"/>
+    <w:lsdException w:name="Table List 5" w:semiHidden="1" w:unhideWhenUsed="1"/>
+    <w:lsdException w:name="Table List 6" w:semiHidden="1" w:unhideWhenUsed="1"/>
+    <w:lsdException w:name="Table List 7" w:semiHidden="1" w:unhideWhenUsed="1"/>
+    <w:lsdException w:name="Table List 8" w:semiHidden="1" w:unhideWhenUsed="1"/>
+    <w:lsdException w:name="Table 3D effects 1" w:semiHidden="1" w:unhideWhenUsed="1"/>
+    <w:lsdException w:name="Table 3D effects 2" w:semiHidden="1" w:unhideWhenUsed="1"/>
+    <w:lsdException w:name="Table 3D effects 3" w:semiHidden="1" w:unhideWhenUsed="1"/>
+    <w:lsdException w:name="Table Contemporary" w:semiHidden="1" w:unhideWhenUsed="1"/>
+    <w:lsdException w:name="Table Elegant" w:semiHidden="1" w:unhideWhenUsed="1"/>
+    <w:lsdException w:name="Table Professional" w:semiHidden="1" w:unhideWhenUsed="1"/>
+    <w:lsdException w:name="Table Subtle 1" w:semiHidden="1" w:unhideWhenUsed="1"/>
+    <w:lsdException w:name="Table Subtle 2" w:semiHidden="1" w:unhideWhenUsed="1"/>
+    <w:lsdException w:name="Table Web 1" w:semiHidden="1" w:unhideWhenUsed="1"/>
+    <w:lsdException w:name="Table Web 2" w:semiHidden="1" w:unhideWhenUsed="1"/>
+    <w:lsdException w:name="Table Web 3" w:semiHidden="1" w:unhideWhenUsed="1"/>
+    <w:lsdException w:name="Balloon Text" w:semiHidden="1" w:unhideWhenUsed="1" w:qFormat="1"/>
+    <w:lsdException w:name="Table Grid" w:uiPriority="39"/>
+    <w:lsdException w:name="Table Theme" w:semiHidden="1" w:unhideWhenUsed="1"/>
+    <w:lsdException w:name="Placeholder Text" w:semiHidden="1" w:unhideWhenUsed="1"/>
+    <w:lsdException w:name="No Spacing" w:semiHidden="1" w:unhideWhenUsed="1"/>
+    <w:lsdException w:name="Light Shading" w:uiPriority="60"/>
+    <w:lsdException w:name="Light List" w:uiPriority="61"/>
+    <w:lsdException w:name="Light Grid" w:uiPriority="62"/>
+    <w:lsdException w:name="Medium Shading 1" w:uiPriority="63"/>
+    <w:lsdException w:name="Medium Shading 2" w:uiPriority="64"/>
+    <w:lsdException w:name="Medium List 1" w:uiPriority="65"/>
+    <w:lsdException w:name="Medium List 2" w:uiPriority="66"/>
+    <w:lsdException w:name="Medium Grid 1" w:uiPriority="67"/>
+    <w:lsdException w:name="Medium Grid 2" w:uiPriority="68"/>
+    <w:lsdException w:name="Medium Grid 3" w:uiPriority="69"/>
+    <w:lsdException w:name="Dark List" w:uiPriority="70"/>
+    <w:lsdException w:name="Colorful Shading" w:uiPriority="71"/>
+    <w:lsdException w:name="Colorful List" w:uiPriority="72"/>
+    <w:lsdException w:name="Colorful Grid" w:uiPriority="73"/>
+    <w:lsdException w:name="Light Shading Accent 1" w:uiPriority="60"/>
+    <w:lsdException w:name="Light List Accent 1" w:uiPriority="61"/>
+    <w:lsdException w:name="Light Grid Accent 1" w:uiPriority="62"/>
+    <w:lsdException w:name="Medium Shading 1 Accent 1" w:uiPriority="63"/>
+    <w:lsdException w:name="Medium Shading 2 Accent 1" w:uiPriority="64"/>
+    <w:lsdException w:name="Medium List 1 Accent 1" w:uiPriority="65"/>
+    <w:lsdException w:name="Revision" w:semiHidden="1" w:unhideWhenUsed="1"/>
+    <w:lsdException w:name="List Paragraph" w:uiPriority="34" w:qFormat="1"/>
+    <w:lsdException w:name="Quote" w:semiHidden="1" w:unhideWhenUsed="1"/>
+    <w:lsdException w:name="Intense Quote" w:semiHidden="1" w:unhideWhenUsed="1"/>
+    <w:lsdException w:name="Medium List 2 Accent 1" w:uiPriority="66"/>
+    <w:lsdException w:name="Medium Grid 1 Accent 1" w:uiPriority="67"/>
+    <w:lsdException w:name="Medium Grid 2 Accent 1" w:uiPriority="68"/>
+    <w:lsdException w:name="Medium Grid 3 Accent 1" w:uiPriority="69"/>
+    <w:lsdException w:name="Dark List Accent 1" w:uiPriority="70"/>
+    <w:lsdException w:name="Colorful Shading Accent 1" w:uiPriority="71"/>
+    <w:lsdException w:name="Colorful List Accent 1" w:uiPriority="72"/>
+    <w:lsdException w:name="Colorful Grid Accent 1" w:uiPriority="73"/>
+    <w:lsdException w:name="Light Shading Accent 2" w:uiPriority="60"/>
+    <w:lsdException w:name="Light List Accent 2" w:uiPriority="61"/>
+    <w:lsdException w:name="Light Grid Accent 2" w:uiPriority="62"/>
+    <w:lsdException w:name="Medium Shading 1 Accent 2" w:uiPriority="63"/>
+    <w:lsdException w:name="Medium Shading 2 Accent 2" w:uiPriority="64"/>
+    <w:lsdException w:name="Medium List 1 Accent 2" w:uiPriority="65"/>
+    <w:lsdException w:name="Medium List 2 Accent 2" w:uiPriority="66"/>
+    <w:lsdException w:name="Medium Grid 1 Accent 2" w:uiPriority="67"/>
+    <w:lsdException w:name="Medium Grid 2 Accent 2" w:uiPriority="68"/>
+    <w:lsdException w:name="Medium Grid 3 Accent 2" w:uiPriority="69"/>
+    <w:lsdException w:name="Dark List Accent 2" w:uiPriority="70"/>
+    <w:lsdException w:name="Colorful Shading Accent 2" w:uiPriority="71"/>
+    <w:lsdException w:name="Colorful List Accent 2" w:uiPriority="72"/>
+    <w:lsdException w:name="Colorful Grid Accent 2" w:uiPriority="73"/>
+    <w:lsdException w:name="Light Shading Accent 3" w:uiPriority="60"/>
+    <w:lsdException w:name="Light List Accent 3" w:uiPriority="61"/>
+    <w:lsdException w:name="Light Grid Accent 3" w:uiPriority="62"/>
+    <w:lsdException w:name="Medium Shading 1 Accent 3" w:uiPriority="63"/>
+    <w:lsdException w:name="Medium Shading 2 Accent 3" w:uiPriority="64"/>
+    <w:lsdException w:name="Medium List 1 Accent 3" w:uiPriority="65"/>
+    <w:lsdException w:name="Medium List 2 Accent 3" w:uiPriority="66"/>
+    <w:lsdException w:name="Medium Grid 1 Accent 3" w:uiPriority="67"/>
+    <w:lsdException w:name="Medium Grid 2 Accent 3" w:uiPriority="68"/>
+    <w:lsdException w:name="Medium Grid 3 Accent 3" w:uiPriority="69"/>
+    <w:lsdException w:name="Dark List Accent 3" w:uiPriority="70"/>
+    <w:lsdException w:name="Colorful Shading Accent 3" w:uiPriority="71"/>
+    <w:lsdException w:name="Colorful List Accent 3" w:uiPriority="72"/>
+    <w:lsdException w:name="Colorful Grid Accent 3" w:uiPriority="73"/>
+    <w:lsdException w:name="Light Shading Accent 4" w:uiPriority="60"/>
+    <w:lsdException w:name="Light List Accent 4" w:uiPriority="61"/>
+    <w:lsdException w:name="Light Grid Accent 4" w:uiPriority="62"/>
+    <w:lsdException w:name="Medium Shading 1 Accent 4" w:uiPriority="63"/>
+    <w:lsdException w:name="Medium Shading 2 Accent 4" w:uiPriority="64"/>
+    <w:lsdException w:name="Medium List 1 Accent 4" w:uiPriority="65"/>
+    <w:lsdException w:name="Medium List 2 Accent 4" w:uiPriority="66"/>
+    <w:lsdException w:name="Medium Grid 1 Accent 4" w:uiPriority="67"/>
+    <w:lsdException w:name="Medium Grid 2 Accent 4" w:uiPriority="68"/>
+    <w:lsdException w:name="Medium Grid 3 Accent 4" w:uiPriority="69"/>
+    <w:lsdException w:name="Dark List Accent 4" w:uiPriority="70"/>
+    <w:lsdException w:name="Colorful Shading Accent 4" w:uiPriority="71"/>
+    <w:lsdException w:name="Colorful List Accent 4" w:uiPriority="72"/>
+    <w:lsdException w:name="Colorful Grid Accent 4" w:uiPriority="73"/>
+    <w:lsdException w:name="Light Shading Accent 5" w:uiPriority="60"/>
+    <w:lsdException w:name="Light List Accent 5" w:uiPriority="61"/>
+    <w:lsdException w:name="Light Grid Accent 5" w:uiPriority="62"/>
+    <w:lsdException w:name="Medium Shading 1 Accent 5" w:uiPriority="63"/>
+    <w:lsdException w:name="Medium Shading 2 Accent 5" w:uiPriority="64"/>
+    <w:lsdException w:name="Medium List 1 Accent 5" w:uiPriority="65"/>
+    <w:lsdException w:name="Medium List 2 Accent 5" w:uiPriority="66"/>
+    <w:lsdException w:name="Medium Grid 1 Accent 5" w:uiPriority="67"/>
+    <w:lsdException w:name="Medium Grid 2 Accent 5" w:uiPriority="68"/>
+    <w:lsdException w:name="Medium Grid 3 Accent 5" w:uiPriority="69"/>
+    <w:lsdException w:name="Dark List Accent 5" w:uiPriority="70"/>
+    <w:lsdException w:name="Colorful Shading Accent 5" w:uiPriority="71"/>
+    <w:lsdException w:name="Colorful List Accent 5" w:uiPriority="72"/>
+    <w:lsdException w:name="Colorful Grid Accent 5" w:uiPriority="73"/>
+    <w:lsdException w:name="Light Shading Accent 6" w:uiPriority="60"/>
+    <w:lsdException w:name="Light List Accent 6" w:uiPriority="61"/>
+    <w:lsdException w:name="Light Grid Accent 6" w:uiPriority="62"/>
+    <w:lsdException w:name="Medium Shading 1 Accent 6" w:uiPriority="63"/>
+    <w:lsdException w:name="Medium Shading 2 Accent 6" w:uiPriority="64"/>
+    <w:lsdException w:name="Medium List 1 Accent 6" w:uiPriority="65"/>
+    <w:lsdException w:name="Medium List 2 Accent 6" w:uiPriority="66"/>
+    <w:lsdException w:name="Medium Grid 1 Accent 6" w:uiPriority="67"/>
+    <w:lsdException w:name="Medium Grid 2 Accent 6" w:uiPriority="68"/>
+    <w:lsdException w:name="Medium Grid 3 Accent 6" w:uiPriority="69"/>
+    <w:lsdException w:name="Dark List Accent 6" w:uiPriority="70"/>
+    <w:lsdException w:name="Colorful Shading Accent 6" w:uiPriority="71"/>
+    <w:lsdException w:name="Colorful List Accent 6" w:uiPriority="72"/>
+    <w:lsdException w:name="Colorful Grid Accent 6" w:uiPriority="73"/>
+    <w:lsdException w:name="Subtle Emphasis" w:uiPriority="19" w:qFormat="1"/>
+    <w:lsdException w:name="Intense Emphasis" w:uiPriority="21" w:qFormat="1"/>
+    <w:lsdException w:name="Subtle Reference" w:uiPriority="31" w:qFormat="1"/>
+    <w:lsdException w:name="Intense Reference" w:uiPriority="32" w:qFormat="1"/>
+    <w:lsdException w:name="Book Title" w:uiPriority="33" w:qFormat="1"/>
+    <w:lsdException w:name="Bibliography" w:semiHidden="1" w:uiPriority="37" w:unhideWhenUsed="1"/>
+    <w:lsdException w:name="TOC Heading" w:semiHidden="1" w:uiPriority="39" w:unhideWhenUsed="1" w:qFormat="1"/>
+    <w:lsdException w:name="Plain Table 1" w:uiPriority="41"/>
+    <w:lsdException w:name="Plain Table 2" w:uiPriority="42"/>
+    <w:lsdException w:name="Plain Table 3" w:uiPriority="43"/>
+    <w:lsdException w:name="Plain Table 4" w:uiPriority="44"/>
+    <w:lsdException w:name="Plain Table 5" w:uiPriority="45"/>
+    <w:lsdException w:name="Grid Table Light" w:uiPriority="40"/>
+    <w:lsdException w:name="Grid Table 1 Light" w:uiPriority="46"/>
+    <w:lsdException w:name="Grid Table 2" w:uiPriority="47"/>
+    <w:lsdException w:name="Grid Table 3" w:uiPriority="48"/>
+    <w:lsdException w:name="Grid Table 4" w:uiPriority="49"/>
+    <w:lsdException w:name="Grid Table 5 Dark" w:uiPriority="50"/>
+    <w:lsdException w:name="Grid Table 6 Colorful" w:uiPriority="51"/>
+    <w:lsdException w:name="Grid Table 7 Colorful" w:uiPriority="52"/>
+    <w:lsdException w:name="Grid Table 1 Light Accent 1" w:uiPriority="46"/>
+    <w:lsdException w:name="Grid Table 2 Accent 1" w:uiPriority="47"/>
+    <w:lsdException w:name="Grid Table 3 Accent 1" w:uiPriority="48"/>
+    <w:lsdException w:name="Grid Table 4 Accent 1" w:uiPriority="49"/>
+    <w:lsdException w:name="Grid Table 5 Dark Accent 1" w:uiPriority="50"/>
+    <w:lsdException w:name="Grid Table 6 Colorful Accent 1" w:uiPriority="51"/>
+    <w:lsdException w:name="Grid Table 7 Colorful Accent 1" w:uiPriority="52"/>
+    <w:lsdException w:name="Grid Table 1 Light Accent 2" w:uiPriority="46"/>
+    <w:lsdException w:name="Grid Table 2 Accent 2" w:uiPriority="47"/>
+    <w:lsdException w:name="Grid Table 3 Accent 2" w:uiPriority="48"/>
+    <w:lsdException w:name="Grid Table 4 Accent 2" w:uiPriority="49"/>
+    <w:lsdException w:name="Grid Table 5 Dark Accent 2" w:uiPriority="50"/>
+    <w:lsdException w:name="Grid Table 6 Colorful Accent 2" w:uiPriority="51"/>
+    <w:lsdException w:name="Grid Table 7 Colorful Accent 2" w:uiPriority="52"/>
+    <w:lsdException w:name="Grid Table 1 Light Accent 3" w:uiPriority="46"/>
+    <w:lsdException w:name="Grid Table 2 Accent 3" w:uiPriority="47"/>
+    <w:lsdException w:name="Grid Table 3 Accent 3" w:uiPriority="48"/>
+    <w:lsdException w:name="Grid Table 4 Accent 3" w:uiPriority="49"/>
+    <w:lsdException w:name="Grid Table 5 Dark Accent 3" w:uiPriority="50"/>
+    <w:lsdException w:name="Grid Table 6 Colorful Accent 3" w:uiPriority="51"/>
+    <w:lsdException w:name="Grid Table 7 Colorful Accent 3" w:uiPriority="52"/>
+    <w:lsdException w:name="Grid Table 1 Light Accent 4" w:uiPriority="46"/>
+    <w:lsdException w:name="Grid Table 2 Accent 4" w:uiPriority="47"/>
+    <w:lsdException w:name="Grid Table 3 Accent 4" w:uiPriority="48"/>
+    <w:lsdException w:name="Grid Table 4 Accent 4" w:uiPriority="49"/>
+    <w:lsdException w:name="Grid Table 5 Dark Accent 4" w:uiPriority="50"/>
+    <w:lsdException w:name="Grid Table 6 Colorful Accent 4" w:uiPriority="51"/>
+    <w:lsdException w:name="Grid Table 7 Colorful Accent 4" w:uiPriority="52"/>
+    <w:lsdException w:name="Grid Table 1 Light Accent 5" w:uiPriority="46"/>
+    <w:lsdException w:name="Grid Table 2 Accent 5" w:uiPriority="47"/>
+    <w:lsdException w:name="Grid Table 3 Accent 5" w:uiPriority="48"/>
+    <w:lsdException w:name="Grid Table 4 Accent 5" w:uiPriority="49"/>
+    <w:lsdException w:name="Grid Table 5 Dark Accent 5" w:uiPriority="50"/>
+    <w:lsdException w:name="Grid Table 6 Colorful Accent 5" w:uiPriority="51"/>
+    <w:lsdException w:name="Grid Table 7 Colorful Accent 5" w:uiPriority="52"/>
+    <w:lsdException w:name="Grid Table 1 Light Accent 6" w:uiPriority="46"/>
+    <w:lsdException w:name="Grid Table 2 Accent 6" w:uiPriority="47"/>
+    <w:lsdException w:name="Grid Table 3 Accent 6" w:uiPriority="48"/>
+    <w:lsdException w:name="Grid Table 4 Accent 6" w:uiPriority="49"/>
+    <w:lsdException w:name="Grid Table 5 Dark Accent 6" w:uiPriority="50"/>
+    <w:lsdException w:name="Grid Table 6 Colorful Accent 6" w:uiPriority="51"/>
+    <w:lsdException w:name="Grid Table 7 Colorful Accent 6" w:uiPriority="52"/>
+    <w:lsdException w:name="List Table 1 Light" w:uiPriority="46"/>
+    <w:lsdException w:name="List Table 2" w:uiPriority="47"/>
+    <w:lsdException w:name="List Table 3" w:uiPriority="48"/>
+    <w:lsdException w:name="List Table 4" w:uiPriority="49"/>
+    <w:lsdException w:name="List Table 5 Dark" w:uiPriority="50"/>
+    <w:lsdException w:name="List Table 6 Colorful" w:uiPriority="51"/>
+    <w:lsdException w:name="List Table 7 Colorful" w:uiPriority="52"/>
+    <w:lsdException w:name="List Table 1 Light Accent 1" w:uiPriority="46"/>
+    <w:lsdException w:name="List Table 2 Accent 1" w:uiPriority="47"/>
+    <w:lsdException w:name="List Table 3 Accent 1" w:uiPriority="48"/>
+    <w:lsdException w:name="List Table 4 Accent 1" w:uiPriority="49"/>
+    <w:lsdException w:name="List Table 5 Dark Accent 1" w:uiPriority="50"/>
+    <w:lsdException w:name="List Table 6 Colorful Accent 1" w:uiPriority="51"/>
+    <w:lsdException w:name="List Table 7 Colorful Accent 1" w:uiPriority="52"/>
+    <w:lsdException w:name="List Table 1 Light Accent 2" w:uiPriority="46"/>
+    <w:lsdException w:name="List Table 2 Accent 2" w:uiPriority="47"/>
+    <w:lsdException w:name="List Table 3 Accent 2" w:uiPriority="48"/>
+    <w:lsdException w:name="List Table 4 Accent 2" w:uiPriority="49"/>
+    <w:lsdException w:name="List Table 5 Dark Accent 2" w:uiPriority="50"/>
+    <w:lsdException w:name="List Table 6 Colorful Accent 2" w:uiPriority="51"/>
+    <w:lsdException w:name="List Table 7 Colorful Accent 2" w:uiPriority="52"/>
+    <w:lsdException w:name="List Table 1 Light Accent 3" w:uiPriority="46"/>
+    <w:lsdException w:name="List Table 2 Accent 3" w:uiPriority="47"/>
+    <w:lsdException w:name="List Table 3 Accent 3" w:uiPriority="48"/>
+    <w:lsdException w:name="List Table 4 Accent 3" w:uiPriority="49"/>
+    <w:lsdException w:name="List Table 5 Dark Accent 3" w:uiPriority="50"/>
+    <w:lsdException w:name="List Table 6 Colorful Accent 3" w:uiPriority="51"/>
+    <w:lsdException w:name="List Table 7 Colorful Accent 3" w:uiPriority="52"/>
+    <w:lsdException w:name="List Table 1 Light Accent 4" w:uiPriority="46"/>
+    <w:lsdException w:name="List Table 2 Accent 4" w:uiPriority="47"/>
+    <w:lsdException w:name="List Table 3 Accent 4" w:uiPriority="48"/>
+    <w:lsdException w:name="List Table 4 Accent 4" w:uiPriority="49"/>
+    <w:lsdException w:name="List Table 5 Dark Accent 4" w:uiPriority="50"/>
+    <w:lsdException w:name="List Table 6 Colorful Accent 4" w:uiPriority="51"/>
+    <w:lsdException w:name="List Table 7 Colorful Accent 4" w:uiPriority="52"/>
+    <w:lsdException w:name="List Table 1 Light Accent 5" w:uiPriority="46"/>
+    <w:lsdException w:name="List Table 2 Accent 5" w:uiPriority="47"/>
+    <w:lsdException w:name="List Table 3 Accent 5" w:uiPriority="48"/>
+    <w:lsdException w:name="List Table 4 Accent 5" w:uiPriority="49"/>
+    <w:lsdException w:name="List Table 5 Dark Accent 5" w:uiPriority="50"/>
+    <w:lsdException w:name="List Table 6 Colorful Accent 5" w:uiPriority="51"/>
+    <w:lsdException w:name="List Table 7 Colorful Accent 5" w:uiPriority="52"/>
+    <w:lsdException w:name="List Table 1 Light Accent 6" w:uiPriority="46"/>
+    <w:lsdException w:name="List Table 2 Accent 6" w:uiPriority="47"/>
+    <w:lsdException w:name="List Table 3 Accent 6" w:uiPriority="48"/>
+    <w:lsdException w:name="List Table 4 Accent 6" w:uiPriority="49"/>
+    <w:lsdException w:name="List Table 5 Dark Accent 6" w:uiPriority="50"/>
+    <w:lsdException w:name="List Table 6 Colorful Accent 6" w:uiPriority="51"/>
+    <w:lsdException w:name="List Table 7 Colorful Accent 6" w:uiPriority="52"/>
+    <w:lsdException w:name="Mention" w:semiHidden="1" w:unhideWhenUsed="1"/>
+    <w:lsdException w:name="Smart Hyperlink" w:semiHidden="1" w:unhideWhenUsed="1"/>
+    <w:lsdException w:name="Hashtag" w:semiHidden="1" w:unhideWhenUsed="1"/>
+    <w:lsdException w:name="Unresolved Mention" w:semiHidden="1" w:unhideWhenUsed="1"/>
+    <w:lsdException w:name="Smart Link" w:semiHidden="1" w:unhideWhenUsed="1"/>
   </w:latentStyles>
-  <w:style w:type="paragraph" w:default="1" w:styleId="1">
+  <w:style w:type="paragraph" w:default="1" w:styleId="Normal">
     <w:name w:val="Normal"/>
     <w:qFormat/>
-    <w:uiPriority w:val="0"/>
     <w:pPr>
       <w:spacing w:line="276" w:lineRule="auto"/>
     </w:pPr>
     <w:rPr>
-      <w:rFonts w:ascii="Arial" w:hAnsi="Arial" w:eastAsia="Arial" w:cs="Arial"/>
       <w:sz w:val="22"/>
       <w:szCs w:val="22"/>
-      <w:lang w:val="en" w:eastAsia="en-US" w:bidi="ar-SA"/>
+      <w:lang w:val="en"/>
     </w:rPr>
   </w:style>
-  <w:style w:type="paragraph" w:styleId="2">
+  <w:style w:type="paragraph" w:styleId="Heading1">
     <w:name w:val="heading 1"/>
-    <w:basedOn w:val="1"/>
-    <w:next w:val="1"/>
+    <w:basedOn w:val="Normal"/>
+    <w:next w:val="Normal"/>
+    <w:uiPriority w:val="9"/>
     <w:qFormat/>
-    <w:uiPriority w:val="9"/>
     <w:pPr>
       <w:keepNext/>
       <w:keepLines/>
@@ -3152,14 +3600,14 @@
       <w:szCs w:val="40"/>
     </w:rPr>
   </w:style>
-  <w:style w:type="paragraph" w:styleId="3">
+  <w:style w:type="paragraph" w:styleId="Heading2">
     <w:name w:val="heading 2"/>
-    <w:basedOn w:val="1"/>
-    <w:next w:val="1"/>
+    <w:basedOn w:val="Normal"/>
+    <w:next w:val="Normal"/>
+    <w:uiPriority w:val="9"/>
     <w:semiHidden/>
     <w:unhideWhenUsed/>
     <w:qFormat/>
-    <w:uiPriority w:val="9"/>
     <w:pPr>
       <w:keepNext/>
       <w:keepLines/>
@@ -3171,14 +3619,14 @@
       <w:szCs w:val="32"/>
     </w:rPr>
   </w:style>
-  <w:style w:type="paragraph" w:styleId="4">
+  <w:style w:type="paragraph" w:styleId="Heading3">
     <w:name w:val="heading 3"/>
-    <w:basedOn w:val="1"/>
-    <w:next w:val="1"/>
+    <w:basedOn w:val="Normal"/>
+    <w:next w:val="Normal"/>
+    <w:uiPriority w:val="9"/>
     <w:semiHidden/>
     <w:unhideWhenUsed/>
     <w:qFormat/>
-    <w:uiPriority w:val="9"/>
     <w:pPr>
       <w:keepNext/>
       <w:keepLines/>
@@ -3191,14 +3639,14 @@
       <w:szCs w:val="28"/>
     </w:rPr>
   </w:style>
-  <w:style w:type="paragraph" w:styleId="5">
+  <w:style w:type="paragraph" w:styleId="Heading4">
     <w:name w:val="heading 4"/>
-    <w:basedOn w:val="1"/>
-    <w:next w:val="1"/>
+    <w:basedOn w:val="Normal"/>
+    <w:next w:val="Normal"/>
+    <w:uiPriority w:val="9"/>
     <w:semiHidden/>
     <w:unhideWhenUsed/>
     <w:qFormat/>
-    <w:uiPriority w:val="9"/>
     <w:pPr>
       <w:keepNext/>
       <w:keepLines/>
@@ -3211,14 +3659,14 @@
       <w:szCs w:val="24"/>
     </w:rPr>
   </w:style>
-  <w:style w:type="paragraph" w:styleId="6">
+  <w:style w:type="paragraph" w:styleId="Heading5">
     <w:name w:val="heading 5"/>
-    <w:basedOn w:val="1"/>
-    <w:next w:val="1"/>
+    <w:basedOn w:val="Normal"/>
+    <w:next w:val="Normal"/>
+    <w:uiPriority w:val="9"/>
     <w:semiHidden/>
     <w:unhideWhenUsed/>
     <w:qFormat/>
-    <w:uiPriority w:val="9"/>
     <w:pPr>
       <w:keepNext/>
       <w:keepLines/>
@@ -3229,14 +3677,14 @@
       <w:color w:val="666666"/>
     </w:rPr>
   </w:style>
-  <w:style w:type="paragraph" w:styleId="7">
+  <w:style w:type="paragraph" w:styleId="Heading6">
     <w:name w:val="heading 6"/>
-    <w:basedOn w:val="1"/>
-    <w:next w:val="1"/>
+    <w:basedOn w:val="Normal"/>
+    <w:next w:val="Normal"/>
+    <w:uiPriority w:val="9"/>
     <w:semiHidden/>
     <w:unhideWhenUsed/>
     <w:qFormat/>
-    <w:uiPriority w:val="9"/>
     <w:pPr>
       <w:keepNext/>
       <w:keepLines/>
@@ -3248,20 +3696,19 @@
       <w:color w:val="666666"/>
     </w:rPr>
   </w:style>
-  <w:style w:type="character" w:default="1" w:styleId="8">
+  <w:style w:type="character" w:default="1" w:styleId="DefaultParagraphFont">
     <w:name w:val="Default Paragraph Font"/>
+    <w:uiPriority w:val="1"/>
     <w:semiHidden/>
     <w:unhideWhenUsed/>
-    <w:qFormat/>
-    <w:uiPriority w:val="1"/>
   </w:style>
-  <w:style w:type="table" w:default="1" w:styleId="9">
+  <w:style w:type="table" w:default="1" w:styleId="TableNormal">
     <w:name w:val="Normal Table"/>
+    <w:uiPriority w:val="99"/>
     <w:semiHidden/>
     <w:unhideWhenUsed/>
-    <w:qFormat/>
-    <w:uiPriority w:val="99"/>
     <w:tblPr>
+      <w:tblInd w:w="0" w:type="dxa"/>
       <w:tblCellMar>
         <w:top w:w="0" w:type="dxa"/>
         <w:left w:w="108" w:type="dxa"/>
@@ -3270,14 +3717,20 @@
       </w:tblCellMar>
     </w:tblPr>
   </w:style>
-  <w:style w:type="paragraph" w:styleId="10">
+  <w:style w:type="numbering" w:default="1" w:styleId="NoList">
+    <w:name w:val="No List"/>
+    <w:uiPriority w:val="99"/>
+    <w:semiHidden/>
+    <w:unhideWhenUsed/>
+  </w:style>
+  <w:style w:type="paragraph" w:styleId="BalloonText">
     <w:name w:val="Balloon Text"/>
-    <w:basedOn w:val="1"/>
-    <w:link w:val="16"/>
+    <w:basedOn w:val="Normal"/>
+    <w:link w:val="BalloonTextChar"/>
+    <w:uiPriority w:val="99"/>
     <w:semiHidden/>
     <w:unhideWhenUsed/>
     <w:qFormat/>
-    <w:uiPriority w:val="99"/>
     <w:pPr>
       <w:spacing w:line="240" w:lineRule="auto"/>
     </w:pPr>
@@ -3287,12 +3740,12 @@
       <w:szCs w:val="16"/>
     </w:rPr>
   </w:style>
-  <w:style w:type="paragraph" w:styleId="11">
+  <w:style w:type="paragraph" w:styleId="Subtitle">
     <w:name w:val="Subtitle"/>
-    <w:basedOn w:val="1"/>
-    <w:next w:val="1"/>
+    <w:basedOn w:val="Normal"/>
+    <w:next w:val="Normal"/>
+    <w:uiPriority w:val="11"/>
     <w:qFormat/>
-    <w:uiPriority w:val="11"/>
     <w:pPr>
       <w:keepNext/>
       <w:keepLines/>
@@ -3304,12 +3757,12 @@
       <w:szCs w:val="30"/>
     </w:rPr>
   </w:style>
-  <w:style w:type="paragraph" w:styleId="12">
+  <w:style w:type="paragraph" w:styleId="Title">
     <w:name w:val="Title"/>
-    <w:basedOn w:val="1"/>
-    <w:next w:val="1"/>
+    <w:basedOn w:val="Normal"/>
+    <w:next w:val="Normal"/>
+    <w:uiPriority w:val="10"/>
     <w:qFormat/>
-    <w:uiPriority w:val="10"/>
     <w:pPr>
       <w:keepNext/>
       <w:keepLines/>
@@ -3320,11 +3773,10 @@
       <w:szCs w:val="52"/>
     </w:rPr>
   </w:style>
-  <w:style w:type="table" w:customStyle="1" w:styleId="13">
+  <w:style w:type="table" w:customStyle="1" w:styleId="Style11">
     <w:name w:val="_Style 11"/>
-    <w:basedOn w:val="9"/>
+    <w:basedOn w:val="TableNormal"/>
     <w:qFormat/>
-    <w:uiPriority w:val="0"/>
     <w:tblPr>
       <w:tblCellMar>
         <w:top w:w="100" w:type="dxa"/>
@@ -3334,11 +3786,10 @@
       </w:tblCellMar>
     </w:tblPr>
   </w:style>
-  <w:style w:type="table" w:customStyle="1" w:styleId="14">
+  <w:style w:type="table" w:customStyle="1" w:styleId="Style12">
     <w:name w:val="_Style 12"/>
-    <w:basedOn w:val="9"/>
+    <w:basedOn w:val="TableNormal"/>
     <w:qFormat/>
-    <w:uiPriority w:val="0"/>
     <w:tblPr>
       <w:tblCellMar>
         <w:top w:w="100" w:type="dxa"/>
@@ -3348,11 +3799,10 @@
       </w:tblCellMar>
     </w:tblPr>
   </w:style>
-  <w:style w:type="table" w:customStyle="1" w:styleId="15">
+  <w:style w:type="table" w:customStyle="1" w:styleId="Style13">
     <w:name w:val="_Style 13"/>
-    <w:basedOn w:val="9"/>
+    <w:basedOn w:val="TableNormal"/>
     <w:qFormat/>
-    <w:uiPriority w:val="0"/>
     <w:tblPr>
       <w:tblCellMar>
         <w:top w:w="100" w:type="dxa"/>
@@ -3362,23 +3812,23 @@
       </w:tblCellMar>
     </w:tblPr>
   </w:style>
-  <w:style w:type="character" w:customStyle="1" w:styleId="16">
+  <w:style w:type="character" w:customStyle="1" w:styleId="BalloonTextChar">
     <w:name w:val="Balloon Text Char"/>
-    <w:basedOn w:val="8"/>
-    <w:link w:val="10"/>
+    <w:basedOn w:val="DefaultParagraphFont"/>
+    <w:link w:val="BalloonText"/>
+    <w:uiPriority w:val="99"/>
     <w:semiHidden/>
-    <w:uiPriority w:val="99"/>
     <w:rPr>
       <w:rFonts w:ascii="Tahoma" w:hAnsi="Tahoma" w:cs="Tahoma"/>
       <w:sz w:val="16"/>
       <w:szCs w:val="16"/>
     </w:rPr>
   </w:style>
-  <w:style w:type="paragraph" w:styleId="17">
+  <w:style w:type="paragraph" w:styleId="ListParagraph">
     <w:name w:val="List Paragraph"/>
-    <w:basedOn w:val="1"/>
+    <w:basedOn w:val="Normal"/>
+    <w:uiPriority w:val="34"/>
     <w:qFormat/>
-    <w:uiPriority w:val="34"/>
     <w:pPr>
       <w:ind w:left="720"/>
       <w:contextualSpacing/>
@@ -3703,5 +4153,6 @@
       </a:style>
     </a:lnDef>
   </a:objectDefaults>
+  <a:extraClrSchemeLst/>
 </a:theme>
 </file>
</xml_diff>